<commit_message>
Add OBB 1020 and 1116
</commit_message>
<xml_diff>
--- a/raildriver-Other-Remapped.docx
+++ b/raildriver-Other-Remapped.docx
@@ -2450,6 +2450,2390 @@
               <w:spacing w:lineRule="auto" w:line="180"/>
               <w:jc w:val="center"/>
               <w:rPr>
+                <w:sz w:val="16"/>
+                <w:szCs w:val="16"/>
+              </w:rPr>
+            </w:pPr>
+            <w:r>
+              <w:rPr>
+                <w:rFonts w:eastAsia="arial" w:ascii="arial" w:hAnsi="arial"/>
+                <w:color w:val="000000"/>
+                <w:sz w:val="16"/>
+                <w:szCs w:val="16"/>
+              </w:rPr>
+              <w:t>Cab Cam</w:t>
+            </w:r>
+          </w:p>
+        </w:tc>
+      </w:tr>
+    </w:tbl>
+    <w:p>
+      <w:pPr>
+        <w:pStyle w:val="Normal"/>
+        <w:rPr>
+          <w:color w:val="000000"/>
+          <w:sz w:val="16"/>
+          <w:szCs w:val="16"/>
+        </w:rPr>
+      </w:pPr>
+      <w:r>
+        <w:rPr>
+          <w:color w:val="000000"/>
+          <w:sz w:val="16"/>
+          <w:szCs w:val="16"/>
+        </w:rPr>
+      </w:r>
+    </w:p>
+    <w:p>
+      <w:pPr>
+        <w:pStyle w:val="Normal"/>
+        <w:rPr>
+          <w:color w:val="000000"/>
+          <w:sz w:val="16"/>
+          <w:szCs w:val="16"/>
+        </w:rPr>
+      </w:pPr>
+      <w:r>
+        <w:rPr>
+          <w:color w:val="000000"/>
+          <w:sz w:val="16"/>
+          <w:szCs w:val="16"/>
+        </w:rPr>
+        <w:tab/>
+        <w:t xml:space="preserve">       </w:t>
+      </w:r>
+      <w:r>
+        <w:rPr>
+          <w:rFonts w:eastAsia="arial" w:ascii="arial" w:hAnsi="arial"/>
+          <w:color w:val="000000"/>
+          <w:sz w:val="16"/>
+          <w:szCs w:val="16"/>
+        </w:rPr>
+        <w:t xml:space="preserve">    </w:t>
+      </w:r>
+      <w:r>
+        <w:rPr>
+          <w:rFonts w:eastAsia="arial" w:ascii="arial" w:hAnsi="arial"/>
+          <w:color w:val="000000"/>
+          <w:sz w:val="16"/>
+          <w:szCs w:val="16"/>
+        </w:rPr>
+        <w:t>OBB 1020</w:t>
+      </w:r>
+      <w:r>
+        <w:rPr>
+          <w:rFonts w:eastAsia="arial" w:ascii="arial" w:hAnsi="arial"/>
+          <w:color w:val="000000"/>
+          <w:sz w:val="16"/>
+          <w:szCs w:val="16"/>
+        </w:rPr>
+        <w:t>-1</w:t>
+      </w:r>
+    </w:p>
+    <w:tbl>
+      <w:tblPr>
+        <w:tblW w:w="14248" w:type="dxa"/>
+        <w:jc w:val="left"/>
+        <w:tblInd w:w="-5" w:type="dxa"/>
+        <w:tblLayout w:type="fixed"/>
+        <w:tblCellMar>
+          <w:top w:w="0" w:type="dxa"/>
+          <w:left w:w="108" w:type="dxa"/>
+          <w:bottom w:w="0" w:type="dxa"/>
+          <w:right w:w="108" w:type="dxa"/>
+        </w:tblCellMar>
+        <w:tblLook w:firstRow="1" w:noVBand="1" w:lastRow="0" w:firstColumn="1" w:lastColumn="0" w:noHBand="0" w:val="04a0"/>
+      </w:tblPr>
+      <w:tblGrid>
+        <w:gridCol w:w="1017"/>
+        <w:gridCol w:w="1019"/>
+        <w:gridCol w:w="1014"/>
+        <w:gridCol w:w="1016"/>
+        <w:gridCol w:w="1020"/>
+        <w:gridCol w:w="1016"/>
+        <w:gridCol w:w="1016"/>
+        <w:gridCol w:w="1017"/>
+        <w:gridCol w:w="1016"/>
+        <w:gridCol w:w="1020"/>
+        <w:gridCol w:w="1016"/>
+        <w:gridCol w:w="1016"/>
+        <w:gridCol w:w="1016"/>
+        <w:gridCol w:w="1029"/>
+      </w:tblGrid>
+      <w:tr>
+        <w:trPr>
+          <w:trHeight w:val="440" w:hRule="exact"/>
+          <w:cantSplit w:val="true"/>
+        </w:trPr>
+        <w:tc>
+          <w:tcPr>
+            <w:tcW w:w="1017" w:type="dxa"/>
+            <w:tcBorders>
+              <w:top w:val="single" w:sz="4" w:space="0" w:color="000000"/>
+              <w:left w:val="single" w:sz="4" w:space="0" w:color="000000"/>
+              <w:bottom w:val="single" w:sz="4" w:space="0" w:color="000000"/>
+            </w:tcBorders>
+            <w:vAlign w:val="bottom"/>
+          </w:tcPr>
+          <w:p>
+            <w:pPr>
+              <w:pStyle w:val="Normal"/>
+              <w:widowControl w:val="false"/>
+              <w:spacing w:lineRule="auto" w:line="180" w:before="0" w:after="60"/>
+              <w:jc w:val="center"/>
+              <w:rPr>
+                <w:color w:val="000000"/>
+                <w:sz w:val="16"/>
+                <w:szCs w:val="16"/>
+              </w:rPr>
+            </w:pPr>
+            <w:r>
+              <w:rPr>
+                <w:rFonts w:eastAsia="arial" w:ascii="arial" w:hAnsi="arial"/>
+                <w:b/>
+                <w:color w:val="000000"/>
+                <w:sz w:val="16"/>
+                <w:szCs w:val="16"/>
+              </w:rPr>
+              <w:t>Pause</w:t>
+            </w:r>
+          </w:p>
+        </w:tc>
+        <w:tc>
+          <w:tcPr>
+            <w:tcW w:w="1019" w:type="dxa"/>
+            <w:tcBorders>
+              <w:top w:val="single" w:sz="4" w:space="0" w:color="000000"/>
+              <w:left w:val="single" w:sz="4" w:space="0" w:color="000000"/>
+              <w:bottom w:val="single" w:sz="4" w:space="0" w:color="000000"/>
+            </w:tcBorders>
+            <w:vAlign w:val="bottom"/>
+          </w:tcPr>
+          <w:p>
+            <w:pPr>
+              <w:pStyle w:val="Normal"/>
+              <w:widowControl w:val="false"/>
+              <w:spacing w:lineRule="auto" w:line="180"/>
+              <w:jc w:val="center"/>
+              <w:rPr>
+                <w:color w:val="000000"/>
+                <w:sz w:val="16"/>
+                <w:szCs w:val="16"/>
+              </w:rPr>
+            </w:pPr>
+            <w:r>
+              <w:rPr>
+                <w:color w:val="000000"/>
+                <w:sz w:val="16"/>
+                <w:szCs w:val="16"/>
+              </w:rPr>
+              <w:t>Master Key</w:t>
+            </w:r>
+          </w:p>
+        </w:tc>
+        <w:tc>
+          <w:tcPr>
+            <w:tcW w:w="1014" w:type="dxa"/>
+            <w:tcBorders>
+              <w:top w:val="single" w:sz="4" w:space="0" w:color="000000"/>
+              <w:left w:val="single" w:sz="4" w:space="0" w:color="000000"/>
+              <w:bottom w:val="single" w:sz="4" w:space="0" w:color="000000"/>
+            </w:tcBorders>
+            <w:vAlign w:val="bottom"/>
+          </w:tcPr>
+          <w:p>
+            <w:pPr>
+              <w:pStyle w:val="Normal"/>
+              <w:widowControl w:val="false"/>
+              <w:spacing w:lineRule="auto" w:line="180"/>
+              <w:jc w:val="center"/>
+              <w:rPr>
+                <w:color w:val="000000"/>
+                <w:sz w:val="16"/>
+                <w:szCs w:val="16"/>
+              </w:rPr>
+            </w:pPr>
+            <w:r>
+              <w:rPr>
+                <w:color w:val="000000"/>
+                <w:sz w:val="16"/>
+                <w:szCs w:val="16"/>
+              </w:rPr>
+              <w:t>MCB Close</w:t>
+            </w:r>
+          </w:p>
+        </w:tc>
+        <w:tc>
+          <w:tcPr>
+            <w:tcW w:w="1016" w:type="dxa"/>
+            <w:tcBorders>
+              <w:top w:val="single" w:sz="4" w:space="0" w:color="000000"/>
+              <w:left w:val="single" w:sz="4" w:space="0" w:color="000000"/>
+              <w:bottom w:val="single" w:sz="4" w:space="0" w:color="000000"/>
+            </w:tcBorders>
+            <w:vAlign w:val="bottom"/>
+          </w:tcPr>
+          <w:p>
+            <w:pPr>
+              <w:pStyle w:val="Normal"/>
+              <w:widowControl w:val="false"/>
+              <w:spacing w:lineRule="auto" w:line="180"/>
+              <w:jc w:val="center"/>
+              <w:rPr>
+                <w:sz w:val="16"/>
+                <w:szCs w:val="16"/>
+              </w:rPr>
+            </w:pPr>
+            <w:r>
+              <w:rPr>
+                <w:rFonts w:eastAsia="arial" w:ascii="arial" w:hAnsi="arial"/>
+                <w:color w:val="000000"/>
+                <w:sz w:val="16"/>
+                <w:szCs w:val="16"/>
+              </w:rPr>
+              <w:t>PZB</w:t>
+            </w:r>
+          </w:p>
+        </w:tc>
+        <w:tc>
+          <w:tcPr>
+            <w:tcW w:w="1020" w:type="dxa"/>
+            <w:tcBorders>
+              <w:top w:val="single" w:sz="4" w:space="0" w:color="000000"/>
+              <w:left w:val="single" w:sz="4" w:space="0" w:color="000000"/>
+              <w:bottom w:val="single" w:sz="4" w:space="0" w:color="000000"/>
+            </w:tcBorders>
+            <w:vAlign w:val="bottom"/>
+          </w:tcPr>
+          <w:p>
+            <w:pPr>
+              <w:pStyle w:val="Normal"/>
+              <w:widowControl w:val="false"/>
+              <w:spacing w:lineRule="auto" w:line="180"/>
+              <w:jc w:val="center"/>
+              <w:rPr>
+                <w:color w:val="000000"/>
+                <w:sz w:val="16"/>
+                <w:szCs w:val="16"/>
+              </w:rPr>
+            </w:pPr>
+            <w:r>
+              <w:rPr>
+                <w:color w:val="000000"/>
+                <w:sz w:val="16"/>
+                <w:szCs w:val="16"/>
+              </w:rPr>
+              <w:t>Panto.</w:t>
+            </w:r>
+          </w:p>
+        </w:tc>
+        <w:tc>
+          <w:tcPr>
+            <w:tcW w:w="1016" w:type="dxa"/>
+            <w:tcBorders>
+              <w:top w:val="single" w:sz="4" w:space="0" w:color="000000"/>
+              <w:left w:val="single" w:sz="4" w:space="0" w:color="000000"/>
+              <w:bottom w:val="single" w:sz="4" w:space="0" w:color="000000"/>
+            </w:tcBorders>
+            <w:vAlign w:val="bottom"/>
+          </w:tcPr>
+          <w:p>
+            <w:pPr>
+              <w:pStyle w:val="Normal"/>
+              <w:widowControl w:val="false"/>
+              <w:jc w:val="center"/>
+              <w:rPr>
+                <w:color w:val="000000"/>
+                <w:sz w:val="16"/>
+                <w:szCs w:val="16"/>
+              </w:rPr>
+            </w:pPr>
+            <w:r>
+              <w:rPr>
+                <w:color w:val="000000"/>
+                <w:sz w:val="16"/>
+                <w:szCs w:val="16"/>
+              </w:rPr>
+              <w:t>Compressor</w:t>
+            </w:r>
+          </w:p>
+        </w:tc>
+        <w:tc>
+          <w:tcPr>
+            <w:tcW w:w="1016" w:type="dxa"/>
+            <w:tcBorders>
+              <w:top w:val="single" w:sz="4" w:space="0" w:color="000000"/>
+              <w:left w:val="single" w:sz="4" w:space="0" w:color="000000"/>
+              <w:bottom w:val="single" w:sz="4" w:space="0" w:color="000000"/>
+            </w:tcBorders>
+            <w:vAlign w:val="bottom"/>
+          </w:tcPr>
+          <w:p>
+            <w:pPr>
+              <w:pStyle w:val="Normal"/>
+              <w:widowControl w:val="false"/>
+              <w:jc w:val="center"/>
+              <w:rPr>
+                <w:sz w:val="16"/>
+                <w:szCs w:val="16"/>
+              </w:rPr>
+            </w:pPr>
+            <w:r>
+              <w:rPr>
+                <w:rFonts w:eastAsia="arial" w:ascii="arial" w:hAnsi="arial"/>
+                <w:color w:val="000000"/>
+                <w:sz w:val="16"/>
+                <w:szCs w:val="16"/>
+              </w:rPr>
+              <w:t>Brake Key</w:t>
+            </w:r>
+          </w:p>
+        </w:tc>
+        <w:tc>
+          <w:tcPr>
+            <w:tcW w:w="1017" w:type="dxa"/>
+            <w:tcBorders>
+              <w:top w:val="single" w:sz="4" w:space="0" w:color="000000"/>
+              <w:left w:val="single" w:sz="4" w:space="0" w:color="000000"/>
+              <w:bottom w:val="single" w:sz="4" w:space="0" w:color="000000"/>
+            </w:tcBorders>
+            <w:vAlign w:val="bottom"/>
+          </w:tcPr>
+          <w:p>
+            <w:pPr>
+              <w:pStyle w:val="Normal"/>
+              <w:widowControl w:val="false"/>
+              <w:jc w:val="center"/>
+              <w:rPr>
+                <w:rFonts w:ascii="arial" w:hAnsi="arial" w:eastAsia="arial"/>
+                <w:color w:val="000000"/>
+                <w:sz w:val="16"/>
+                <w:szCs w:val="16"/>
+              </w:rPr>
+            </w:pPr>
+            <w:r>
+              <w:rPr>
+                <w:rFonts w:eastAsia="arial" w:ascii="arial" w:hAnsi="arial"/>
+                <w:color w:val="000000"/>
+                <w:sz w:val="16"/>
+                <w:szCs w:val="16"/>
+              </w:rPr>
+            </w:r>
+          </w:p>
+        </w:tc>
+        <w:tc>
+          <w:tcPr>
+            <w:tcW w:w="1016" w:type="dxa"/>
+            <w:tcBorders>
+              <w:top w:val="single" w:sz="4" w:space="0" w:color="000000"/>
+              <w:left w:val="single" w:sz="4" w:space="0" w:color="000000"/>
+              <w:bottom w:val="single" w:sz="4" w:space="0" w:color="000000"/>
+            </w:tcBorders>
+            <w:vAlign w:val="bottom"/>
+          </w:tcPr>
+          <w:p>
+            <w:pPr>
+              <w:pStyle w:val="Normal"/>
+              <w:widowControl w:val="false"/>
+              <w:jc w:val="center"/>
+              <w:rPr>
+                <w:rFonts w:ascii="arial" w:hAnsi="arial" w:eastAsia="arial"/>
+                <w:color w:val="000000"/>
+                <w:sz w:val="16"/>
+                <w:szCs w:val="16"/>
+              </w:rPr>
+            </w:pPr>
+            <w:r>
+              <w:rPr>
+                <w:rFonts w:eastAsia="arial" w:ascii="arial" w:hAnsi="arial"/>
+                <w:color w:val="000000"/>
+                <w:sz w:val="16"/>
+                <w:szCs w:val="16"/>
+              </w:rPr>
+            </w:r>
+          </w:p>
+        </w:tc>
+        <w:tc>
+          <w:tcPr>
+            <w:tcW w:w="1020" w:type="dxa"/>
+            <w:tcBorders>
+              <w:top w:val="single" w:sz="4" w:space="0" w:color="000000"/>
+              <w:left w:val="single" w:sz="4" w:space="0" w:color="000000"/>
+              <w:bottom w:val="single" w:sz="4" w:space="0" w:color="000000"/>
+            </w:tcBorders>
+            <w:vAlign w:val="bottom"/>
+          </w:tcPr>
+          <w:p>
+            <w:pPr>
+              <w:pStyle w:val="Normal"/>
+              <w:widowControl w:val="false"/>
+              <w:jc w:val="center"/>
+              <w:rPr>
+                <w:rFonts w:ascii="arial" w:hAnsi="arial" w:eastAsia="arial"/>
+                <w:color w:val="000000"/>
+                <w:sz w:val="16"/>
+                <w:szCs w:val="16"/>
+              </w:rPr>
+            </w:pPr>
+            <w:r>
+              <w:rPr/>
+            </w:r>
+          </w:p>
+        </w:tc>
+        <w:tc>
+          <w:tcPr>
+            <w:tcW w:w="1016" w:type="dxa"/>
+            <w:tcBorders>
+              <w:top w:val="single" w:sz="4" w:space="0" w:color="000000"/>
+              <w:left w:val="single" w:sz="4" w:space="0" w:color="000000"/>
+              <w:bottom w:val="single" w:sz="4" w:space="0" w:color="000000"/>
+            </w:tcBorders>
+            <w:vAlign w:val="bottom"/>
+          </w:tcPr>
+          <w:p>
+            <w:pPr>
+              <w:pStyle w:val="Normal"/>
+              <w:widowControl w:val="false"/>
+              <w:spacing w:lineRule="auto" w:line="180"/>
+              <w:jc w:val="center"/>
+              <w:rPr>
+                <w:color w:val="000000"/>
+                <w:sz w:val="16"/>
+                <w:szCs w:val="16"/>
+              </w:rPr>
+            </w:pPr>
+            <w:r>
+              <w:rPr>
+                <w:rFonts w:eastAsia="arial" w:ascii="arial" w:hAnsi="arial"/>
+                <w:color w:val="000000"/>
+                <w:sz w:val="16"/>
+                <w:szCs w:val="16"/>
+              </w:rPr>
+              <w:t>Desk Light</w:t>
+            </w:r>
+          </w:p>
+        </w:tc>
+        <w:tc>
+          <w:tcPr>
+            <w:tcW w:w="1016" w:type="dxa"/>
+            <w:tcBorders>
+              <w:top w:val="single" w:sz="4" w:space="0" w:color="000000"/>
+              <w:left w:val="single" w:sz="4" w:space="0" w:color="000000"/>
+              <w:bottom w:val="single" w:sz="4" w:space="0" w:color="000000"/>
+            </w:tcBorders>
+            <w:vAlign w:val="bottom"/>
+          </w:tcPr>
+          <w:p>
+            <w:pPr>
+              <w:pStyle w:val="Normal"/>
+              <w:widowControl w:val="false"/>
+              <w:spacing w:lineRule="auto" w:line="180"/>
+              <w:jc w:val="center"/>
+              <w:rPr>
+                <w:color w:val="000000"/>
+                <w:sz w:val="16"/>
+                <w:szCs w:val="16"/>
+              </w:rPr>
+            </w:pPr>
+            <w:r>
+              <w:rPr>
+                <w:rFonts w:eastAsia="arial" w:ascii="arial" w:hAnsi="arial"/>
+                <w:color w:val="000000"/>
+                <w:sz w:val="16"/>
+                <w:szCs w:val="16"/>
+              </w:rPr>
+              <w:t>Parking Brake On</w:t>
+            </w:r>
+          </w:p>
+        </w:tc>
+        <w:tc>
+          <w:tcPr>
+            <w:tcW w:w="1016" w:type="dxa"/>
+            <w:tcBorders>
+              <w:top w:val="single" w:sz="4" w:space="0" w:color="000000"/>
+              <w:left w:val="single" w:sz="4" w:space="0" w:color="000000"/>
+              <w:bottom w:val="single" w:sz="4" w:space="0" w:color="000000"/>
+            </w:tcBorders>
+            <w:vAlign w:val="bottom"/>
+          </w:tcPr>
+          <w:p>
+            <w:pPr>
+              <w:pStyle w:val="Normal"/>
+              <w:widowControl w:val="false"/>
+              <w:spacing w:lineRule="auto" w:line="180"/>
+              <w:jc w:val="center"/>
+              <w:rPr>
+                <w:color w:val="000000"/>
+                <w:sz w:val="16"/>
+                <w:szCs w:val="16"/>
+              </w:rPr>
+            </w:pPr>
+            <w:r>
+              <w:rPr>
+                <w:rFonts w:eastAsia="arial" w:ascii="arial" w:hAnsi="arial"/>
+                <w:color w:val="000000"/>
+                <w:sz w:val="16"/>
+                <w:szCs w:val="16"/>
+              </w:rPr>
+              <w:t>1P Cam</w:t>
+            </w:r>
+          </w:p>
+        </w:tc>
+        <w:tc>
+          <w:tcPr>
+            <w:tcW w:w="1029" w:type="dxa"/>
+            <w:tcBorders>
+              <w:top w:val="single" w:sz="4" w:space="0" w:color="000000"/>
+              <w:left w:val="single" w:sz="4" w:space="0" w:color="000000"/>
+              <w:bottom w:val="single" w:sz="4" w:space="0" w:color="000000"/>
+              <w:right w:val="single" w:sz="4" w:space="0" w:color="000000"/>
+            </w:tcBorders>
+            <w:vAlign w:val="bottom"/>
+          </w:tcPr>
+          <w:p>
+            <w:pPr>
+              <w:pStyle w:val="Normal"/>
+              <w:widowControl w:val="false"/>
+              <w:spacing w:lineRule="auto" w:line="180"/>
+              <w:jc w:val="center"/>
+              <w:rPr>
+                <w:color w:val="000000"/>
+                <w:sz w:val="16"/>
+                <w:szCs w:val="16"/>
+              </w:rPr>
+            </w:pPr>
+            <w:r>
+              <w:rPr>
+                <w:rFonts w:eastAsia="arial" w:ascii="arial" w:hAnsi="arial"/>
+                <w:color w:val="000000"/>
+                <w:sz w:val="16"/>
+                <w:szCs w:val="16"/>
+              </w:rPr>
+              <w:t>Next</w:t>
+            </w:r>
+          </w:p>
+          <w:p>
+            <w:pPr>
+              <w:pStyle w:val="Normal"/>
+              <w:widowControl w:val="false"/>
+              <w:spacing w:lineRule="auto" w:line="180"/>
+              <w:jc w:val="center"/>
+              <w:rPr>
+                <w:color w:val="000000"/>
+                <w:sz w:val="16"/>
+                <w:szCs w:val="16"/>
+              </w:rPr>
+            </w:pPr>
+            <w:r>
+              <w:rPr>
+                <w:rFonts w:eastAsia="arial" w:ascii="arial" w:hAnsi="arial"/>
+                <w:color w:val="000000"/>
+                <w:sz w:val="16"/>
+                <w:szCs w:val="16"/>
+              </w:rPr>
+              <w:t>Cab Cam</w:t>
+            </w:r>
+          </w:p>
+        </w:tc>
+      </w:tr>
+    </w:tbl>
+    <w:p>
+      <w:pPr>
+        <w:pStyle w:val="Normal"/>
+        <w:rPr>
+          <w:rFonts w:ascii="arial" w:hAnsi="arial" w:eastAsia="arial"/>
+          <w:color w:val="000000"/>
+          <w:sz w:val="16"/>
+          <w:szCs w:val="16"/>
+        </w:rPr>
+      </w:pPr>
+      <w:r>
+        <w:rPr>
+          <w:rFonts w:eastAsia="arial" w:ascii="arial" w:hAnsi="arial"/>
+          <w:color w:val="000000"/>
+          <w:sz w:val="16"/>
+          <w:szCs w:val="16"/>
+        </w:rPr>
+      </w:r>
+    </w:p>
+    <w:p>
+      <w:pPr>
+        <w:pStyle w:val="Normal"/>
+        <w:rPr>
+          <w:color w:val="000000"/>
+          <w:sz w:val="16"/>
+          <w:szCs w:val="16"/>
+        </w:rPr>
+      </w:pPr>
+      <w:r>
+        <w:rPr>
+          <w:rFonts w:eastAsia="arial" w:ascii="arial" w:hAnsi="arial"/>
+          <w:color w:val="000000"/>
+          <w:sz w:val="16"/>
+          <w:szCs w:val="16"/>
+        </w:rPr>
+        <w:tab/>
+        <w:t xml:space="preserve">           </w:t>
+      </w:r>
+      <w:r>
+        <w:rPr>
+          <w:rFonts w:eastAsia="arial" w:ascii="arial" w:hAnsi="arial"/>
+          <w:color w:val="000000"/>
+          <w:sz w:val="16"/>
+          <w:szCs w:val="16"/>
+        </w:rPr>
+        <w:t>OBB 1020</w:t>
+      </w:r>
+      <w:r>
+        <w:rPr>
+          <w:rFonts w:eastAsia="arial" w:ascii="arial" w:hAnsi="arial"/>
+          <w:color w:val="000000"/>
+          <w:sz w:val="16"/>
+          <w:szCs w:val="16"/>
+        </w:rPr>
+        <w:t>-2</w:t>
+      </w:r>
+    </w:p>
+    <w:tbl>
+      <w:tblPr>
+        <w:tblW w:w="14248" w:type="dxa"/>
+        <w:jc w:val="left"/>
+        <w:tblInd w:w="-5" w:type="dxa"/>
+        <w:tblLayout w:type="fixed"/>
+        <w:tblCellMar>
+          <w:top w:w="0" w:type="dxa"/>
+          <w:left w:w="108" w:type="dxa"/>
+          <w:bottom w:w="0" w:type="dxa"/>
+          <w:right w:w="108" w:type="dxa"/>
+        </w:tblCellMar>
+        <w:tblLook w:firstRow="1" w:noVBand="1" w:lastRow="0" w:firstColumn="1" w:lastColumn="0" w:noHBand="0" w:val="04a0"/>
+      </w:tblPr>
+      <w:tblGrid>
+        <w:gridCol w:w="1017"/>
+        <w:gridCol w:w="1019"/>
+        <w:gridCol w:w="1014"/>
+        <w:gridCol w:w="1016"/>
+        <w:gridCol w:w="1020"/>
+        <w:gridCol w:w="1016"/>
+        <w:gridCol w:w="1016"/>
+        <w:gridCol w:w="1017"/>
+        <w:gridCol w:w="1016"/>
+        <w:gridCol w:w="1020"/>
+        <w:gridCol w:w="1016"/>
+        <w:gridCol w:w="1016"/>
+        <w:gridCol w:w="1016"/>
+        <w:gridCol w:w="1029"/>
+      </w:tblGrid>
+      <w:tr>
+        <w:trPr>
+          <w:trHeight w:val="440" w:hRule="exact"/>
+          <w:cantSplit w:val="true"/>
+        </w:trPr>
+        <w:tc>
+          <w:tcPr>
+            <w:tcW w:w="1017" w:type="dxa"/>
+            <w:tcBorders>
+              <w:top w:val="single" w:sz="4" w:space="0" w:color="000000"/>
+              <w:left w:val="single" w:sz="4" w:space="0" w:color="000000"/>
+              <w:bottom w:val="single" w:sz="4" w:space="0" w:color="000000"/>
+            </w:tcBorders>
+            <w:vAlign w:val="bottom"/>
+          </w:tcPr>
+          <w:p>
+            <w:pPr>
+              <w:pStyle w:val="Normal"/>
+              <w:widowControl w:val="false"/>
+              <w:spacing w:lineRule="auto" w:line="180" w:before="0" w:after="60"/>
+              <w:jc w:val="center"/>
+              <w:rPr>
+                <w:color w:val="000000"/>
+                <w:sz w:val="16"/>
+                <w:szCs w:val="16"/>
+              </w:rPr>
+            </w:pPr>
+            <w:r>
+              <w:rPr>
+                <w:rFonts w:eastAsia="arial" w:ascii="arial" w:hAnsi="arial"/>
+                <w:b/>
+                <w:color w:val="000000"/>
+                <w:sz w:val="16"/>
+                <w:szCs w:val="16"/>
+              </w:rPr>
+              <w:t>HUD</w:t>
+            </w:r>
+          </w:p>
+        </w:tc>
+        <w:tc>
+          <w:tcPr>
+            <w:tcW w:w="1019" w:type="dxa"/>
+            <w:tcBorders>
+              <w:top w:val="single" w:sz="4" w:space="0" w:color="000000"/>
+              <w:left w:val="single" w:sz="4" w:space="0" w:color="000000"/>
+              <w:bottom w:val="single" w:sz="4" w:space="0" w:color="000000"/>
+            </w:tcBorders>
+            <w:vAlign w:val="bottom"/>
+          </w:tcPr>
+          <w:p>
+            <w:pPr>
+              <w:pStyle w:val="Normal"/>
+              <w:widowControl w:val="false"/>
+              <w:spacing w:lineRule="auto" w:line="180"/>
+              <w:jc w:val="center"/>
+              <w:rPr>
+                <w:rFonts w:ascii="arial" w:hAnsi="arial" w:eastAsia="arial"/>
+                <w:color w:val="000000"/>
+                <w:sz w:val="16"/>
+                <w:szCs w:val="16"/>
+              </w:rPr>
+            </w:pPr>
+            <w:r>
+              <w:rPr>
+                <w:rFonts w:eastAsia="arial" w:ascii="arial" w:hAnsi="arial"/>
+                <w:color w:val="000000"/>
+                <w:sz w:val="16"/>
+                <w:szCs w:val="16"/>
+              </w:rPr>
+              <w:t>Schedule</w:t>
+            </w:r>
+          </w:p>
+        </w:tc>
+        <w:tc>
+          <w:tcPr>
+            <w:tcW w:w="1014" w:type="dxa"/>
+            <w:tcBorders>
+              <w:top w:val="single" w:sz="4" w:space="0" w:color="000000"/>
+              <w:left w:val="single" w:sz="4" w:space="0" w:color="000000"/>
+              <w:bottom w:val="single" w:sz="4" w:space="0" w:color="000000"/>
+            </w:tcBorders>
+            <w:vAlign w:val="bottom"/>
+          </w:tcPr>
+          <w:p>
+            <w:pPr>
+              <w:pStyle w:val="Normal"/>
+              <w:widowControl w:val="false"/>
+              <w:spacing w:lineRule="auto" w:line="180"/>
+              <w:jc w:val="center"/>
+              <w:rPr>
+                <w:color w:val="000000"/>
+                <w:sz w:val="16"/>
+                <w:szCs w:val="16"/>
+              </w:rPr>
+            </w:pPr>
+            <w:r>
+              <w:rPr>
+                <w:rFonts w:eastAsia="arial" w:ascii="arial" w:hAnsi="arial"/>
+                <w:color w:val="000000"/>
+                <w:sz w:val="16"/>
+                <w:szCs w:val="16"/>
+              </w:rPr>
+              <w:t>MCB Open</w:t>
+            </w:r>
+          </w:p>
+        </w:tc>
+        <w:tc>
+          <w:tcPr>
+            <w:tcW w:w="1016" w:type="dxa"/>
+            <w:tcBorders>
+              <w:top w:val="single" w:sz="4" w:space="0" w:color="000000"/>
+              <w:left w:val="single" w:sz="4" w:space="0" w:color="000000"/>
+              <w:bottom w:val="single" w:sz="4" w:space="0" w:color="000000"/>
+            </w:tcBorders>
+            <w:vAlign w:val="bottom"/>
+          </w:tcPr>
+          <w:p>
+            <w:pPr>
+              <w:pStyle w:val="Normal"/>
+              <w:widowControl w:val="false"/>
+              <w:spacing w:lineRule="auto" w:line="180"/>
+              <w:jc w:val="center"/>
+              <w:rPr>
+                <w:sz w:val="16"/>
+                <w:szCs w:val="16"/>
+              </w:rPr>
+            </w:pPr>
+            <w:r>
+              <w:rPr>
+                <w:sz w:val="16"/>
+                <w:szCs w:val="16"/>
+              </w:rPr>
+              <w:t>Sifa</w:t>
+            </w:r>
+          </w:p>
+        </w:tc>
+        <w:tc>
+          <w:tcPr>
+            <w:tcW w:w="1020" w:type="dxa"/>
+            <w:tcBorders>
+              <w:top w:val="single" w:sz="4" w:space="0" w:color="000000"/>
+              <w:left w:val="single" w:sz="4" w:space="0" w:color="000000"/>
+              <w:bottom w:val="single" w:sz="4" w:space="0" w:color="000000"/>
+            </w:tcBorders>
+            <w:vAlign w:val="bottom"/>
+          </w:tcPr>
+          <w:p>
+            <w:pPr>
+              <w:pStyle w:val="Normal"/>
+              <w:widowControl w:val="false"/>
+              <w:spacing w:lineRule="auto" w:line="180"/>
+              <w:jc w:val="center"/>
+              <w:rPr>
+                <w:color w:val="000000"/>
+                <w:sz w:val="16"/>
+                <w:szCs w:val="16"/>
+              </w:rPr>
+            </w:pPr>
+            <w:r>
+              <w:rPr>
+                <w:color w:val="000000"/>
+                <w:sz w:val="16"/>
+                <w:szCs w:val="16"/>
+              </w:rPr>
+            </w:r>
+          </w:p>
+        </w:tc>
+        <w:tc>
+          <w:tcPr>
+            <w:tcW w:w="1016" w:type="dxa"/>
+            <w:tcBorders>
+              <w:top w:val="single" w:sz="4" w:space="0" w:color="000000"/>
+              <w:left w:val="single" w:sz="4" w:space="0" w:color="000000"/>
+              <w:bottom w:val="single" w:sz="4" w:space="0" w:color="000000"/>
+            </w:tcBorders>
+            <w:vAlign w:val="bottom"/>
+          </w:tcPr>
+          <w:p>
+            <w:pPr>
+              <w:pStyle w:val="Normal"/>
+              <w:widowControl w:val="false"/>
+              <w:spacing w:lineRule="auto" w:line="180"/>
+              <w:jc w:val="center"/>
+              <w:rPr>
+                <w:sz w:val="16"/>
+                <w:szCs w:val="16"/>
+              </w:rPr>
+            </w:pPr>
+            <w:r>
+              <w:rPr>
+                <w:sz w:val="16"/>
+                <w:szCs w:val="16"/>
+              </w:rPr>
+            </w:r>
+          </w:p>
+        </w:tc>
+        <w:tc>
+          <w:tcPr>
+            <w:tcW w:w="1016" w:type="dxa"/>
+            <w:tcBorders>
+              <w:top w:val="single" w:sz="4" w:space="0" w:color="000000"/>
+              <w:left w:val="single" w:sz="4" w:space="0" w:color="000000"/>
+              <w:bottom w:val="single" w:sz="4" w:space="0" w:color="000000"/>
+            </w:tcBorders>
+            <w:vAlign w:val="bottom"/>
+          </w:tcPr>
+          <w:p>
+            <w:pPr>
+              <w:pStyle w:val="Normal"/>
+              <w:widowControl w:val="false"/>
+              <w:jc w:val="center"/>
+              <w:rPr>
+                <w:sz w:val="16"/>
+                <w:szCs w:val="16"/>
+              </w:rPr>
+            </w:pPr>
+            <w:r>
+              <w:rPr>
+                <w:sz w:val="16"/>
+                <w:szCs w:val="16"/>
+              </w:rPr>
+            </w:r>
+          </w:p>
+        </w:tc>
+        <w:tc>
+          <w:tcPr>
+            <w:tcW w:w="1017" w:type="dxa"/>
+            <w:tcBorders>
+              <w:top w:val="single" w:sz="4" w:space="0" w:color="000000"/>
+              <w:left w:val="single" w:sz="4" w:space="0" w:color="000000"/>
+              <w:bottom w:val="single" w:sz="4" w:space="0" w:color="000000"/>
+            </w:tcBorders>
+            <w:vAlign w:val="bottom"/>
+          </w:tcPr>
+          <w:p>
+            <w:pPr>
+              <w:pStyle w:val="Normal"/>
+              <w:widowControl w:val="false"/>
+              <w:jc w:val="center"/>
+              <w:rPr>
+                <w:rFonts w:ascii="arial" w:hAnsi="arial" w:eastAsia="arial"/>
+                <w:color w:val="000000"/>
+                <w:sz w:val="16"/>
+                <w:szCs w:val="16"/>
+              </w:rPr>
+            </w:pPr>
+            <w:r>
+              <w:rPr>
+                <w:rFonts w:eastAsia="arial" w:ascii="arial" w:hAnsi="arial"/>
+                <w:color w:val="000000"/>
+                <w:sz w:val="16"/>
+                <w:szCs w:val="16"/>
+              </w:rPr>
+            </w:r>
+          </w:p>
+        </w:tc>
+        <w:tc>
+          <w:tcPr>
+            <w:tcW w:w="1016" w:type="dxa"/>
+            <w:tcBorders>
+              <w:top w:val="single" w:sz="4" w:space="0" w:color="000000"/>
+              <w:left w:val="single" w:sz="4" w:space="0" w:color="000000"/>
+              <w:bottom w:val="single" w:sz="4" w:space="0" w:color="000000"/>
+            </w:tcBorders>
+            <w:vAlign w:val="bottom"/>
+          </w:tcPr>
+          <w:p>
+            <w:pPr>
+              <w:pStyle w:val="Normal"/>
+              <w:widowControl w:val="false"/>
+              <w:jc w:val="center"/>
+              <w:rPr>
+                <w:rFonts w:ascii="arial" w:hAnsi="arial" w:eastAsia="arial"/>
+                <w:color w:val="000000"/>
+                <w:sz w:val="16"/>
+                <w:szCs w:val="16"/>
+              </w:rPr>
+            </w:pPr>
+            <w:r>
+              <w:rPr>
+                <w:rFonts w:eastAsia="arial" w:ascii="arial" w:hAnsi="arial"/>
+                <w:color w:val="000000"/>
+                <w:sz w:val="16"/>
+                <w:szCs w:val="16"/>
+              </w:rPr>
+            </w:r>
+          </w:p>
+        </w:tc>
+        <w:tc>
+          <w:tcPr>
+            <w:tcW w:w="1020" w:type="dxa"/>
+            <w:tcBorders>
+              <w:top w:val="single" w:sz="4" w:space="0" w:color="000000"/>
+              <w:left w:val="single" w:sz="4" w:space="0" w:color="000000"/>
+              <w:bottom w:val="single" w:sz="4" w:space="0" w:color="000000"/>
+            </w:tcBorders>
+            <w:vAlign w:val="bottom"/>
+          </w:tcPr>
+          <w:p>
+            <w:pPr>
+              <w:pStyle w:val="Normal"/>
+              <w:widowControl w:val="false"/>
+              <w:jc w:val="center"/>
+              <w:rPr>
+                <w:rFonts w:ascii="arial" w:hAnsi="arial" w:eastAsia="arial"/>
+                <w:color w:val="000000"/>
+                <w:sz w:val="16"/>
+                <w:szCs w:val="16"/>
+              </w:rPr>
+            </w:pPr>
+            <w:r>
+              <w:rPr>
+                <w:rFonts w:eastAsia="arial" w:ascii="arial" w:hAnsi="arial"/>
+                <w:color w:val="000000"/>
+                <w:sz w:val="16"/>
+                <w:szCs w:val="16"/>
+              </w:rPr>
+              <w:t>Gauge Light</w:t>
+            </w:r>
+          </w:p>
+        </w:tc>
+        <w:tc>
+          <w:tcPr>
+            <w:tcW w:w="1016" w:type="dxa"/>
+            <w:tcBorders>
+              <w:top w:val="single" w:sz="4" w:space="0" w:color="000000"/>
+              <w:left w:val="single" w:sz="4" w:space="0" w:color="000000"/>
+              <w:bottom w:val="single" w:sz="4" w:space="0" w:color="000000"/>
+            </w:tcBorders>
+            <w:vAlign w:val="bottom"/>
+          </w:tcPr>
+          <w:p>
+            <w:pPr>
+              <w:pStyle w:val="Normal"/>
+              <w:widowControl w:val="false"/>
+              <w:jc w:val="center"/>
+              <w:rPr>
+                <w:color w:val="000000"/>
+                <w:sz w:val="16"/>
+                <w:szCs w:val="16"/>
+              </w:rPr>
+            </w:pPr>
+            <w:r>
+              <w:rPr>
+                <w:rFonts w:eastAsia="arial" w:ascii="arial" w:hAnsi="arial"/>
+                <w:color w:val="000000"/>
+                <w:sz w:val="16"/>
+                <w:szCs w:val="16"/>
+              </w:rPr>
+              <w:t>Cab Light</w:t>
+            </w:r>
+          </w:p>
+        </w:tc>
+        <w:tc>
+          <w:tcPr>
+            <w:tcW w:w="1016" w:type="dxa"/>
+            <w:tcBorders>
+              <w:top w:val="single" w:sz="4" w:space="0" w:color="000000"/>
+              <w:left w:val="single" w:sz="4" w:space="0" w:color="000000"/>
+              <w:bottom w:val="single" w:sz="4" w:space="0" w:color="000000"/>
+            </w:tcBorders>
+            <w:vAlign w:val="bottom"/>
+          </w:tcPr>
+          <w:p>
+            <w:pPr>
+              <w:pStyle w:val="Normal"/>
+              <w:widowControl w:val="false"/>
+              <w:jc w:val="center"/>
+              <w:rPr>
+                <w:color w:val="000000"/>
+                <w:sz w:val="16"/>
+                <w:szCs w:val="16"/>
+              </w:rPr>
+            </w:pPr>
+            <w:r>
+              <w:rPr>
+                <w:rFonts w:eastAsia="arial" w:ascii="arial" w:hAnsi="arial"/>
+                <w:color w:val="000000"/>
+                <w:sz w:val="16"/>
+                <w:szCs w:val="16"/>
+              </w:rPr>
+              <w:t>Parking Brake Off</w:t>
+            </w:r>
+          </w:p>
+        </w:tc>
+        <w:tc>
+          <w:tcPr>
+            <w:tcW w:w="1016" w:type="dxa"/>
+            <w:tcBorders>
+              <w:top w:val="single" w:sz="4" w:space="0" w:color="000000"/>
+              <w:left w:val="single" w:sz="4" w:space="0" w:color="000000"/>
+              <w:bottom w:val="single" w:sz="4" w:space="0" w:color="000000"/>
+            </w:tcBorders>
+            <w:vAlign w:val="bottom"/>
+          </w:tcPr>
+          <w:p>
+            <w:pPr>
+              <w:pStyle w:val="Normal"/>
+              <w:widowControl w:val="false"/>
+              <w:spacing w:lineRule="auto" w:line="180"/>
+              <w:jc w:val="center"/>
+              <w:rPr>
+                <w:color w:val="000000"/>
+                <w:sz w:val="16"/>
+                <w:szCs w:val="16"/>
+              </w:rPr>
+            </w:pPr>
+            <w:r>
+              <w:rPr>
+                <w:rFonts w:eastAsia="arial" w:ascii="arial" w:hAnsi="arial"/>
+                <w:color w:val="000000"/>
+                <w:sz w:val="16"/>
+                <w:szCs w:val="16"/>
+              </w:rPr>
+              <w:t>Exterior</w:t>
+            </w:r>
+          </w:p>
+          <w:p>
+            <w:pPr>
+              <w:pStyle w:val="Normal"/>
+              <w:widowControl w:val="false"/>
+              <w:spacing w:lineRule="auto" w:line="180"/>
+              <w:jc w:val="center"/>
+              <w:rPr>
+                <w:color w:val="000000"/>
+                <w:sz w:val="16"/>
+                <w:szCs w:val="16"/>
+              </w:rPr>
+            </w:pPr>
+            <w:r>
+              <w:rPr>
+                <w:rFonts w:eastAsia="arial" w:ascii="arial" w:hAnsi="arial"/>
+                <w:color w:val="000000"/>
+                <w:sz w:val="16"/>
+                <w:szCs w:val="16"/>
+              </w:rPr>
+              <w:t>Camera</w:t>
+            </w:r>
+          </w:p>
+        </w:tc>
+        <w:tc>
+          <w:tcPr>
+            <w:tcW w:w="1029" w:type="dxa"/>
+            <w:tcBorders>
+              <w:top w:val="single" w:sz="4" w:space="0" w:color="000000"/>
+              <w:left w:val="single" w:sz="4" w:space="0" w:color="000000"/>
+              <w:bottom w:val="single" w:sz="4" w:space="0" w:color="000000"/>
+              <w:right w:val="single" w:sz="4" w:space="0" w:color="000000"/>
+            </w:tcBorders>
+            <w:vAlign w:val="bottom"/>
+          </w:tcPr>
+          <w:p>
+            <w:pPr>
+              <w:pStyle w:val="Normal"/>
+              <w:widowControl w:val="false"/>
+              <w:spacing w:lineRule="auto" w:line="180"/>
+              <w:jc w:val="center"/>
+              <w:rPr>
+                <w:color w:val="000000"/>
+                <w:sz w:val="16"/>
+                <w:szCs w:val="16"/>
+              </w:rPr>
+            </w:pPr>
+            <w:r>
+              <w:rPr>
+                <w:rFonts w:eastAsia="arial" w:ascii="arial" w:hAnsi="arial"/>
+                <w:color w:val="000000"/>
+                <w:sz w:val="16"/>
+                <w:szCs w:val="16"/>
+              </w:rPr>
+              <w:t>Prev</w:t>
+            </w:r>
+          </w:p>
+          <w:p>
+            <w:pPr>
+              <w:pStyle w:val="Normal"/>
+              <w:widowControl w:val="false"/>
+              <w:spacing w:lineRule="auto" w:line="180"/>
+              <w:jc w:val="center"/>
+              <w:rPr>
+                <w:color w:val="000000"/>
+                <w:sz w:val="16"/>
+                <w:szCs w:val="16"/>
+              </w:rPr>
+            </w:pPr>
+            <w:r>
+              <w:rPr>
+                <w:rFonts w:eastAsia="arial" w:ascii="arial" w:hAnsi="arial"/>
+                <w:color w:val="000000"/>
+                <w:sz w:val="16"/>
+                <w:szCs w:val="16"/>
+              </w:rPr>
+              <w:t>Cab Cam</w:t>
+            </w:r>
+          </w:p>
+        </w:tc>
+      </w:tr>
+    </w:tbl>
+    <w:p>
+      <w:pPr>
+        <w:pStyle w:val="Normal"/>
+        <w:bidi w:val="0"/>
+        <w:rPr>
+          <w:color w:val="000000"/>
+          <w:sz w:val="16"/>
+          <w:szCs w:val="16"/>
+        </w:rPr>
+      </w:pPr>
+      <w:r>
+        <w:rPr>
+          <w:color w:val="000000"/>
+          <w:sz w:val="16"/>
+          <w:szCs w:val="16"/>
+        </w:rPr>
+      </w:r>
+    </w:p>
+    <w:p>
+      <w:pPr>
+        <w:pStyle w:val="Normal"/>
+        <w:rPr>
+          <w:color w:val="000000"/>
+          <w:sz w:val="16"/>
+          <w:szCs w:val="16"/>
+        </w:rPr>
+      </w:pPr>
+      <w:r>
+        <w:rPr>
+          <w:color w:val="000000"/>
+          <w:sz w:val="16"/>
+          <w:szCs w:val="16"/>
+        </w:rPr>
+        <w:tab/>
+        <w:t xml:space="preserve">       </w:t>
+      </w:r>
+      <w:r>
+        <w:rPr>
+          <w:rFonts w:eastAsia="arial" w:ascii="arial" w:hAnsi="arial"/>
+          <w:color w:val="000000"/>
+          <w:sz w:val="16"/>
+          <w:szCs w:val="16"/>
+        </w:rPr>
+        <w:t xml:space="preserve">    </w:t>
+      </w:r>
+      <w:r>
+        <w:rPr>
+          <w:rFonts w:eastAsia="arial" w:ascii="arial" w:hAnsi="arial"/>
+          <w:color w:val="000000"/>
+          <w:sz w:val="16"/>
+          <w:szCs w:val="16"/>
+        </w:rPr>
+        <w:t>OBB 1116</w:t>
+      </w:r>
+      <w:r>
+        <w:rPr>
+          <w:rFonts w:eastAsia="arial" w:ascii="arial" w:hAnsi="arial"/>
+          <w:color w:val="000000"/>
+          <w:sz w:val="16"/>
+          <w:szCs w:val="16"/>
+        </w:rPr>
+        <w:t>-1</w:t>
+      </w:r>
+    </w:p>
+    <w:tbl>
+      <w:tblPr>
+        <w:tblW w:w="14248" w:type="dxa"/>
+        <w:jc w:val="left"/>
+        <w:tblInd w:w="-5" w:type="dxa"/>
+        <w:tblLayout w:type="fixed"/>
+        <w:tblCellMar>
+          <w:top w:w="0" w:type="dxa"/>
+          <w:left w:w="108" w:type="dxa"/>
+          <w:bottom w:w="0" w:type="dxa"/>
+          <w:right w:w="108" w:type="dxa"/>
+        </w:tblCellMar>
+        <w:tblLook w:firstRow="1" w:noVBand="1" w:lastRow="0" w:firstColumn="1" w:lastColumn="0" w:noHBand="0" w:val="04a0"/>
+      </w:tblPr>
+      <w:tblGrid>
+        <w:gridCol w:w="1017"/>
+        <w:gridCol w:w="1019"/>
+        <w:gridCol w:w="1014"/>
+        <w:gridCol w:w="1016"/>
+        <w:gridCol w:w="1020"/>
+        <w:gridCol w:w="1016"/>
+        <w:gridCol w:w="1016"/>
+        <w:gridCol w:w="1017"/>
+        <w:gridCol w:w="1016"/>
+        <w:gridCol w:w="1020"/>
+        <w:gridCol w:w="1016"/>
+        <w:gridCol w:w="1016"/>
+        <w:gridCol w:w="1016"/>
+        <w:gridCol w:w="1029"/>
+      </w:tblGrid>
+      <w:tr>
+        <w:trPr>
+          <w:trHeight w:val="440" w:hRule="exact"/>
+          <w:cantSplit w:val="true"/>
+        </w:trPr>
+        <w:tc>
+          <w:tcPr>
+            <w:tcW w:w="1017" w:type="dxa"/>
+            <w:tcBorders>
+              <w:top w:val="single" w:sz="4" w:space="0" w:color="000000"/>
+              <w:left w:val="single" w:sz="4" w:space="0" w:color="000000"/>
+              <w:bottom w:val="single" w:sz="4" w:space="0" w:color="000000"/>
+            </w:tcBorders>
+            <w:vAlign w:val="bottom"/>
+          </w:tcPr>
+          <w:p>
+            <w:pPr>
+              <w:pStyle w:val="Normal"/>
+              <w:widowControl w:val="false"/>
+              <w:spacing w:lineRule="auto" w:line="180" w:before="0" w:after="60"/>
+              <w:jc w:val="center"/>
+              <w:rPr>
+                <w:color w:val="000000"/>
+                <w:sz w:val="16"/>
+                <w:szCs w:val="16"/>
+              </w:rPr>
+            </w:pPr>
+            <w:r>
+              <w:rPr>
+                <w:rFonts w:eastAsia="arial" w:ascii="arial" w:hAnsi="arial"/>
+                <w:b/>
+                <w:color w:val="000000"/>
+                <w:sz w:val="16"/>
+                <w:szCs w:val="16"/>
+              </w:rPr>
+              <w:t>Pause</w:t>
+            </w:r>
+          </w:p>
+        </w:tc>
+        <w:tc>
+          <w:tcPr>
+            <w:tcW w:w="1019" w:type="dxa"/>
+            <w:tcBorders>
+              <w:top w:val="single" w:sz="4" w:space="0" w:color="000000"/>
+              <w:left w:val="single" w:sz="4" w:space="0" w:color="000000"/>
+              <w:bottom w:val="single" w:sz="4" w:space="0" w:color="000000"/>
+            </w:tcBorders>
+            <w:vAlign w:val="bottom"/>
+          </w:tcPr>
+          <w:p>
+            <w:pPr>
+              <w:pStyle w:val="Normal"/>
+              <w:widowControl w:val="false"/>
+              <w:spacing w:lineRule="auto" w:line="180"/>
+              <w:jc w:val="center"/>
+              <w:rPr>
+                <w:color w:val="000000"/>
+                <w:sz w:val="16"/>
+                <w:szCs w:val="16"/>
+              </w:rPr>
+            </w:pPr>
+            <w:r>
+              <w:rPr>
+                <w:rFonts w:eastAsia="arial" w:ascii="arial" w:hAnsi="arial"/>
+                <w:color w:val="000000"/>
+                <w:sz w:val="16"/>
+                <w:szCs w:val="16"/>
+              </w:rPr>
+              <w:t>Reverser</w:t>
+            </w:r>
+          </w:p>
+          <w:p>
+            <w:pPr>
+              <w:pStyle w:val="Normal"/>
+              <w:widowControl w:val="false"/>
+              <w:spacing w:lineRule="auto" w:line="180"/>
+              <w:jc w:val="center"/>
+              <w:rPr>
+                <w:color w:val="000000"/>
+                <w:sz w:val="16"/>
+                <w:szCs w:val="16"/>
+              </w:rPr>
+            </w:pPr>
+            <w:r>
+              <w:rPr>
+                <w:rFonts w:eastAsia="arial" w:ascii="arial" w:hAnsi="arial"/>
+                <w:color w:val="000000"/>
+                <w:sz w:val="16"/>
+                <w:szCs w:val="16"/>
+              </w:rPr>
+              <w:t>Handle</w:t>
+            </w:r>
+          </w:p>
+        </w:tc>
+        <w:tc>
+          <w:tcPr>
+            <w:tcW w:w="1014" w:type="dxa"/>
+            <w:tcBorders>
+              <w:top w:val="single" w:sz="4" w:space="0" w:color="000000"/>
+              <w:left w:val="single" w:sz="4" w:space="0" w:color="000000"/>
+              <w:bottom w:val="single" w:sz="4" w:space="0" w:color="000000"/>
+            </w:tcBorders>
+            <w:vAlign w:val="bottom"/>
+          </w:tcPr>
+          <w:p>
+            <w:pPr>
+              <w:pStyle w:val="Normal"/>
+              <w:widowControl w:val="false"/>
+              <w:spacing w:lineRule="auto" w:line="180"/>
+              <w:jc w:val="center"/>
+              <w:rPr>
+                <w:color w:val="000000"/>
+                <w:sz w:val="16"/>
+                <w:szCs w:val="16"/>
+              </w:rPr>
+            </w:pPr>
+            <w:r>
+              <w:rPr>
+                <w:color w:val="000000"/>
+                <w:sz w:val="16"/>
+                <w:szCs w:val="16"/>
+              </w:rPr>
+              <w:t>MCB Close</w:t>
+            </w:r>
+          </w:p>
+        </w:tc>
+        <w:tc>
+          <w:tcPr>
+            <w:tcW w:w="1016" w:type="dxa"/>
+            <w:tcBorders>
+              <w:top w:val="single" w:sz="4" w:space="0" w:color="000000"/>
+              <w:left w:val="single" w:sz="4" w:space="0" w:color="000000"/>
+              <w:bottom w:val="single" w:sz="4" w:space="0" w:color="000000"/>
+            </w:tcBorders>
+            <w:vAlign w:val="bottom"/>
+          </w:tcPr>
+          <w:p>
+            <w:pPr>
+              <w:pStyle w:val="Normal"/>
+              <w:widowControl w:val="false"/>
+              <w:spacing w:lineRule="auto" w:line="180"/>
+              <w:jc w:val="center"/>
+              <w:rPr>
+                <w:sz w:val="16"/>
+                <w:szCs w:val="16"/>
+              </w:rPr>
+            </w:pPr>
+            <w:r>
+              <w:rPr>
+                <w:rFonts w:eastAsia="arial" w:ascii="arial" w:hAnsi="arial"/>
+                <w:color w:val="000000"/>
+                <w:sz w:val="16"/>
+                <w:szCs w:val="16"/>
+              </w:rPr>
+              <w:t>AFB</w:t>
+            </w:r>
+          </w:p>
+        </w:tc>
+        <w:tc>
+          <w:tcPr>
+            <w:tcW w:w="1020" w:type="dxa"/>
+            <w:tcBorders>
+              <w:top w:val="single" w:sz="4" w:space="0" w:color="000000"/>
+              <w:left w:val="single" w:sz="4" w:space="0" w:color="000000"/>
+              <w:bottom w:val="single" w:sz="4" w:space="0" w:color="000000"/>
+            </w:tcBorders>
+            <w:vAlign w:val="bottom"/>
+          </w:tcPr>
+          <w:p>
+            <w:pPr>
+              <w:pStyle w:val="Normal"/>
+              <w:widowControl w:val="false"/>
+              <w:spacing w:lineRule="auto" w:line="180"/>
+              <w:jc w:val="center"/>
+              <w:rPr>
+                <w:color w:val="000000"/>
+                <w:sz w:val="16"/>
+                <w:szCs w:val="16"/>
+              </w:rPr>
+            </w:pPr>
+            <w:r>
+              <w:rPr>
+                <w:rFonts w:eastAsia="arial" w:ascii="arial" w:hAnsi="arial"/>
+                <w:color w:val="000000"/>
+                <w:sz w:val="16"/>
+                <w:szCs w:val="16"/>
+              </w:rPr>
+              <w:t>Panto. Raise</w:t>
+            </w:r>
+          </w:p>
+        </w:tc>
+        <w:tc>
+          <w:tcPr>
+            <w:tcW w:w="1016" w:type="dxa"/>
+            <w:tcBorders>
+              <w:top w:val="single" w:sz="4" w:space="0" w:color="000000"/>
+              <w:left w:val="single" w:sz="4" w:space="0" w:color="000000"/>
+              <w:bottom w:val="single" w:sz="4" w:space="0" w:color="000000"/>
+            </w:tcBorders>
+            <w:vAlign w:val="bottom"/>
+          </w:tcPr>
+          <w:p>
+            <w:pPr>
+              <w:pStyle w:val="Normal"/>
+              <w:widowControl w:val="false"/>
+              <w:jc w:val="center"/>
+              <w:rPr>
+                <w:color w:val="000000"/>
+                <w:sz w:val="16"/>
+                <w:szCs w:val="16"/>
+              </w:rPr>
+            </w:pPr>
+            <w:r>
+              <w:rPr>
+                <w:color w:val="000000"/>
+                <w:sz w:val="16"/>
+                <w:szCs w:val="16"/>
+              </w:rPr>
+              <w:t>Train Supply On</w:t>
+            </w:r>
+          </w:p>
+        </w:tc>
+        <w:tc>
+          <w:tcPr>
+            <w:tcW w:w="1016" w:type="dxa"/>
+            <w:tcBorders>
+              <w:top w:val="single" w:sz="4" w:space="0" w:color="000000"/>
+              <w:left w:val="single" w:sz="4" w:space="0" w:color="000000"/>
+              <w:bottom w:val="single" w:sz="4" w:space="0" w:color="000000"/>
+            </w:tcBorders>
+            <w:vAlign w:val="bottom"/>
+          </w:tcPr>
+          <w:p>
+            <w:pPr>
+              <w:pStyle w:val="Normal"/>
+              <w:widowControl w:val="false"/>
+              <w:jc w:val="center"/>
+              <w:rPr>
+                <w:sz w:val="16"/>
+                <w:szCs w:val="16"/>
+              </w:rPr>
+            </w:pPr>
+            <w:r>
+              <w:rPr>
+                <w:rFonts w:eastAsia="arial" w:ascii="arial" w:hAnsi="arial"/>
+                <w:color w:val="000000"/>
+                <w:sz w:val="16"/>
+                <w:szCs w:val="16"/>
+              </w:rPr>
+              <w:t>Train Light On</w:t>
+            </w:r>
+          </w:p>
+        </w:tc>
+        <w:tc>
+          <w:tcPr>
+            <w:tcW w:w="1017" w:type="dxa"/>
+            <w:tcBorders>
+              <w:top w:val="single" w:sz="4" w:space="0" w:color="000000"/>
+              <w:left w:val="single" w:sz="4" w:space="0" w:color="000000"/>
+              <w:bottom w:val="single" w:sz="4" w:space="0" w:color="000000"/>
+            </w:tcBorders>
+            <w:vAlign w:val="bottom"/>
+          </w:tcPr>
+          <w:p>
+            <w:pPr>
+              <w:pStyle w:val="Normal"/>
+              <w:widowControl w:val="false"/>
+              <w:jc w:val="center"/>
+              <w:rPr>
+                <w:rFonts w:ascii="arial" w:hAnsi="arial" w:eastAsia="arial"/>
+                <w:color w:val="000000"/>
+                <w:sz w:val="16"/>
+                <w:szCs w:val="16"/>
+              </w:rPr>
+            </w:pPr>
+            <w:r>
+              <w:rPr>
+                <w:rFonts w:eastAsia="arial" w:ascii="arial" w:hAnsi="arial"/>
+                <w:color w:val="000000"/>
+                <w:sz w:val="16"/>
+                <w:szCs w:val="16"/>
+              </w:rPr>
+              <w:t>Signal Light HL</w:t>
+            </w:r>
+          </w:p>
+        </w:tc>
+        <w:tc>
+          <w:tcPr>
+            <w:tcW w:w="1016" w:type="dxa"/>
+            <w:tcBorders>
+              <w:top w:val="single" w:sz="4" w:space="0" w:color="000000"/>
+              <w:left w:val="single" w:sz="4" w:space="0" w:color="000000"/>
+              <w:bottom w:val="single" w:sz="4" w:space="0" w:color="000000"/>
+            </w:tcBorders>
+            <w:vAlign w:val="bottom"/>
+          </w:tcPr>
+          <w:p>
+            <w:pPr>
+              <w:pStyle w:val="Normal"/>
+              <w:widowControl w:val="false"/>
+              <w:jc w:val="center"/>
+              <w:rPr>
+                <w:rFonts w:ascii="arial" w:hAnsi="arial" w:eastAsia="arial"/>
+                <w:color w:val="000000"/>
+                <w:sz w:val="16"/>
+                <w:szCs w:val="16"/>
+              </w:rPr>
+            </w:pPr>
+            <w:r>
+              <w:rPr>
+                <w:rFonts w:eastAsia="arial" w:ascii="arial" w:hAnsi="arial"/>
+                <w:color w:val="000000"/>
+                <w:sz w:val="16"/>
+                <w:szCs w:val="16"/>
+              </w:rPr>
+              <w:t>Exterior Light Up</w:t>
+            </w:r>
+          </w:p>
+        </w:tc>
+        <w:tc>
+          <w:tcPr>
+            <w:tcW w:w="1020" w:type="dxa"/>
+            <w:tcBorders>
+              <w:top w:val="single" w:sz="4" w:space="0" w:color="000000"/>
+              <w:left w:val="single" w:sz="4" w:space="0" w:color="000000"/>
+              <w:bottom w:val="single" w:sz="4" w:space="0" w:color="000000"/>
+            </w:tcBorders>
+            <w:vAlign w:val="bottom"/>
+          </w:tcPr>
+          <w:p>
+            <w:pPr>
+              <w:pStyle w:val="Normal"/>
+              <w:widowControl w:val="false"/>
+              <w:jc w:val="center"/>
+              <w:rPr>
+                <w:rFonts w:ascii="arial" w:hAnsi="arial" w:eastAsia="arial"/>
+                <w:color w:val="000000"/>
+                <w:sz w:val="16"/>
+                <w:szCs w:val="16"/>
+              </w:rPr>
+            </w:pPr>
+            <w:r>
+              <w:rPr>
+                <w:rFonts w:eastAsia="arial" w:ascii="arial" w:hAnsi="arial"/>
+                <w:color w:val="000000"/>
+                <w:sz w:val="16"/>
+                <w:szCs w:val="16"/>
+              </w:rPr>
+              <w:t>PZB Mode O</w:t>
+            </w:r>
+          </w:p>
+        </w:tc>
+        <w:tc>
+          <w:tcPr>
+            <w:tcW w:w="1016" w:type="dxa"/>
+            <w:tcBorders>
+              <w:top w:val="single" w:sz="4" w:space="0" w:color="000000"/>
+              <w:left w:val="single" w:sz="4" w:space="0" w:color="000000"/>
+              <w:bottom w:val="single" w:sz="4" w:space="0" w:color="000000"/>
+            </w:tcBorders>
+            <w:vAlign w:val="bottom"/>
+          </w:tcPr>
+          <w:p>
+            <w:pPr>
+              <w:pStyle w:val="Normal"/>
+              <w:widowControl w:val="false"/>
+              <w:spacing w:lineRule="auto" w:line="180"/>
+              <w:jc w:val="center"/>
+              <w:rPr>
+                <w:color w:val="000000"/>
+                <w:sz w:val="16"/>
+                <w:szCs w:val="16"/>
+              </w:rPr>
+            </w:pPr>
+            <w:r>
+              <w:rPr>
+                <w:rFonts w:eastAsia="arial" w:ascii="arial" w:hAnsi="arial"/>
+                <w:color w:val="000000"/>
+                <w:sz w:val="16"/>
+                <w:szCs w:val="16"/>
+              </w:rPr>
+              <w:t>Cab Light</w:t>
+            </w:r>
+          </w:p>
+        </w:tc>
+        <w:tc>
+          <w:tcPr>
+            <w:tcW w:w="1016" w:type="dxa"/>
+            <w:tcBorders>
+              <w:top w:val="single" w:sz="4" w:space="0" w:color="000000"/>
+              <w:left w:val="single" w:sz="4" w:space="0" w:color="000000"/>
+              <w:bottom w:val="single" w:sz="4" w:space="0" w:color="000000"/>
+            </w:tcBorders>
+            <w:vAlign w:val="bottom"/>
+          </w:tcPr>
+          <w:p>
+            <w:pPr>
+              <w:pStyle w:val="Normal"/>
+              <w:widowControl w:val="false"/>
+              <w:spacing w:lineRule="auto" w:line="180"/>
+              <w:jc w:val="center"/>
+              <w:rPr>
+                <w:color w:val="000000"/>
+                <w:sz w:val="16"/>
+                <w:szCs w:val="16"/>
+              </w:rPr>
+            </w:pPr>
+            <w:r>
+              <w:rPr>
+                <w:rFonts w:eastAsia="arial" w:ascii="arial" w:hAnsi="arial"/>
+                <w:color w:val="000000"/>
+                <w:sz w:val="16"/>
+                <w:szCs w:val="16"/>
+              </w:rPr>
+              <w:t>Parking Brake On</w:t>
+            </w:r>
+          </w:p>
+        </w:tc>
+        <w:tc>
+          <w:tcPr>
+            <w:tcW w:w="1016" w:type="dxa"/>
+            <w:tcBorders>
+              <w:top w:val="single" w:sz="4" w:space="0" w:color="000000"/>
+              <w:left w:val="single" w:sz="4" w:space="0" w:color="000000"/>
+              <w:bottom w:val="single" w:sz="4" w:space="0" w:color="000000"/>
+            </w:tcBorders>
+            <w:vAlign w:val="bottom"/>
+          </w:tcPr>
+          <w:p>
+            <w:pPr>
+              <w:pStyle w:val="Normal"/>
+              <w:widowControl w:val="false"/>
+              <w:spacing w:lineRule="auto" w:line="180"/>
+              <w:jc w:val="center"/>
+              <w:rPr>
+                <w:color w:val="000000"/>
+                <w:sz w:val="16"/>
+                <w:szCs w:val="16"/>
+              </w:rPr>
+            </w:pPr>
+            <w:r>
+              <w:rPr>
+                <w:rFonts w:eastAsia="arial" w:ascii="arial" w:hAnsi="arial"/>
+                <w:color w:val="000000"/>
+                <w:sz w:val="16"/>
+                <w:szCs w:val="16"/>
+              </w:rPr>
+              <w:t>1P Cam</w:t>
+            </w:r>
+          </w:p>
+        </w:tc>
+        <w:tc>
+          <w:tcPr>
+            <w:tcW w:w="1029" w:type="dxa"/>
+            <w:tcBorders>
+              <w:top w:val="single" w:sz="4" w:space="0" w:color="000000"/>
+              <w:left w:val="single" w:sz="4" w:space="0" w:color="000000"/>
+              <w:bottom w:val="single" w:sz="4" w:space="0" w:color="000000"/>
+              <w:right w:val="single" w:sz="4" w:space="0" w:color="000000"/>
+            </w:tcBorders>
+            <w:vAlign w:val="bottom"/>
+          </w:tcPr>
+          <w:p>
+            <w:pPr>
+              <w:pStyle w:val="Normal"/>
+              <w:widowControl w:val="false"/>
+              <w:spacing w:lineRule="auto" w:line="180"/>
+              <w:jc w:val="center"/>
+              <w:rPr>
+                <w:color w:val="000000"/>
+                <w:sz w:val="16"/>
+                <w:szCs w:val="16"/>
+              </w:rPr>
+            </w:pPr>
+            <w:r>
+              <w:rPr>
+                <w:rFonts w:eastAsia="arial" w:ascii="arial" w:hAnsi="arial"/>
+                <w:color w:val="000000"/>
+                <w:sz w:val="16"/>
+                <w:szCs w:val="16"/>
+              </w:rPr>
+              <w:t>Next</w:t>
+            </w:r>
+          </w:p>
+          <w:p>
+            <w:pPr>
+              <w:pStyle w:val="Normal"/>
+              <w:widowControl w:val="false"/>
+              <w:spacing w:lineRule="auto" w:line="180"/>
+              <w:jc w:val="center"/>
+              <w:rPr>
+                <w:color w:val="000000"/>
+                <w:sz w:val="16"/>
+                <w:szCs w:val="16"/>
+              </w:rPr>
+            </w:pPr>
+            <w:r>
+              <w:rPr>
+                <w:rFonts w:eastAsia="arial" w:ascii="arial" w:hAnsi="arial"/>
+                <w:color w:val="000000"/>
+                <w:sz w:val="16"/>
+                <w:szCs w:val="16"/>
+              </w:rPr>
+              <w:t>Cab Cam</w:t>
+            </w:r>
+          </w:p>
+        </w:tc>
+      </w:tr>
+    </w:tbl>
+    <w:p>
+      <w:pPr>
+        <w:pStyle w:val="Normal"/>
+        <w:rPr>
+          <w:rFonts w:ascii="arial" w:hAnsi="arial" w:eastAsia="arial"/>
+          <w:color w:val="000000"/>
+          <w:sz w:val="16"/>
+          <w:szCs w:val="16"/>
+        </w:rPr>
+      </w:pPr>
+      <w:r>
+        <w:rPr>
+          <w:rFonts w:eastAsia="arial" w:ascii="arial" w:hAnsi="arial"/>
+          <w:color w:val="000000"/>
+          <w:sz w:val="16"/>
+          <w:szCs w:val="16"/>
+        </w:rPr>
+      </w:r>
+    </w:p>
+    <w:p>
+      <w:pPr>
+        <w:pStyle w:val="Normal"/>
+        <w:rPr>
+          <w:color w:val="000000"/>
+          <w:sz w:val="16"/>
+          <w:szCs w:val="16"/>
+        </w:rPr>
+      </w:pPr>
+      <w:r>
+        <w:rPr>
+          <w:rFonts w:eastAsia="arial" w:ascii="arial" w:hAnsi="arial"/>
+          <w:color w:val="000000"/>
+          <w:sz w:val="16"/>
+          <w:szCs w:val="16"/>
+        </w:rPr>
+        <w:tab/>
+        <w:t xml:space="preserve">           </w:t>
+      </w:r>
+      <w:r>
+        <w:rPr>
+          <w:rFonts w:eastAsia="arial" w:ascii="arial" w:hAnsi="arial"/>
+          <w:color w:val="000000"/>
+          <w:sz w:val="16"/>
+          <w:szCs w:val="16"/>
+        </w:rPr>
+        <w:t>OBB 1116</w:t>
+      </w:r>
+      <w:r>
+        <w:rPr>
+          <w:rFonts w:eastAsia="arial" w:ascii="arial" w:hAnsi="arial"/>
+          <w:color w:val="000000"/>
+          <w:sz w:val="16"/>
+          <w:szCs w:val="16"/>
+        </w:rPr>
+        <w:t>-2</w:t>
+      </w:r>
+    </w:p>
+    <w:tbl>
+      <w:tblPr>
+        <w:tblW w:w="14248" w:type="dxa"/>
+        <w:jc w:val="left"/>
+        <w:tblInd w:w="-5" w:type="dxa"/>
+        <w:tblLayout w:type="fixed"/>
+        <w:tblCellMar>
+          <w:top w:w="0" w:type="dxa"/>
+          <w:left w:w="108" w:type="dxa"/>
+          <w:bottom w:w="0" w:type="dxa"/>
+          <w:right w:w="108" w:type="dxa"/>
+        </w:tblCellMar>
+        <w:tblLook w:firstRow="1" w:noVBand="1" w:lastRow="0" w:firstColumn="1" w:lastColumn="0" w:noHBand="0" w:val="04a0"/>
+      </w:tblPr>
+      <w:tblGrid>
+        <w:gridCol w:w="1017"/>
+        <w:gridCol w:w="1019"/>
+        <w:gridCol w:w="1014"/>
+        <w:gridCol w:w="1016"/>
+        <w:gridCol w:w="1020"/>
+        <w:gridCol w:w="1016"/>
+        <w:gridCol w:w="1016"/>
+        <w:gridCol w:w="1017"/>
+        <w:gridCol w:w="1016"/>
+        <w:gridCol w:w="1020"/>
+        <w:gridCol w:w="1016"/>
+        <w:gridCol w:w="1016"/>
+        <w:gridCol w:w="1016"/>
+        <w:gridCol w:w="1029"/>
+      </w:tblGrid>
+      <w:tr>
+        <w:trPr>
+          <w:trHeight w:val="440" w:hRule="exact"/>
+          <w:cantSplit w:val="true"/>
+        </w:trPr>
+        <w:tc>
+          <w:tcPr>
+            <w:tcW w:w="1017" w:type="dxa"/>
+            <w:tcBorders>
+              <w:top w:val="single" w:sz="4" w:space="0" w:color="000000"/>
+              <w:left w:val="single" w:sz="4" w:space="0" w:color="000000"/>
+              <w:bottom w:val="single" w:sz="4" w:space="0" w:color="000000"/>
+            </w:tcBorders>
+            <w:vAlign w:val="bottom"/>
+          </w:tcPr>
+          <w:p>
+            <w:pPr>
+              <w:pStyle w:val="Normal"/>
+              <w:widowControl w:val="false"/>
+              <w:spacing w:lineRule="auto" w:line="180" w:before="0" w:after="60"/>
+              <w:jc w:val="center"/>
+              <w:rPr>
+                <w:color w:val="000000"/>
+                <w:sz w:val="16"/>
+                <w:szCs w:val="16"/>
+              </w:rPr>
+            </w:pPr>
+            <w:r>
+              <w:rPr>
+                <w:rFonts w:eastAsia="arial" w:ascii="arial" w:hAnsi="arial"/>
+                <w:b/>
+                <w:color w:val="000000"/>
+                <w:sz w:val="16"/>
+                <w:szCs w:val="16"/>
+              </w:rPr>
+              <w:t>HUD</w:t>
+            </w:r>
+          </w:p>
+        </w:tc>
+        <w:tc>
+          <w:tcPr>
+            <w:tcW w:w="1019" w:type="dxa"/>
+            <w:tcBorders>
+              <w:top w:val="single" w:sz="4" w:space="0" w:color="000000"/>
+              <w:left w:val="single" w:sz="4" w:space="0" w:color="000000"/>
+              <w:bottom w:val="single" w:sz="4" w:space="0" w:color="000000"/>
+            </w:tcBorders>
+            <w:vAlign w:val="bottom"/>
+          </w:tcPr>
+          <w:p>
+            <w:pPr>
+              <w:pStyle w:val="Normal"/>
+              <w:widowControl w:val="false"/>
+              <w:spacing w:lineRule="auto" w:line="180"/>
+              <w:jc w:val="center"/>
+              <w:rPr>
+                <w:rFonts w:ascii="arial" w:hAnsi="arial" w:eastAsia="arial"/>
+                <w:color w:val="000000"/>
+                <w:sz w:val="16"/>
+                <w:szCs w:val="16"/>
+              </w:rPr>
+            </w:pPr>
+            <w:r>
+              <w:rPr>
+                <w:rFonts w:eastAsia="arial" w:ascii="arial" w:hAnsi="arial"/>
+                <w:color w:val="000000"/>
+                <w:sz w:val="16"/>
+                <w:szCs w:val="16"/>
+              </w:rPr>
+              <w:t>Schedule</w:t>
+            </w:r>
+          </w:p>
+        </w:tc>
+        <w:tc>
+          <w:tcPr>
+            <w:tcW w:w="1014" w:type="dxa"/>
+            <w:tcBorders>
+              <w:top w:val="single" w:sz="4" w:space="0" w:color="000000"/>
+              <w:left w:val="single" w:sz="4" w:space="0" w:color="000000"/>
+              <w:bottom w:val="single" w:sz="4" w:space="0" w:color="000000"/>
+            </w:tcBorders>
+            <w:vAlign w:val="bottom"/>
+          </w:tcPr>
+          <w:p>
+            <w:pPr>
+              <w:pStyle w:val="Normal"/>
+              <w:widowControl w:val="false"/>
+              <w:spacing w:lineRule="auto" w:line="180"/>
+              <w:jc w:val="center"/>
+              <w:rPr>
+                <w:color w:val="000000"/>
+                <w:sz w:val="16"/>
+                <w:szCs w:val="16"/>
+              </w:rPr>
+            </w:pPr>
+            <w:r>
+              <w:rPr>
+                <w:rFonts w:eastAsia="arial" w:ascii="arial" w:hAnsi="arial"/>
+                <w:color w:val="000000"/>
+                <w:sz w:val="16"/>
+                <w:szCs w:val="16"/>
+              </w:rPr>
+              <w:t>MCB Open</w:t>
+            </w:r>
+          </w:p>
+        </w:tc>
+        <w:tc>
+          <w:tcPr>
+            <w:tcW w:w="1016" w:type="dxa"/>
+            <w:tcBorders>
+              <w:top w:val="single" w:sz="4" w:space="0" w:color="000000"/>
+              <w:left w:val="single" w:sz="4" w:space="0" w:color="000000"/>
+              <w:bottom w:val="single" w:sz="4" w:space="0" w:color="000000"/>
+            </w:tcBorders>
+            <w:vAlign w:val="bottom"/>
+          </w:tcPr>
+          <w:p>
+            <w:pPr>
+              <w:pStyle w:val="Normal"/>
+              <w:widowControl w:val="false"/>
+              <w:spacing w:lineRule="auto" w:line="180"/>
+              <w:jc w:val="center"/>
+              <w:rPr>
+                <w:sz w:val="16"/>
+                <w:szCs w:val="16"/>
+              </w:rPr>
+            </w:pPr>
+            <w:r>
+              <w:rPr>
+                <w:sz w:val="16"/>
+                <w:szCs w:val="16"/>
+              </w:rPr>
+              <w:t>Sifa/</w:t>
+            </w:r>
+            <w:r>
+              <w:rPr>
+                <w:rFonts w:eastAsia="arial" w:ascii="arial" w:hAnsi="arial"/>
+                <w:color w:val="000000"/>
+                <w:sz w:val="16"/>
+                <w:szCs w:val="16"/>
+              </w:rPr>
+              <w:t>PZB/LZB</w:t>
+            </w:r>
+          </w:p>
+        </w:tc>
+        <w:tc>
+          <w:tcPr>
+            <w:tcW w:w="1020" w:type="dxa"/>
+            <w:tcBorders>
+              <w:top w:val="single" w:sz="4" w:space="0" w:color="000000"/>
+              <w:left w:val="single" w:sz="4" w:space="0" w:color="000000"/>
+              <w:bottom w:val="single" w:sz="4" w:space="0" w:color="000000"/>
+            </w:tcBorders>
+            <w:vAlign w:val="bottom"/>
+          </w:tcPr>
+          <w:p>
+            <w:pPr>
+              <w:pStyle w:val="Normal"/>
+              <w:widowControl w:val="false"/>
+              <w:jc w:val="center"/>
+              <w:rPr>
+                <w:rFonts w:ascii="arial" w:hAnsi="arial" w:eastAsia="arial"/>
+                <w:color w:val="000000"/>
+                <w:sz w:val="16"/>
+                <w:szCs w:val="16"/>
+              </w:rPr>
+            </w:pPr>
+            <w:r>
+              <w:rPr>
+                <w:rFonts w:eastAsia="arial" w:ascii="arial" w:hAnsi="arial"/>
+                <w:color w:val="000000"/>
+                <w:sz w:val="16"/>
+                <w:szCs w:val="16"/>
+              </w:rPr>
+              <w:t>Panto.</w:t>
+            </w:r>
+          </w:p>
+          <w:p>
+            <w:pPr>
+              <w:pStyle w:val="Normal"/>
+              <w:widowControl w:val="false"/>
+              <w:jc w:val="center"/>
+              <w:rPr>
+                <w:rFonts w:ascii="arial" w:hAnsi="arial" w:eastAsia="arial"/>
+                <w:color w:val="000000"/>
+                <w:sz w:val="16"/>
+                <w:szCs w:val="16"/>
+              </w:rPr>
+            </w:pPr>
+            <w:r>
+              <w:rPr>
+                <w:rFonts w:eastAsia="arial" w:ascii="arial" w:hAnsi="arial"/>
+                <w:color w:val="000000"/>
+                <w:sz w:val="16"/>
+                <w:szCs w:val="16"/>
+              </w:rPr>
+              <w:t>Low</w:t>
+            </w:r>
+          </w:p>
+        </w:tc>
+        <w:tc>
+          <w:tcPr>
+            <w:tcW w:w="1016" w:type="dxa"/>
+            <w:tcBorders>
+              <w:top w:val="single" w:sz="4" w:space="0" w:color="000000"/>
+              <w:left w:val="single" w:sz="4" w:space="0" w:color="000000"/>
+              <w:bottom w:val="single" w:sz="4" w:space="0" w:color="000000"/>
+            </w:tcBorders>
+            <w:vAlign w:val="bottom"/>
+          </w:tcPr>
+          <w:p>
+            <w:pPr>
+              <w:pStyle w:val="Normal"/>
+              <w:widowControl w:val="false"/>
+              <w:spacing w:lineRule="auto" w:line="180"/>
+              <w:jc w:val="center"/>
+              <w:rPr>
+                <w:sz w:val="16"/>
+                <w:szCs w:val="16"/>
+              </w:rPr>
+            </w:pPr>
+            <w:r>
+              <w:rPr>
+                <w:rFonts w:eastAsia="arial" w:ascii="arial" w:hAnsi="arial"/>
+                <w:color w:val="000000"/>
+                <w:sz w:val="16"/>
+                <w:szCs w:val="16"/>
+              </w:rPr>
+              <w:t>Train Supply Off</w:t>
+            </w:r>
+          </w:p>
+        </w:tc>
+        <w:tc>
+          <w:tcPr>
+            <w:tcW w:w="1016" w:type="dxa"/>
+            <w:tcBorders>
+              <w:top w:val="single" w:sz="4" w:space="0" w:color="000000"/>
+              <w:left w:val="single" w:sz="4" w:space="0" w:color="000000"/>
+              <w:bottom w:val="single" w:sz="4" w:space="0" w:color="000000"/>
+            </w:tcBorders>
+            <w:vAlign w:val="bottom"/>
+          </w:tcPr>
+          <w:p>
+            <w:pPr>
+              <w:pStyle w:val="Normal"/>
+              <w:widowControl w:val="false"/>
+              <w:jc w:val="center"/>
+              <w:rPr>
+                <w:sz w:val="16"/>
+                <w:szCs w:val="16"/>
+              </w:rPr>
+            </w:pPr>
+            <w:r>
+              <w:rPr>
+                <w:rFonts w:eastAsia="arial" w:ascii="arial" w:hAnsi="arial"/>
+                <w:color w:val="000000"/>
+                <w:sz w:val="16"/>
+                <w:szCs w:val="16"/>
+              </w:rPr>
+              <w:t>Train Light Off</w:t>
+            </w:r>
+          </w:p>
+        </w:tc>
+        <w:tc>
+          <w:tcPr>
+            <w:tcW w:w="1017" w:type="dxa"/>
+            <w:tcBorders>
+              <w:top w:val="single" w:sz="4" w:space="0" w:color="000000"/>
+              <w:left w:val="single" w:sz="4" w:space="0" w:color="000000"/>
+              <w:bottom w:val="single" w:sz="4" w:space="0" w:color="000000"/>
+            </w:tcBorders>
+            <w:vAlign w:val="bottom"/>
+          </w:tcPr>
+          <w:p>
+            <w:pPr>
+              <w:pStyle w:val="Normal"/>
+              <w:widowControl w:val="false"/>
+              <w:jc w:val="center"/>
+              <w:rPr>
+                <w:rFonts w:ascii="arial" w:hAnsi="arial" w:eastAsia="arial"/>
+                <w:color w:val="000000"/>
+                <w:sz w:val="16"/>
+                <w:szCs w:val="16"/>
+              </w:rPr>
+            </w:pPr>
+            <w:r>
+              <w:rPr>
+                <w:rFonts w:eastAsia="arial" w:ascii="arial" w:hAnsi="arial"/>
+                <w:color w:val="000000"/>
+                <w:sz w:val="16"/>
+                <w:szCs w:val="16"/>
+              </w:rPr>
+              <w:t>Signal Light TL</w:t>
+            </w:r>
+          </w:p>
+        </w:tc>
+        <w:tc>
+          <w:tcPr>
+            <w:tcW w:w="1016" w:type="dxa"/>
+            <w:tcBorders>
+              <w:top w:val="single" w:sz="4" w:space="0" w:color="000000"/>
+              <w:left w:val="single" w:sz="4" w:space="0" w:color="000000"/>
+              <w:bottom w:val="single" w:sz="4" w:space="0" w:color="000000"/>
+            </w:tcBorders>
+            <w:vAlign w:val="bottom"/>
+          </w:tcPr>
+          <w:p>
+            <w:pPr>
+              <w:pStyle w:val="Normal"/>
+              <w:widowControl w:val="false"/>
+              <w:jc w:val="center"/>
+              <w:rPr>
+                <w:rFonts w:ascii="arial" w:hAnsi="arial" w:eastAsia="arial"/>
+                <w:color w:val="000000"/>
+                <w:sz w:val="16"/>
+                <w:szCs w:val="16"/>
+              </w:rPr>
+            </w:pPr>
+            <w:r>
+              <w:rPr>
+                <w:rFonts w:eastAsia="arial" w:ascii="arial" w:hAnsi="arial"/>
+                <w:color w:val="000000"/>
+                <w:sz w:val="16"/>
+                <w:szCs w:val="16"/>
+              </w:rPr>
+              <w:t>Exterior Light Dw.</w:t>
+            </w:r>
+          </w:p>
+        </w:tc>
+        <w:tc>
+          <w:tcPr>
+            <w:tcW w:w="1020" w:type="dxa"/>
+            <w:tcBorders>
+              <w:top w:val="single" w:sz="4" w:space="0" w:color="000000"/>
+              <w:left w:val="single" w:sz="4" w:space="0" w:color="000000"/>
+              <w:bottom w:val="single" w:sz="4" w:space="0" w:color="000000"/>
+            </w:tcBorders>
+            <w:vAlign w:val="bottom"/>
+          </w:tcPr>
+          <w:p>
+            <w:pPr>
+              <w:pStyle w:val="Normal"/>
+              <w:widowControl w:val="false"/>
+              <w:jc w:val="center"/>
+              <w:rPr>
+                <w:rFonts w:ascii="arial" w:hAnsi="arial" w:eastAsia="arial"/>
+                <w:color w:val="000000"/>
+                <w:sz w:val="16"/>
+                <w:szCs w:val="16"/>
+              </w:rPr>
+            </w:pPr>
+            <w:r>
+              <w:rPr>
+                <w:rFonts w:eastAsia="arial" w:ascii="arial" w:hAnsi="arial"/>
+                <w:color w:val="000000"/>
+                <w:sz w:val="16"/>
+                <w:szCs w:val="16"/>
+              </w:rPr>
+              <w:t>PZB Mode U</w:t>
+            </w:r>
+          </w:p>
+        </w:tc>
+        <w:tc>
+          <w:tcPr>
+            <w:tcW w:w="1016" w:type="dxa"/>
+            <w:tcBorders>
+              <w:top w:val="single" w:sz="4" w:space="0" w:color="000000"/>
+              <w:left w:val="single" w:sz="4" w:space="0" w:color="000000"/>
+              <w:bottom w:val="single" w:sz="4" w:space="0" w:color="000000"/>
+            </w:tcBorders>
+            <w:vAlign w:val="bottom"/>
+          </w:tcPr>
+          <w:p>
+            <w:pPr>
+              <w:pStyle w:val="Normal"/>
+              <w:widowControl w:val="false"/>
+              <w:spacing w:lineRule="auto" w:line="180"/>
+              <w:jc w:val="center"/>
+              <w:rPr>
+                <w:sz w:val="16"/>
+                <w:szCs w:val="16"/>
+              </w:rPr>
+            </w:pPr>
+            <w:r>
+              <w:rPr>
+                <w:rFonts w:eastAsia="arial" w:ascii="arial" w:hAnsi="arial"/>
+                <w:color w:val="000000"/>
+                <w:sz w:val="16"/>
+                <w:szCs w:val="16"/>
+              </w:rPr>
+              <w:t>Brake Charge</w:t>
+            </w:r>
+          </w:p>
+        </w:tc>
+        <w:tc>
+          <w:tcPr>
+            <w:tcW w:w="1016" w:type="dxa"/>
+            <w:tcBorders>
+              <w:top w:val="single" w:sz="4" w:space="0" w:color="000000"/>
+              <w:left w:val="single" w:sz="4" w:space="0" w:color="000000"/>
+              <w:bottom w:val="single" w:sz="4" w:space="0" w:color="000000"/>
+            </w:tcBorders>
+            <w:vAlign w:val="bottom"/>
+          </w:tcPr>
+          <w:p>
+            <w:pPr>
+              <w:pStyle w:val="Normal"/>
+              <w:widowControl w:val="false"/>
+              <w:jc w:val="center"/>
+              <w:rPr>
+                <w:color w:val="000000"/>
+                <w:sz w:val="16"/>
+                <w:szCs w:val="16"/>
+              </w:rPr>
+            </w:pPr>
+            <w:r>
+              <w:rPr>
+                <w:rFonts w:eastAsia="arial" w:ascii="arial" w:hAnsi="arial"/>
+                <w:color w:val="000000"/>
+                <w:sz w:val="16"/>
+                <w:szCs w:val="16"/>
+              </w:rPr>
+              <w:t>Parking Brake Off</w:t>
+            </w:r>
+          </w:p>
+        </w:tc>
+        <w:tc>
+          <w:tcPr>
+            <w:tcW w:w="1016" w:type="dxa"/>
+            <w:tcBorders>
+              <w:top w:val="single" w:sz="4" w:space="0" w:color="000000"/>
+              <w:left w:val="single" w:sz="4" w:space="0" w:color="000000"/>
+              <w:bottom w:val="single" w:sz="4" w:space="0" w:color="000000"/>
+            </w:tcBorders>
+            <w:vAlign w:val="bottom"/>
+          </w:tcPr>
+          <w:p>
+            <w:pPr>
+              <w:pStyle w:val="Normal"/>
+              <w:widowControl w:val="false"/>
+              <w:spacing w:lineRule="auto" w:line="180"/>
+              <w:jc w:val="center"/>
+              <w:rPr>
+                <w:color w:val="000000"/>
+                <w:sz w:val="16"/>
+                <w:szCs w:val="16"/>
+              </w:rPr>
+            </w:pPr>
+            <w:r>
+              <w:rPr>
+                <w:rFonts w:eastAsia="arial" w:ascii="arial" w:hAnsi="arial"/>
+                <w:color w:val="000000"/>
+                <w:sz w:val="16"/>
+                <w:szCs w:val="16"/>
+              </w:rPr>
+              <w:t>Exterior</w:t>
+            </w:r>
+          </w:p>
+          <w:p>
+            <w:pPr>
+              <w:pStyle w:val="Normal"/>
+              <w:widowControl w:val="false"/>
+              <w:spacing w:lineRule="auto" w:line="180"/>
+              <w:jc w:val="center"/>
+              <w:rPr>
+                <w:color w:val="000000"/>
+                <w:sz w:val="16"/>
+                <w:szCs w:val="16"/>
+              </w:rPr>
+            </w:pPr>
+            <w:r>
+              <w:rPr>
+                <w:rFonts w:eastAsia="arial" w:ascii="arial" w:hAnsi="arial"/>
+                <w:color w:val="000000"/>
+                <w:sz w:val="16"/>
+                <w:szCs w:val="16"/>
+              </w:rPr>
+              <w:t>Camera</w:t>
+            </w:r>
+          </w:p>
+        </w:tc>
+        <w:tc>
+          <w:tcPr>
+            <w:tcW w:w="1029" w:type="dxa"/>
+            <w:tcBorders>
+              <w:top w:val="single" w:sz="4" w:space="0" w:color="000000"/>
+              <w:left w:val="single" w:sz="4" w:space="0" w:color="000000"/>
+              <w:bottom w:val="single" w:sz="4" w:space="0" w:color="000000"/>
+              <w:right w:val="single" w:sz="4" w:space="0" w:color="000000"/>
+            </w:tcBorders>
+            <w:vAlign w:val="bottom"/>
+          </w:tcPr>
+          <w:p>
+            <w:pPr>
+              <w:pStyle w:val="Normal"/>
+              <w:widowControl w:val="false"/>
+              <w:spacing w:lineRule="auto" w:line="180"/>
+              <w:jc w:val="center"/>
+              <w:rPr>
+                <w:color w:val="000000"/>
+                <w:sz w:val="16"/>
+                <w:szCs w:val="16"/>
+              </w:rPr>
+            </w:pPr>
+            <w:r>
+              <w:rPr>
+                <w:rFonts w:eastAsia="arial" w:ascii="arial" w:hAnsi="arial"/>
+                <w:color w:val="000000"/>
+                <w:sz w:val="16"/>
+                <w:szCs w:val="16"/>
+              </w:rPr>
+              <w:t>Prev</w:t>
+            </w:r>
+          </w:p>
+          <w:p>
+            <w:pPr>
+              <w:pStyle w:val="Normal"/>
+              <w:widowControl w:val="false"/>
+              <w:spacing w:lineRule="auto" w:line="180"/>
+              <w:jc w:val="center"/>
+              <w:rPr>
+                <w:color w:val="000000"/>
                 <w:sz w:val="16"/>
                 <w:szCs w:val="16"/>
               </w:rPr>
@@ -3505,12 +5889,12 @@
       <w:rFonts w:ascii="Symbol" w:hAnsi="Symbol" w:cs="Symbol"/>
     </w:rPr>
   </w:style>
-  <w:style w:type="character" w:styleId="user" w:customStyle="1">
-    <w:name w:val="번호 매기기 기호 (user)"/>
+  <w:style w:type="character" w:styleId="Style5" w:customStyle="1">
+    <w:name w:val="번호 매기기 기호"/>
     <w:qFormat/>
     <w:rPr/>
   </w:style>
-  <w:style w:type="paragraph" w:styleId="Style5">
+  <w:style w:type="paragraph" w:styleId="Style6">
     <w:name w:val="제목"/>
     <w:basedOn w:val="Normal"/>
     <w:next w:val="BodyText"/>
@@ -3520,7 +5904,7 @@
       <w:spacing w:before="240" w:after="120"/>
     </w:pPr>
     <w:rPr>
-      <w:rFonts w:ascii="Liberation Sans" w:hAnsi="Liberation Sans" w:eastAsia="Noto Sans CJK KR" w:cs="Lohit Devanagari"/>
+      <w:rFonts w:ascii="Liberation Sans" w:hAnsi="Liberation Sans" w:eastAsia="나눔고딕" w:cs="Arial"/>
       <w:sz w:val="28"/>
       <w:szCs w:val="28"/>
     </w:rPr>
@@ -3557,7 +5941,7 @@
       <w:szCs w:val="24"/>
     </w:rPr>
   </w:style>
-  <w:style w:type="paragraph" w:styleId="Style6" w:customStyle="1">
+  <w:style w:type="paragraph" w:styleId="Style7">
     <w:name w:val="색인"/>
     <w:basedOn w:val="Normal"/>
     <w:qFormat/>
@@ -3565,10 +5949,11 @@
       <w:suppressLineNumbers/>
     </w:pPr>
     <w:rPr>
-      <w:rFonts w:cs="Lohit Devanagari"/>
+      <w:rFonts w:cs="Arial"/>
+      <w:sz w:val="24"/>
     </w:rPr>
   </w:style>
-  <w:style w:type="paragraph" w:styleId="user1">
+  <w:style w:type="paragraph" w:styleId="user">
     <w:name w:val="제목 (user)"/>
     <w:basedOn w:val="Normal"/>
     <w:next w:val="BodyText"/>
@@ -3578,12 +5963,12 @@
       <w:spacing w:before="240" w:after="120"/>
     </w:pPr>
     <w:rPr>
-      <w:rFonts w:ascii="Liberation Sans" w:hAnsi="Liberation Sans" w:eastAsia="나눔고딕" w:cs="Arial"/>
+      <w:rFonts w:ascii="Liberation Sans" w:hAnsi="Liberation Sans" w:eastAsia="Noto Sans CJK KR" w:cs="Lohit Devanagari"/>
       <w:sz w:val="28"/>
       <w:szCs w:val="28"/>
     </w:rPr>
   </w:style>
-  <w:style w:type="paragraph" w:styleId="user2">
+  <w:style w:type="paragraph" w:styleId="user1" w:customStyle="1">
     <w:name w:val="색인 (user)"/>
     <w:basedOn w:val="Normal"/>
     <w:qFormat/>
@@ -3591,8 +5976,7 @@
       <w:suppressLineNumbers/>
     </w:pPr>
     <w:rPr>
-      <w:rFonts w:cs="Arial"/>
-      <w:sz w:val="24"/>
+      <w:rFonts w:cs="Lohit Devanagari"/>
     </w:rPr>
   </w:style>
   <w:style w:type="paragraph" w:styleId="Title">
@@ -4274,8 +6658,8 @@
       <w:szCs w:val="24"/>
     </w:rPr>
   </w:style>
-  <w:style w:type="paragraph" w:styleId="Style7" w:customStyle="1">
-    <w:name w:val="표 내용"/>
+  <w:style w:type="paragraph" w:styleId="user2" w:customStyle="1">
+    <w:name w:val="표 내용 (user)"/>
     <w:basedOn w:val="Normal"/>
     <w:qFormat/>
     <w:pPr>
@@ -4283,9 +6667,9 @@
     </w:pPr>
     <w:rPr/>
   </w:style>
-  <w:style w:type="paragraph" w:styleId="Style8" w:customStyle="1">
-    <w:name w:val="표제목"/>
-    <w:basedOn w:val="Style7"/>
+  <w:style w:type="paragraph" w:styleId="user3" w:customStyle="1">
+    <w:name w:val="표제목 (user)"/>
+    <w:basedOn w:val="user2"/>
     <w:qFormat/>
     <w:pPr>
       <w:jc w:val="center"/>

</xml_diff>

<commit_message>
Add TGV Duplex 200
</commit_message>
<xml_diff>
--- a/raildriver-Other-Remapped.docx
+++ b/raildriver-Other-Remapped.docx
@@ -4826,25 +4826,7 @@
           <w:sz w:val="16"/>
           <w:szCs w:val="16"/>
         </w:rPr>
-        <w:t xml:space="preserve">    </w:t>
-      </w:r>
-      <w:r>
-        <w:rPr>
-          <w:rFonts w:eastAsia="arial" w:ascii="arial" w:hAnsi="arial"/>
-          <w:color w:val="000000"/>
-          <w:sz w:val="16"/>
-          <w:szCs w:val="16"/>
-        </w:rPr>
-        <w:t>OBB 4024</w:t>
-      </w:r>
-      <w:r>
-        <w:rPr>
-          <w:rFonts w:eastAsia="arial" w:ascii="arial" w:hAnsi="arial"/>
-          <w:color w:val="000000"/>
-          <w:sz w:val="16"/>
-          <w:szCs w:val="16"/>
-        </w:rPr>
-        <w:t>-1</w:t>
+        <w:t xml:space="preserve">    OBB 4024-1</w:t>
       </w:r>
     </w:p>
     <w:tbl>
@@ -5477,25 +5459,7 @@
           <w:szCs w:val="16"/>
         </w:rPr>
         <w:tab/>
-        <w:t xml:space="preserve">           </w:t>
-      </w:r>
-      <w:r>
-        <w:rPr>
-          <w:rFonts w:eastAsia="arial" w:ascii="arial" w:hAnsi="arial"/>
-          <w:color w:val="000000"/>
-          <w:sz w:val="16"/>
-          <w:szCs w:val="16"/>
-        </w:rPr>
-        <w:t>OBB 4024</w:t>
-      </w:r>
-      <w:r>
-        <w:rPr>
-          <w:rFonts w:eastAsia="arial" w:ascii="arial" w:hAnsi="arial"/>
-          <w:color w:val="000000"/>
-          <w:sz w:val="16"/>
-          <w:szCs w:val="16"/>
-        </w:rPr>
-        <w:t>-2</w:t>
+        <w:t xml:space="preserve">           OBB 4024-2</w:t>
       </w:r>
     </w:p>
     <w:tbl>
@@ -6119,6 +6083,1362 @@
       <w:pPr>
         <w:pStyle w:val="Normal"/>
         <w:bidi w:val="0"/>
+        <w:rPr>
+          <w:color w:val="000000"/>
+          <w:sz w:val="16"/>
+          <w:szCs w:val="16"/>
+        </w:rPr>
+      </w:pPr>
+      <w:r>
+        <w:rPr>
+          <w:color w:val="000000"/>
+          <w:sz w:val="16"/>
+          <w:szCs w:val="16"/>
+        </w:rPr>
+      </w:r>
+    </w:p>
+    <w:p>
+      <w:pPr>
+        <w:pStyle w:val="Normal"/>
+        <w:rPr>
+          <w:color w:val="000000"/>
+          <w:sz w:val="16"/>
+          <w:szCs w:val="16"/>
+        </w:rPr>
+      </w:pPr>
+      <w:r>
+        <w:rPr>
+          <w:color w:val="000000"/>
+          <w:sz w:val="16"/>
+          <w:szCs w:val="16"/>
+        </w:rPr>
+        <w:tab/>
+        <w:t xml:space="preserve">       </w:t>
+      </w:r>
+      <w:r>
+        <w:rPr>
+          <w:rFonts w:eastAsia="arial" w:ascii="arial" w:hAnsi="arial"/>
+          <w:color w:val="000000"/>
+          <w:sz w:val="16"/>
+          <w:szCs w:val="16"/>
+        </w:rPr>
+        <w:t xml:space="preserve">    TGV Duplex 200-1</w:t>
+      </w:r>
+    </w:p>
+    <w:tbl>
+      <w:tblPr>
+        <w:tblW w:w="14248" w:type="dxa"/>
+        <w:jc w:val="left"/>
+        <w:tblInd w:w="-5" w:type="dxa"/>
+        <w:tblLayout w:type="fixed"/>
+        <w:tblCellMar>
+          <w:top w:w="0" w:type="dxa"/>
+          <w:left w:w="108" w:type="dxa"/>
+          <w:bottom w:w="0" w:type="dxa"/>
+          <w:right w:w="108" w:type="dxa"/>
+        </w:tblCellMar>
+        <w:tblLook w:firstRow="1" w:noVBand="1" w:lastRow="0" w:firstColumn="1" w:lastColumn="0" w:noHBand="0" w:val="04a0"/>
+      </w:tblPr>
+      <w:tblGrid>
+        <w:gridCol w:w="1017"/>
+        <w:gridCol w:w="1019"/>
+        <w:gridCol w:w="1014"/>
+        <w:gridCol w:w="1016"/>
+        <w:gridCol w:w="1020"/>
+        <w:gridCol w:w="1016"/>
+        <w:gridCol w:w="1016"/>
+        <w:gridCol w:w="1017"/>
+        <w:gridCol w:w="1016"/>
+        <w:gridCol w:w="1020"/>
+        <w:gridCol w:w="1016"/>
+        <w:gridCol w:w="1016"/>
+        <w:gridCol w:w="1016"/>
+        <w:gridCol w:w="1029"/>
+      </w:tblGrid>
+      <w:tr>
+        <w:trPr>
+          <w:trHeight w:val="440" w:hRule="exact"/>
+          <w:cantSplit w:val="true"/>
+        </w:trPr>
+        <w:tc>
+          <w:tcPr>
+            <w:tcW w:w="1017" w:type="dxa"/>
+            <w:tcBorders>
+              <w:top w:val="single" w:sz="4" w:space="0" w:color="000000"/>
+              <w:left w:val="single" w:sz="4" w:space="0" w:color="000000"/>
+              <w:bottom w:val="single" w:sz="4" w:space="0" w:color="000000"/>
+            </w:tcBorders>
+            <w:vAlign w:val="bottom"/>
+          </w:tcPr>
+          <w:p>
+            <w:pPr>
+              <w:pStyle w:val="Normal"/>
+              <w:widowControl w:val="false"/>
+              <w:spacing w:lineRule="auto" w:line="180" w:before="0" w:after="60"/>
+              <w:jc w:val="center"/>
+              <w:rPr>
+                <w:color w:val="000000"/>
+                <w:sz w:val="16"/>
+                <w:szCs w:val="16"/>
+              </w:rPr>
+            </w:pPr>
+            <w:r>
+              <w:rPr>
+                <w:rFonts w:eastAsia="arial" w:ascii="arial" w:hAnsi="arial"/>
+                <w:b/>
+                <w:color w:val="000000"/>
+                <w:sz w:val="16"/>
+                <w:szCs w:val="16"/>
+              </w:rPr>
+              <w:t>Pause</w:t>
+            </w:r>
+          </w:p>
+        </w:tc>
+        <w:tc>
+          <w:tcPr>
+            <w:tcW w:w="1019" w:type="dxa"/>
+            <w:tcBorders>
+              <w:top w:val="single" w:sz="4" w:space="0" w:color="000000"/>
+              <w:left w:val="single" w:sz="4" w:space="0" w:color="000000"/>
+              <w:bottom w:val="single" w:sz="4" w:space="0" w:color="000000"/>
+            </w:tcBorders>
+            <w:vAlign w:val="bottom"/>
+          </w:tcPr>
+          <w:p>
+            <w:pPr>
+              <w:pStyle w:val="Normal"/>
+              <w:widowControl w:val="false"/>
+              <w:spacing w:lineRule="auto" w:line="180"/>
+              <w:jc w:val="center"/>
+              <w:rPr>
+                <w:color w:val="000000"/>
+                <w:sz w:val="16"/>
+                <w:szCs w:val="16"/>
+              </w:rPr>
+            </w:pPr>
+            <w:r>
+              <w:rPr>
+                <w:rFonts w:eastAsia="arial" w:ascii="arial" w:hAnsi="arial"/>
+                <w:color w:val="000000"/>
+                <w:sz w:val="16"/>
+                <w:szCs w:val="16"/>
+              </w:rPr>
+              <w:t>Master</w:t>
+            </w:r>
+          </w:p>
+          <w:p>
+            <w:pPr>
+              <w:pStyle w:val="Normal"/>
+              <w:widowControl w:val="false"/>
+              <w:spacing w:lineRule="auto" w:line="180"/>
+              <w:jc w:val="center"/>
+              <w:rPr>
+                <w:color w:val="000000"/>
+                <w:sz w:val="16"/>
+                <w:szCs w:val="16"/>
+              </w:rPr>
+            </w:pPr>
+            <w:r>
+              <w:rPr>
+                <w:rFonts w:eastAsia="arial" w:ascii="arial" w:hAnsi="arial"/>
+                <w:color w:val="000000"/>
+                <w:sz w:val="16"/>
+                <w:szCs w:val="16"/>
+              </w:rPr>
+              <w:t>Switch</w:t>
+            </w:r>
+          </w:p>
+        </w:tc>
+        <w:tc>
+          <w:tcPr>
+            <w:tcW w:w="1014" w:type="dxa"/>
+            <w:tcBorders>
+              <w:top w:val="single" w:sz="4" w:space="0" w:color="000000"/>
+              <w:left w:val="single" w:sz="4" w:space="0" w:color="000000"/>
+              <w:bottom w:val="single" w:sz="4" w:space="0" w:color="000000"/>
+            </w:tcBorders>
+            <w:vAlign w:val="bottom"/>
+          </w:tcPr>
+          <w:p>
+            <w:pPr>
+              <w:pStyle w:val="Normal"/>
+              <w:widowControl w:val="false"/>
+              <w:spacing w:lineRule="auto" w:line="180"/>
+              <w:jc w:val="center"/>
+              <w:rPr>
+                <w:color w:val="000000"/>
+                <w:sz w:val="16"/>
+                <w:szCs w:val="16"/>
+              </w:rPr>
+            </w:pPr>
+            <w:r>
+              <w:rPr>
+                <w:rFonts w:eastAsia="arial" w:ascii="arial" w:hAnsi="arial"/>
+                <w:color w:val="000000"/>
+                <w:sz w:val="16"/>
+                <w:szCs w:val="16"/>
+              </w:rPr>
+              <w:t>MCB</w:t>
+            </w:r>
+          </w:p>
+        </w:tc>
+        <w:tc>
+          <w:tcPr>
+            <w:tcW w:w="1016" w:type="dxa"/>
+            <w:tcBorders>
+              <w:top w:val="single" w:sz="4" w:space="0" w:color="000000"/>
+              <w:left w:val="single" w:sz="4" w:space="0" w:color="000000"/>
+              <w:bottom w:val="single" w:sz="4" w:space="0" w:color="000000"/>
+            </w:tcBorders>
+            <w:vAlign w:val="bottom"/>
+          </w:tcPr>
+          <w:p>
+            <w:pPr>
+              <w:pStyle w:val="Normal"/>
+              <w:widowControl w:val="false"/>
+              <w:spacing w:lineRule="auto" w:line="180"/>
+              <w:jc w:val="center"/>
+              <w:rPr>
+                <w:color w:val="000000"/>
+                <w:sz w:val="16"/>
+                <w:szCs w:val="16"/>
+              </w:rPr>
+            </w:pPr>
+            <w:r>
+              <w:rPr>
+                <w:rFonts w:eastAsia="arial" w:ascii="arial" w:hAnsi="arial"/>
+                <w:color w:val="000000"/>
+                <w:sz w:val="16"/>
+                <w:szCs w:val="16"/>
+              </w:rPr>
+              <w:t>TVM/KVB</w:t>
+            </w:r>
+          </w:p>
+        </w:tc>
+        <w:tc>
+          <w:tcPr>
+            <w:tcW w:w="1020" w:type="dxa"/>
+            <w:tcBorders>
+              <w:top w:val="single" w:sz="4" w:space="0" w:color="000000"/>
+              <w:left w:val="single" w:sz="4" w:space="0" w:color="000000"/>
+              <w:bottom w:val="single" w:sz="4" w:space="0" w:color="000000"/>
+            </w:tcBorders>
+            <w:vAlign w:val="bottom"/>
+          </w:tcPr>
+          <w:p>
+            <w:pPr>
+              <w:pStyle w:val="Normal"/>
+              <w:widowControl w:val="false"/>
+              <w:spacing w:lineRule="auto" w:line="180"/>
+              <w:jc w:val="center"/>
+              <w:rPr>
+                <w:color w:val="000000"/>
+                <w:sz w:val="16"/>
+                <w:szCs w:val="16"/>
+              </w:rPr>
+            </w:pPr>
+            <w:r>
+              <w:rPr>
+                <w:rFonts w:eastAsia="arial" w:ascii="arial" w:hAnsi="arial"/>
+                <w:color w:val="000000"/>
+                <w:sz w:val="16"/>
+                <w:szCs w:val="16"/>
+              </w:rPr>
+              <w:t>Panto.</w:t>
+            </w:r>
+          </w:p>
+          <w:p>
+            <w:pPr>
+              <w:pStyle w:val="Normal"/>
+              <w:widowControl w:val="false"/>
+              <w:spacing w:lineRule="auto" w:line="180"/>
+              <w:jc w:val="center"/>
+              <w:rPr>
+                <w:color w:val="000000"/>
+                <w:sz w:val="16"/>
+                <w:szCs w:val="16"/>
+              </w:rPr>
+            </w:pPr>
+            <w:r>
+              <w:rPr>
+                <w:rFonts w:eastAsia="arial" w:ascii="arial" w:hAnsi="arial"/>
+                <w:color w:val="000000"/>
+                <w:sz w:val="16"/>
+                <w:szCs w:val="16"/>
+              </w:rPr>
+              <w:t>Raise</w:t>
+            </w:r>
+          </w:p>
+        </w:tc>
+        <w:tc>
+          <w:tcPr>
+            <w:tcW w:w="1016" w:type="dxa"/>
+            <w:tcBorders>
+              <w:top w:val="single" w:sz="4" w:space="0" w:color="000000"/>
+              <w:left w:val="single" w:sz="4" w:space="0" w:color="000000"/>
+              <w:bottom w:val="single" w:sz="4" w:space="0" w:color="000000"/>
+            </w:tcBorders>
+            <w:vAlign w:val="bottom"/>
+          </w:tcPr>
+          <w:p>
+            <w:pPr>
+              <w:pStyle w:val="Normal"/>
+              <w:widowControl w:val="false"/>
+              <w:jc w:val="center"/>
+              <w:rPr>
+                <w:rFonts w:ascii="arial" w:hAnsi="arial" w:eastAsia="arial"/>
+                <w:color w:val="000000"/>
+                <w:sz w:val="16"/>
+                <w:szCs w:val="16"/>
+              </w:rPr>
+            </w:pPr>
+            <w:r>
+              <w:rPr>
+                <w:rFonts w:eastAsia="arial" w:ascii="arial" w:hAnsi="arial"/>
+                <w:color w:val="000000"/>
+                <w:sz w:val="16"/>
+                <w:szCs w:val="16"/>
+              </w:rPr>
+              <w:t>Brake</w:t>
+            </w:r>
+          </w:p>
+          <w:p>
+            <w:pPr>
+              <w:pStyle w:val="Normal"/>
+              <w:widowControl w:val="false"/>
+              <w:jc w:val="center"/>
+              <w:rPr>
+                <w:rFonts w:ascii="arial" w:hAnsi="arial" w:eastAsia="arial"/>
+                <w:color w:val="000000"/>
+                <w:sz w:val="16"/>
+                <w:szCs w:val="16"/>
+              </w:rPr>
+            </w:pPr>
+            <w:r>
+              <w:rPr>
+                <w:rFonts w:eastAsia="arial" w:ascii="arial" w:hAnsi="arial"/>
+                <w:color w:val="000000"/>
+                <w:sz w:val="16"/>
+                <w:szCs w:val="16"/>
+              </w:rPr>
+              <w:t>Charge</w:t>
+            </w:r>
+          </w:p>
+        </w:tc>
+        <w:tc>
+          <w:tcPr>
+            <w:tcW w:w="1016" w:type="dxa"/>
+            <w:tcBorders>
+              <w:top w:val="single" w:sz="4" w:space="0" w:color="000000"/>
+              <w:left w:val="single" w:sz="4" w:space="0" w:color="000000"/>
+              <w:bottom w:val="single" w:sz="4" w:space="0" w:color="000000"/>
+            </w:tcBorders>
+            <w:vAlign w:val="bottom"/>
+          </w:tcPr>
+          <w:p>
+            <w:pPr>
+              <w:pStyle w:val="Normal"/>
+              <w:widowControl w:val="false"/>
+              <w:jc w:val="center"/>
+              <w:rPr>
+                <w:color w:val="000000"/>
+                <w:sz w:val="16"/>
+                <w:szCs w:val="16"/>
+              </w:rPr>
+            </w:pPr>
+            <w:r>
+              <w:rPr>
+                <w:rFonts w:eastAsia="arial" w:ascii="arial" w:hAnsi="arial"/>
+                <w:color w:val="000000"/>
+                <w:sz w:val="16"/>
+                <w:szCs w:val="16"/>
+              </w:rPr>
+              <w:t xml:space="preserve">Panto. Mode </w:t>
+            </w:r>
+            <w:r>
+              <w:rPr>
+                <w:rFonts w:eastAsia="arial" w:ascii="arial" w:hAnsi="arial"/>
+                <w:color w:val="000000"/>
+                <w:sz w:val="16"/>
+                <w:szCs w:val="16"/>
+              </w:rPr>
+              <w:t>LGV</w:t>
+            </w:r>
+          </w:p>
+        </w:tc>
+        <w:tc>
+          <w:tcPr>
+            <w:tcW w:w="1017" w:type="dxa"/>
+            <w:tcBorders>
+              <w:top w:val="single" w:sz="4" w:space="0" w:color="000000"/>
+              <w:left w:val="single" w:sz="4" w:space="0" w:color="000000"/>
+              <w:bottom w:val="single" w:sz="4" w:space="0" w:color="000000"/>
+            </w:tcBorders>
+            <w:vAlign w:val="bottom"/>
+          </w:tcPr>
+          <w:p>
+            <w:pPr>
+              <w:pStyle w:val="Normal"/>
+              <w:widowControl w:val="false"/>
+              <w:spacing w:lineRule="auto" w:line="180"/>
+              <w:jc w:val="center"/>
+              <w:rPr>
+                <w:color w:val="000000"/>
+                <w:sz w:val="16"/>
+                <w:szCs w:val="16"/>
+              </w:rPr>
+            </w:pPr>
+            <w:r>
+              <w:rPr>
+                <w:color w:val="000000"/>
+                <w:sz w:val="16"/>
+                <w:szCs w:val="16"/>
+              </w:rPr>
+              <w:t xml:space="preserve">KVB </w:t>
+            </w:r>
+            <w:r>
+              <w:rPr>
+                <w:color w:val="000000"/>
+                <w:sz w:val="16"/>
+                <w:szCs w:val="16"/>
+              </w:rPr>
+              <w:t>Pass</w:t>
+            </w:r>
+          </w:p>
+          <w:p>
+            <w:pPr>
+              <w:pStyle w:val="Normal"/>
+              <w:widowControl w:val="false"/>
+              <w:spacing w:lineRule="auto" w:line="180"/>
+              <w:jc w:val="center"/>
+              <w:rPr>
+                <w:color w:val="000000"/>
+                <w:sz w:val="16"/>
+                <w:szCs w:val="16"/>
+              </w:rPr>
+            </w:pPr>
+            <w:r>
+              <w:rPr>
+                <w:rFonts w:eastAsia="arial" w:ascii="arial" w:hAnsi="arial"/>
+                <w:color w:val="000000"/>
+                <w:sz w:val="16"/>
+                <w:szCs w:val="16"/>
+              </w:rPr>
+              <w:t>Danger</w:t>
+            </w:r>
+          </w:p>
+        </w:tc>
+        <w:tc>
+          <w:tcPr>
+            <w:tcW w:w="1016" w:type="dxa"/>
+            <w:tcBorders>
+              <w:top w:val="single" w:sz="4" w:space="0" w:color="000000"/>
+              <w:left w:val="single" w:sz="4" w:space="0" w:color="000000"/>
+              <w:bottom w:val="single" w:sz="4" w:space="0" w:color="000000"/>
+            </w:tcBorders>
+            <w:vAlign w:val="bottom"/>
+          </w:tcPr>
+          <w:p>
+            <w:pPr>
+              <w:pStyle w:val="Normal"/>
+              <w:widowControl w:val="false"/>
+              <w:jc w:val="center"/>
+              <w:rPr>
+                <w:rFonts w:ascii="arial" w:hAnsi="arial" w:eastAsia="arial"/>
+                <w:color w:val="000000"/>
+                <w:sz w:val="16"/>
+                <w:szCs w:val="16"/>
+              </w:rPr>
+            </w:pPr>
+            <w:r>
+              <w:rPr>
+                <w:rFonts w:eastAsia="arial" w:ascii="arial" w:hAnsi="arial"/>
+                <w:color w:val="000000"/>
+                <w:sz w:val="16"/>
+                <w:szCs w:val="16"/>
+              </w:rPr>
+              <w:t>Driving Mode Up</w:t>
+            </w:r>
+          </w:p>
+        </w:tc>
+        <w:tc>
+          <w:tcPr>
+            <w:tcW w:w="1020" w:type="dxa"/>
+            <w:tcBorders>
+              <w:top w:val="single" w:sz="4" w:space="0" w:color="000000"/>
+              <w:left w:val="single" w:sz="4" w:space="0" w:color="000000"/>
+              <w:bottom w:val="single" w:sz="4" w:space="0" w:color="000000"/>
+            </w:tcBorders>
+            <w:vAlign w:val="bottom"/>
+          </w:tcPr>
+          <w:p>
+            <w:pPr>
+              <w:pStyle w:val="Normal"/>
+              <w:widowControl w:val="false"/>
+              <w:jc w:val="center"/>
+              <w:rPr>
+                <w:rFonts w:ascii="arial" w:hAnsi="arial" w:eastAsia="arial"/>
+                <w:color w:val="000000"/>
+                <w:sz w:val="16"/>
+                <w:szCs w:val="16"/>
+              </w:rPr>
+            </w:pPr>
+            <w:r>
+              <w:rPr>
+                <w:rFonts w:eastAsia="arial" w:ascii="arial" w:hAnsi="arial"/>
+                <w:color w:val="000000"/>
+                <w:sz w:val="16"/>
+                <w:szCs w:val="16"/>
+              </w:rPr>
+              <w:t>Gauge</w:t>
+            </w:r>
+          </w:p>
+          <w:p>
+            <w:pPr>
+              <w:pStyle w:val="Normal"/>
+              <w:widowControl w:val="false"/>
+              <w:jc w:val="center"/>
+              <w:rPr>
+                <w:rFonts w:ascii="arial" w:hAnsi="arial" w:eastAsia="arial"/>
+                <w:color w:val="000000"/>
+                <w:sz w:val="16"/>
+                <w:szCs w:val="16"/>
+              </w:rPr>
+            </w:pPr>
+            <w:r>
+              <w:rPr>
+                <w:rFonts w:eastAsia="arial" w:ascii="arial" w:hAnsi="arial"/>
+                <w:color w:val="000000"/>
+                <w:sz w:val="16"/>
+                <w:szCs w:val="16"/>
+              </w:rPr>
+              <w:t>Light</w:t>
+            </w:r>
+          </w:p>
+        </w:tc>
+        <w:tc>
+          <w:tcPr>
+            <w:tcW w:w="1016" w:type="dxa"/>
+            <w:tcBorders>
+              <w:top w:val="single" w:sz="4" w:space="0" w:color="000000"/>
+              <w:left w:val="single" w:sz="4" w:space="0" w:color="000000"/>
+              <w:bottom w:val="single" w:sz="4" w:space="0" w:color="000000"/>
+            </w:tcBorders>
+            <w:vAlign w:val="bottom"/>
+          </w:tcPr>
+          <w:p>
+            <w:pPr>
+              <w:pStyle w:val="Normal"/>
+              <w:widowControl w:val="false"/>
+              <w:jc w:val="center"/>
+              <w:rPr>
+                <w:rFonts w:ascii="arial" w:hAnsi="arial" w:eastAsia="arial"/>
+                <w:color w:val="000000"/>
+                <w:sz w:val="16"/>
+                <w:szCs w:val="16"/>
+              </w:rPr>
+            </w:pPr>
+            <w:r>
+              <w:rPr>
+                <w:rFonts w:eastAsia="arial" w:ascii="arial" w:hAnsi="arial"/>
+                <w:color w:val="000000"/>
+                <w:sz w:val="16"/>
+                <w:szCs w:val="16"/>
+              </w:rPr>
+              <w:t>Desk</w:t>
+            </w:r>
+          </w:p>
+          <w:p>
+            <w:pPr>
+              <w:pStyle w:val="Normal"/>
+              <w:widowControl w:val="false"/>
+              <w:jc w:val="center"/>
+              <w:rPr>
+                <w:rFonts w:ascii="arial" w:hAnsi="arial" w:eastAsia="arial"/>
+                <w:color w:val="000000"/>
+                <w:sz w:val="16"/>
+                <w:szCs w:val="16"/>
+              </w:rPr>
+            </w:pPr>
+            <w:r>
+              <w:rPr>
+                <w:rFonts w:eastAsia="arial" w:ascii="arial" w:hAnsi="arial"/>
+                <w:color w:val="000000"/>
+                <w:sz w:val="16"/>
+                <w:szCs w:val="16"/>
+              </w:rPr>
+              <w:t>Light</w:t>
+            </w:r>
+          </w:p>
+        </w:tc>
+        <w:tc>
+          <w:tcPr>
+            <w:tcW w:w="1016" w:type="dxa"/>
+            <w:tcBorders>
+              <w:top w:val="single" w:sz="4" w:space="0" w:color="000000"/>
+              <w:left w:val="single" w:sz="4" w:space="0" w:color="000000"/>
+              <w:bottom w:val="single" w:sz="4" w:space="0" w:color="000000"/>
+            </w:tcBorders>
+            <w:vAlign w:val="bottom"/>
+          </w:tcPr>
+          <w:p>
+            <w:pPr>
+              <w:pStyle w:val="Normal"/>
+              <w:widowControl w:val="false"/>
+              <w:spacing w:lineRule="auto" w:line="180"/>
+              <w:jc w:val="center"/>
+              <w:rPr>
+                <w:sz w:val="16"/>
+                <w:szCs w:val="16"/>
+              </w:rPr>
+            </w:pPr>
+            <w:r>
+              <w:rPr/>
+            </w:r>
+          </w:p>
+        </w:tc>
+        <w:tc>
+          <w:tcPr>
+            <w:tcW w:w="1016" w:type="dxa"/>
+            <w:tcBorders>
+              <w:top w:val="single" w:sz="4" w:space="0" w:color="000000"/>
+              <w:left w:val="single" w:sz="4" w:space="0" w:color="000000"/>
+              <w:bottom w:val="single" w:sz="4" w:space="0" w:color="000000"/>
+            </w:tcBorders>
+            <w:vAlign w:val="bottom"/>
+          </w:tcPr>
+          <w:p>
+            <w:pPr>
+              <w:pStyle w:val="Normal"/>
+              <w:widowControl w:val="false"/>
+              <w:spacing w:lineRule="auto" w:line="180"/>
+              <w:jc w:val="center"/>
+              <w:rPr>
+                <w:color w:val="000000"/>
+                <w:sz w:val="16"/>
+                <w:szCs w:val="16"/>
+              </w:rPr>
+            </w:pPr>
+            <w:r>
+              <w:rPr>
+                <w:rFonts w:eastAsia="arial" w:ascii="arial" w:hAnsi="arial"/>
+                <w:color w:val="000000"/>
+                <w:sz w:val="16"/>
+                <w:szCs w:val="16"/>
+              </w:rPr>
+              <w:t>1P Cam</w:t>
+            </w:r>
+          </w:p>
+        </w:tc>
+        <w:tc>
+          <w:tcPr>
+            <w:tcW w:w="1029" w:type="dxa"/>
+            <w:tcBorders>
+              <w:top w:val="single" w:sz="4" w:space="0" w:color="000000"/>
+              <w:left w:val="single" w:sz="4" w:space="0" w:color="000000"/>
+              <w:bottom w:val="single" w:sz="4" w:space="0" w:color="000000"/>
+              <w:right w:val="single" w:sz="4" w:space="0" w:color="000000"/>
+            </w:tcBorders>
+            <w:vAlign w:val="bottom"/>
+          </w:tcPr>
+          <w:p>
+            <w:pPr>
+              <w:pStyle w:val="Normal"/>
+              <w:widowControl w:val="false"/>
+              <w:spacing w:lineRule="auto" w:line="180"/>
+              <w:jc w:val="center"/>
+              <w:rPr>
+                <w:sz w:val="16"/>
+                <w:szCs w:val="16"/>
+              </w:rPr>
+            </w:pPr>
+            <w:r>
+              <w:rPr>
+                <w:rFonts w:eastAsia="arial" w:ascii="arial" w:hAnsi="arial"/>
+                <w:color w:val="000000"/>
+                <w:sz w:val="16"/>
+                <w:szCs w:val="16"/>
+              </w:rPr>
+              <w:t>Next</w:t>
+            </w:r>
+          </w:p>
+          <w:p>
+            <w:pPr>
+              <w:pStyle w:val="Normal"/>
+              <w:widowControl w:val="false"/>
+              <w:spacing w:lineRule="auto" w:line="180"/>
+              <w:jc w:val="center"/>
+              <w:rPr>
+                <w:sz w:val="16"/>
+                <w:szCs w:val="16"/>
+              </w:rPr>
+            </w:pPr>
+            <w:r>
+              <w:rPr>
+                <w:rFonts w:eastAsia="arial" w:ascii="arial" w:hAnsi="arial"/>
+                <w:color w:val="000000"/>
+                <w:sz w:val="16"/>
+                <w:szCs w:val="16"/>
+              </w:rPr>
+              <w:t>Cab Cam</w:t>
+            </w:r>
+          </w:p>
+        </w:tc>
+      </w:tr>
+    </w:tbl>
+    <w:p>
+      <w:pPr>
+        <w:pStyle w:val="Normal"/>
+        <w:rPr>
+          <w:rFonts w:ascii="arial" w:hAnsi="arial" w:eastAsia="arial"/>
+          <w:color w:val="000000"/>
+          <w:sz w:val="16"/>
+          <w:szCs w:val="16"/>
+        </w:rPr>
+      </w:pPr>
+      <w:r>
+        <w:rPr>
+          <w:rFonts w:eastAsia="arial" w:ascii="arial" w:hAnsi="arial"/>
+          <w:color w:val="000000"/>
+          <w:sz w:val="16"/>
+          <w:szCs w:val="16"/>
+        </w:rPr>
+      </w:r>
+    </w:p>
+    <w:p>
+      <w:pPr>
+        <w:pStyle w:val="Normal"/>
+        <w:rPr>
+          <w:color w:val="000000"/>
+          <w:sz w:val="16"/>
+          <w:szCs w:val="16"/>
+        </w:rPr>
+      </w:pPr>
+      <w:r>
+        <w:rPr>
+          <w:rFonts w:eastAsia="arial" w:ascii="arial" w:hAnsi="arial"/>
+          <w:color w:val="000000"/>
+          <w:sz w:val="16"/>
+          <w:szCs w:val="16"/>
+        </w:rPr>
+        <w:tab/>
+        <w:t xml:space="preserve">           TGV Duplex 200-2</w:t>
+      </w:r>
+    </w:p>
+    <w:tbl>
+      <w:tblPr>
+        <w:tblW w:w="14248" w:type="dxa"/>
+        <w:jc w:val="left"/>
+        <w:tblInd w:w="-5" w:type="dxa"/>
+        <w:tblLayout w:type="fixed"/>
+        <w:tblCellMar>
+          <w:top w:w="0" w:type="dxa"/>
+          <w:left w:w="108" w:type="dxa"/>
+          <w:bottom w:w="0" w:type="dxa"/>
+          <w:right w:w="108" w:type="dxa"/>
+        </w:tblCellMar>
+        <w:tblLook w:firstRow="1" w:noVBand="1" w:lastRow="0" w:firstColumn="1" w:lastColumn="0" w:noHBand="0" w:val="04a0"/>
+      </w:tblPr>
+      <w:tblGrid>
+        <w:gridCol w:w="1017"/>
+        <w:gridCol w:w="1019"/>
+        <w:gridCol w:w="1014"/>
+        <w:gridCol w:w="1016"/>
+        <w:gridCol w:w="1020"/>
+        <w:gridCol w:w="1016"/>
+        <w:gridCol w:w="1016"/>
+        <w:gridCol w:w="1017"/>
+        <w:gridCol w:w="1016"/>
+        <w:gridCol w:w="1020"/>
+        <w:gridCol w:w="1016"/>
+        <w:gridCol w:w="1016"/>
+        <w:gridCol w:w="1016"/>
+        <w:gridCol w:w="1029"/>
+      </w:tblGrid>
+      <w:tr>
+        <w:trPr>
+          <w:trHeight w:val="440" w:hRule="exact"/>
+          <w:cantSplit w:val="true"/>
+        </w:trPr>
+        <w:tc>
+          <w:tcPr>
+            <w:tcW w:w="1017" w:type="dxa"/>
+            <w:tcBorders>
+              <w:top w:val="single" w:sz="4" w:space="0" w:color="000000"/>
+              <w:left w:val="single" w:sz="4" w:space="0" w:color="000000"/>
+              <w:bottom w:val="single" w:sz="4" w:space="0" w:color="000000"/>
+            </w:tcBorders>
+            <w:vAlign w:val="bottom"/>
+          </w:tcPr>
+          <w:p>
+            <w:pPr>
+              <w:pStyle w:val="Normal"/>
+              <w:widowControl w:val="false"/>
+              <w:spacing w:lineRule="auto" w:line="180"/>
+              <w:jc w:val="center"/>
+              <w:rPr>
+                <w:sz w:val="16"/>
+                <w:szCs w:val="16"/>
+              </w:rPr>
+            </w:pPr>
+            <w:r>
+              <w:rPr>
+                <w:rFonts w:eastAsia="arial" w:ascii="arial" w:hAnsi="arial"/>
+                <w:b/>
+                <w:color w:val="000000"/>
+                <w:sz w:val="16"/>
+                <w:szCs w:val="16"/>
+              </w:rPr>
+              <w:t>HUD</w:t>
+            </w:r>
+          </w:p>
+        </w:tc>
+        <w:tc>
+          <w:tcPr>
+            <w:tcW w:w="1019" w:type="dxa"/>
+            <w:tcBorders>
+              <w:top w:val="single" w:sz="4" w:space="0" w:color="000000"/>
+              <w:left w:val="single" w:sz="4" w:space="0" w:color="000000"/>
+              <w:bottom w:val="single" w:sz="4" w:space="0" w:color="000000"/>
+            </w:tcBorders>
+            <w:vAlign w:val="bottom"/>
+          </w:tcPr>
+          <w:p>
+            <w:pPr>
+              <w:pStyle w:val="Normal"/>
+              <w:widowControl w:val="false"/>
+              <w:spacing w:lineRule="auto" w:line="180"/>
+              <w:jc w:val="center"/>
+              <w:rPr>
+                <w:rFonts w:ascii="arial" w:hAnsi="arial" w:eastAsia="arial"/>
+                <w:color w:val="000000"/>
+                <w:sz w:val="16"/>
+                <w:szCs w:val="16"/>
+              </w:rPr>
+            </w:pPr>
+            <w:r>
+              <w:rPr>
+                <w:rFonts w:eastAsia="arial" w:ascii="arial" w:hAnsi="arial"/>
+                <w:color w:val="000000"/>
+                <w:sz w:val="16"/>
+                <w:szCs w:val="16"/>
+              </w:rPr>
+              <w:t>Schedule</w:t>
+            </w:r>
+          </w:p>
+        </w:tc>
+        <w:tc>
+          <w:tcPr>
+            <w:tcW w:w="1014" w:type="dxa"/>
+            <w:tcBorders>
+              <w:top w:val="single" w:sz="4" w:space="0" w:color="000000"/>
+              <w:left w:val="single" w:sz="4" w:space="0" w:color="000000"/>
+              <w:bottom w:val="single" w:sz="4" w:space="0" w:color="000000"/>
+            </w:tcBorders>
+            <w:vAlign w:val="bottom"/>
+          </w:tcPr>
+          <w:p>
+            <w:pPr>
+              <w:pStyle w:val="Normal"/>
+              <w:widowControl w:val="false"/>
+              <w:spacing w:lineRule="auto" w:line="180"/>
+              <w:jc w:val="center"/>
+              <w:rPr>
+                <w:color w:val="000000"/>
+                <w:sz w:val="16"/>
+                <w:szCs w:val="16"/>
+              </w:rPr>
+            </w:pPr>
+            <w:r>
+              <w:rPr>
+                <w:rFonts w:eastAsia="arial" w:ascii="arial" w:hAnsi="arial"/>
+                <w:color w:val="000000"/>
+                <w:sz w:val="16"/>
+                <w:szCs w:val="16"/>
+              </w:rPr>
+              <w:t xml:space="preserve">Rearm </w:t>
+            </w:r>
+            <w:r>
+              <w:rPr>
+                <w:rFonts w:eastAsia="arial" w:ascii="arial" w:hAnsi="arial"/>
+                <w:color w:val="000000"/>
+                <w:sz w:val="16"/>
+                <w:szCs w:val="16"/>
+              </w:rPr>
+              <w:t>MCB</w:t>
+            </w:r>
+          </w:p>
+        </w:tc>
+        <w:tc>
+          <w:tcPr>
+            <w:tcW w:w="1016" w:type="dxa"/>
+            <w:tcBorders>
+              <w:top w:val="single" w:sz="4" w:space="0" w:color="000000"/>
+              <w:left w:val="single" w:sz="4" w:space="0" w:color="000000"/>
+              <w:bottom w:val="single" w:sz="4" w:space="0" w:color="000000"/>
+            </w:tcBorders>
+            <w:vAlign w:val="bottom"/>
+          </w:tcPr>
+          <w:p>
+            <w:pPr>
+              <w:pStyle w:val="Normal"/>
+              <w:widowControl w:val="false"/>
+              <w:spacing w:lineRule="auto" w:line="180"/>
+              <w:jc w:val="center"/>
+              <w:rPr>
+                <w:color w:val="000000"/>
+                <w:sz w:val="16"/>
+                <w:szCs w:val="16"/>
+              </w:rPr>
+            </w:pPr>
+            <w:r>
+              <w:rPr>
+                <w:rFonts w:eastAsia="arial" w:ascii="arial" w:hAnsi="arial"/>
+                <w:color w:val="000000"/>
+                <w:sz w:val="16"/>
+                <w:szCs w:val="16"/>
+              </w:rPr>
+              <w:t>VACMA</w:t>
+            </w:r>
+          </w:p>
+        </w:tc>
+        <w:tc>
+          <w:tcPr>
+            <w:tcW w:w="1020" w:type="dxa"/>
+            <w:tcBorders>
+              <w:top w:val="single" w:sz="4" w:space="0" w:color="000000"/>
+              <w:left w:val="single" w:sz="4" w:space="0" w:color="000000"/>
+              <w:bottom w:val="single" w:sz="4" w:space="0" w:color="000000"/>
+            </w:tcBorders>
+            <w:vAlign w:val="bottom"/>
+          </w:tcPr>
+          <w:p>
+            <w:pPr>
+              <w:pStyle w:val="Normal"/>
+              <w:widowControl w:val="false"/>
+              <w:spacing w:lineRule="auto" w:line="180"/>
+              <w:jc w:val="center"/>
+              <w:rPr>
+                <w:color w:val="000000"/>
+                <w:sz w:val="16"/>
+                <w:szCs w:val="16"/>
+              </w:rPr>
+            </w:pPr>
+            <w:r>
+              <w:rPr>
+                <w:rFonts w:eastAsia="arial" w:ascii="arial" w:hAnsi="arial"/>
+                <w:color w:val="000000"/>
+                <w:sz w:val="16"/>
+                <w:szCs w:val="16"/>
+              </w:rPr>
+              <w:t>Panto.</w:t>
+            </w:r>
+          </w:p>
+          <w:p>
+            <w:pPr>
+              <w:pStyle w:val="Normal"/>
+              <w:widowControl w:val="false"/>
+              <w:spacing w:lineRule="auto" w:line="180"/>
+              <w:jc w:val="center"/>
+              <w:rPr>
+                <w:color w:val="000000"/>
+                <w:sz w:val="16"/>
+                <w:szCs w:val="16"/>
+              </w:rPr>
+            </w:pPr>
+            <w:r>
+              <w:rPr>
+                <w:rFonts w:eastAsia="arial" w:ascii="arial" w:hAnsi="arial"/>
+                <w:color w:val="000000"/>
+                <w:sz w:val="16"/>
+                <w:szCs w:val="16"/>
+              </w:rPr>
+              <w:t>Low</w:t>
+            </w:r>
+          </w:p>
+        </w:tc>
+        <w:tc>
+          <w:tcPr>
+            <w:tcW w:w="1016" w:type="dxa"/>
+            <w:tcBorders>
+              <w:top w:val="single" w:sz="4" w:space="0" w:color="000000"/>
+              <w:left w:val="single" w:sz="4" w:space="0" w:color="000000"/>
+              <w:bottom w:val="single" w:sz="4" w:space="0" w:color="000000"/>
+            </w:tcBorders>
+            <w:vAlign w:val="bottom"/>
+          </w:tcPr>
+          <w:p>
+            <w:pPr>
+              <w:pStyle w:val="Normal"/>
+              <w:widowControl w:val="false"/>
+              <w:jc w:val="center"/>
+              <w:rPr>
+                <w:rFonts w:ascii="arial" w:hAnsi="arial" w:eastAsia="arial"/>
+                <w:color w:val="000000"/>
+                <w:sz w:val="16"/>
+                <w:szCs w:val="16"/>
+              </w:rPr>
+            </w:pPr>
+            <w:r>
+              <w:rPr>
+                <w:rFonts w:eastAsia="arial" w:ascii="arial" w:hAnsi="arial"/>
+                <w:color w:val="000000"/>
+                <w:sz w:val="16"/>
+                <w:szCs w:val="16"/>
+              </w:rPr>
+              <w:t>Brake</w:t>
+            </w:r>
+          </w:p>
+          <w:p>
+            <w:pPr>
+              <w:pStyle w:val="Normal"/>
+              <w:widowControl w:val="false"/>
+              <w:jc w:val="center"/>
+              <w:rPr>
+                <w:rFonts w:ascii="arial" w:hAnsi="arial" w:eastAsia="arial"/>
+                <w:color w:val="000000"/>
+                <w:sz w:val="16"/>
+                <w:szCs w:val="16"/>
+              </w:rPr>
+            </w:pPr>
+            <w:r>
+              <w:rPr>
+                <w:rFonts w:eastAsia="arial" w:ascii="arial" w:hAnsi="arial"/>
+                <w:color w:val="000000"/>
+                <w:sz w:val="16"/>
+                <w:szCs w:val="16"/>
+              </w:rPr>
+              <w:t>Hold</w:t>
+            </w:r>
+          </w:p>
+        </w:tc>
+        <w:tc>
+          <w:tcPr>
+            <w:tcW w:w="1016" w:type="dxa"/>
+            <w:tcBorders>
+              <w:top w:val="single" w:sz="4" w:space="0" w:color="000000"/>
+              <w:left w:val="single" w:sz="4" w:space="0" w:color="000000"/>
+              <w:bottom w:val="single" w:sz="4" w:space="0" w:color="000000"/>
+            </w:tcBorders>
+            <w:vAlign w:val="bottom"/>
+          </w:tcPr>
+          <w:p>
+            <w:pPr>
+              <w:pStyle w:val="Normal"/>
+              <w:widowControl w:val="false"/>
+              <w:jc w:val="center"/>
+              <w:rPr>
+                <w:color w:val="000000"/>
+                <w:sz w:val="16"/>
+                <w:szCs w:val="16"/>
+              </w:rPr>
+            </w:pPr>
+            <w:r>
+              <w:rPr>
+                <w:rFonts w:eastAsia="arial" w:ascii="arial" w:hAnsi="arial"/>
+                <w:color w:val="000000"/>
+                <w:sz w:val="16"/>
+                <w:szCs w:val="16"/>
+              </w:rPr>
+              <w:t xml:space="preserve">Panto. Mode </w:t>
+            </w:r>
+            <w:r>
+              <w:rPr>
+                <w:rFonts w:eastAsia="arial" w:ascii="arial" w:hAnsi="arial"/>
+                <w:color w:val="000000"/>
+                <w:sz w:val="16"/>
+                <w:szCs w:val="16"/>
+              </w:rPr>
+              <w:t>AC</w:t>
+            </w:r>
+          </w:p>
+        </w:tc>
+        <w:tc>
+          <w:tcPr>
+            <w:tcW w:w="1017" w:type="dxa"/>
+            <w:tcBorders>
+              <w:top w:val="single" w:sz="4" w:space="0" w:color="000000"/>
+              <w:left w:val="single" w:sz="4" w:space="0" w:color="000000"/>
+              <w:bottom w:val="single" w:sz="4" w:space="0" w:color="000000"/>
+            </w:tcBorders>
+            <w:vAlign w:val="bottom"/>
+          </w:tcPr>
+          <w:p>
+            <w:pPr>
+              <w:pStyle w:val="Normal"/>
+              <w:widowControl w:val="false"/>
+              <w:spacing w:lineRule="auto" w:line="180"/>
+              <w:jc w:val="center"/>
+              <w:rPr>
+                <w:color w:val="000000"/>
+                <w:sz w:val="16"/>
+                <w:szCs w:val="16"/>
+              </w:rPr>
+            </w:pPr>
+            <w:r>
+              <w:rPr>
+                <w:rFonts w:eastAsia="arial" w:ascii="arial" w:hAnsi="arial"/>
+                <w:color w:val="000000"/>
+                <w:sz w:val="16"/>
+                <w:szCs w:val="16"/>
+              </w:rPr>
+              <w:t>KVB Shunt</w:t>
+            </w:r>
+          </w:p>
+        </w:tc>
+        <w:tc>
+          <w:tcPr>
+            <w:tcW w:w="1016" w:type="dxa"/>
+            <w:tcBorders>
+              <w:top w:val="single" w:sz="4" w:space="0" w:color="000000"/>
+              <w:left w:val="single" w:sz="4" w:space="0" w:color="000000"/>
+              <w:bottom w:val="single" w:sz="4" w:space="0" w:color="000000"/>
+            </w:tcBorders>
+            <w:vAlign w:val="bottom"/>
+          </w:tcPr>
+          <w:p>
+            <w:pPr>
+              <w:pStyle w:val="Normal"/>
+              <w:widowControl w:val="false"/>
+              <w:jc w:val="center"/>
+              <w:rPr>
+                <w:rFonts w:ascii="arial" w:hAnsi="arial" w:eastAsia="arial"/>
+                <w:color w:val="000000"/>
+                <w:sz w:val="16"/>
+                <w:szCs w:val="16"/>
+              </w:rPr>
+            </w:pPr>
+            <w:r>
+              <w:rPr>
+                <w:rFonts w:eastAsia="arial" w:ascii="arial" w:hAnsi="arial"/>
+                <w:color w:val="000000"/>
+                <w:sz w:val="16"/>
+                <w:szCs w:val="16"/>
+              </w:rPr>
+              <w:t>Driving Mode Dw</w:t>
+            </w:r>
+          </w:p>
+        </w:tc>
+        <w:tc>
+          <w:tcPr>
+            <w:tcW w:w="1020" w:type="dxa"/>
+            <w:tcBorders>
+              <w:top w:val="single" w:sz="4" w:space="0" w:color="000000"/>
+              <w:left w:val="single" w:sz="4" w:space="0" w:color="000000"/>
+              <w:bottom w:val="single" w:sz="4" w:space="0" w:color="000000"/>
+            </w:tcBorders>
+            <w:vAlign w:val="bottom"/>
+          </w:tcPr>
+          <w:p>
+            <w:pPr>
+              <w:pStyle w:val="Normal"/>
+              <w:widowControl w:val="false"/>
+              <w:jc w:val="center"/>
+              <w:rPr>
+                <w:rFonts w:ascii="arial" w:hAnsi="arial" w:eastAsia="arial"/>
+                <w:color w:val="000000"/>
+                <w:sz w:val="16"/>
+                <w:szCs w:val="16"/>
+              </w:rPr>
+            </w:pPr>
+            <w:r>
+              <w:rPr/>
+            </w:r>
+          </w:p>
+        </w:tc>
+        <w:tc>
+          <w:tcPr>
+            <w:tcW w:w="1016" w:type="dxa"/>
+            <w:tcBorders>
+              <w:top w:val="single" w:sz="4" w:space="0" w:color="000000"/>
+              <w:left w:val="single" w:sz="4" w:space="0" w:color="000000"/>
+              <w:bottom w:val="single" w:sz="4" w:space="0" w:color="000000"/>
+            </w:tcBorders>
+            <w:vAlign w:val="bottom"/>
+          </w:tcPr>
+          <w:p>
+            <w:pPr>
+              <w:pStyle w:val="Normal"/>
+              <w:widowControl w:val="false"/>
+              <w:jc w:val="center"/>
+              <w:rPr>
+                <w:sz w:val="16"/>
+                <w:szCs w:val="16"/>
+              </w:rPr>
+            </w:pPr>
+            <w:r>
+              <w:rPr>
+                <w:rFonts w:eastAsia="arial" w:ascii="arial" w:hAnsi="arial"/>
+                <w:color w:val="000000"/>
+                <w:sz w:val="16"/>
+                <w:szCs w:val="16"/>
+              </w:rPr>
+              <w:t>Cab</w:t>
+            </w:r>
+          </w:p>
+          <w:p>
+            <w:pPr>
+              <w:pStyle w:val="Normal"/>
+              <w:widowControl w:val="false"/>
+              <w:jc w:val="center"/>
+              <w:rPr>
+                <w:sz w:val="16"/>
+                <w:szCs w:val="16"/>
+              </w:rPr>
+            </w:pPr>
+            <w:r>
+              <w:rPr>
+                <w:rFonts w:eastAsia="arial" w:ascii="arial" w:hAnsi="arial"/>
+                <w:color w:val="000000"/>
+                <w:sz w:val="16"/>
+                <w:szCs w:val="16"/>
+              </w:rPr>
+              <w:t>Light</w:t>
+            </w:r>
+          </w:p>
+        </w:tc>
+        <w:tc>
+          <w:tcPr>
+            <w:tcW w:w="1016" w:type="dxa"/>
+            <w:tcBorders>
+              <w:top w:val="single" w:sz="4" w:space="0" w:color="000000"/>
+              <w:left w:val="single" w:sz="4" w:space="0" w:color="000000"/>
+              <w:bottom w:val="single" w:sz="4" w:space="0" w:color="000000"/>
+            </w:tcBorders>
+            <w:vAlign w:val="bottom"/>
+          </w:tcPr>
+          <w:p>
+            <w:pPr>
+              <w:pStyle w:val="Normal"/>
+              <w:widowControl w:val="false"/>
+              <w:spacing w:lineRule="auto" w:line="180"/>
+              <w:jc w:val="center"/>
+              <w:rPr>
+                <w:sz w:val="16"/>
+                <w:szCs w:val="16"/>
+              </w:rPr>
+            </w:pPr>
+            <w:r>
+              <w:rPr/>
+            </w:r>
+          </w:p>
+        </w:tc>
+        <w:tc>
+          <w:tcPr>
+            <w:tcW w:w="1016" w:type="dxa"/>
+            <w:tcBorders>
+              <w:top w:val="single" w:sz="4" w:space="0" w:color="000000"/>
+              <w:left w:val="single" w:sz="4" w:space="0" w:color="000000"/>
+              <w:bottom w:val="single" w:sz="4" w:space="0" w:color="000000"/>
+            </w:tcBorders>
+            <w:vAlign w:val="bottom"/>
+          </w:tcPr>
+          <w:p>
+            <w:pPr>
+              <w:pStyle w:val="Normal"/>
+              <w:widowControl w:val="false"/>
+              <w:spacing w:lineRule="auto" w:line="180"/>
+              <w:jc w:val="center"/>
+              <w:rPr>
+                <w:color w:val="000000"/>
+                <w:sz w:val="16"/>
+                <w:szCs w:val="16"/>
+              </w:rPr>
+            </w:pPr>
+            <w:r>
+              <w:rPr>
+                <w:rFonts w:eastAsia="arial" w:ascii="arial" w:hAnsi="arial"/>
+                <w:color w:val="000000"/>
+                <w:sz w:val="16"/>
+                <w:szCs w:val="16"/>
+              </w:rPr>
+              <w:t>Exterior</w:t>
+            </w:r>
+          </w:p>
+          <w:p>
+            <w:pPr>
+              <w:pStyle w:val="Normal"/>
+              <w:widowControl w:val="false"/>
+              <w:spacing w:lineRule="auto" w:line="180"/>
+              <w:jc w:val="center"/>
+              <w:rPr>
+                <w:color w:val="000000"/>
+                <w:sz w:val="16"/>
+                <w:szCs w:val="16"/>
+              </w:rPr>
+            </w:pPr>
+            <w:r>
+              <w:rPr>
+                <w:rFonts w:eastAsia="arial" w:ascii="arial" w:hAnsi="arial"/>
+                <w:color w:val="000000"/>
+                <w:sz w:val="16"/>
+                <w:szCs w:val="16"/>
+              </w:rPr>
+              <w:t>Camera</w:t>
+            </w:r>
+          </w:p>
+        </w:tc>
+        <w:tc>
+          <w:tcPr>
+            <w:tcW w:w="1029" w:type="dxa"/>
+            <w:tcBorders>
+              <w:top w:val="single" w:sz="4" w:space="0" w:color="000000"/>
+              <w:left w:val="single" w:sz="4" w:space="0" w:color="000000"/>
+              <w:bottom w:val="single" w:sz="4" w:space="0" w:color="000000"/>
+              <w:right w:val="single" w:sz="4" w:space="0" w:color="000000"/>
+            </w:tcBorders>
+            <w:vAlign w:val="bottom"/>
+          </w:tcPr>
+          <w:p>
+            <w:pPr>
+              <w:pStyle w:val="Normal"/>
+              <w:widowControl w:val="false"/>
+              <w:spacing w:lineRule="auto" w:line="180"/>
+              <w:jc w:val="center"/>
+              <w:rPr>
+                <w:color w:val="000000"/>
+                <w:sz w:val="16"/>
+                <w:szCs w:val="16"/>
+              </w:rPr>
+            </w:pPr>
+            <w:r>
+              <w:rPr>
+                <w:rFonts w:eastAsia="arial" w:ascii="arial" w:hAnsi="arial"/>
+                <w:color w:val="000000"/>
+                <w:sz w:val="16"/>
+                <w:szCs w:val="16"/>
+              </w:rPr>
+              <w:t>Prev</w:t>
+            </w:r>
+          </w:p>
+          <w:p>
+            <w:pPr>
+              <w:pStyle w:val="Normal"/>
+              <w:widowControl w:val="false"/>
+              <w:spacing w:lineRule="auto" w:line="180"/>
+              <w:jc w:val="center"/>
+              <w:rPr>
+                <w:color w:val="000000"/>
+                <w:sz w:val="16"/>
+                <w:szCs w:val="16"/>
+              </w:rPr>
+            </w:pPr>
+            <w:r>
+              <w:rPr>
+                <w:rFonts w:eastAsia="arial" w:ascii="arial" w:hAnsi="arial"/>
+                <w:color w:val="000000"/>
+                <w:sz w:val="16"/>
+                <w:szCs w:val="16"/>
+              </w:rPr>
+              <w:t>Cab Cam</w:t>
+            </w:r>
+          </w:p>
+        </w:tc>
+      </w:tr>
+    </w:tbl>
+    <w:p>
+      <w:pPr>
+        <w:pStyle w:val="Normal"/>
         <w:rPr>
           <w:color w:val="000000"/>
           <w:sz w:val="16"/>
@@ -7154,12 +8474,12 @@
       <w:rFonts w:ascii="Symbol" w:hAnsi="Symbol" w:cs="Symbol"/>
     </w:rPr>
   </w:style>
-  <w:style w:type="character" w:styleId="user" w:customStyle="1">
-    <w:name w:val="번호 매기기 기호 (user)"/>
+  <w:style w:type="character" w:styleId="Style5" w:customStyle="1">
+    <w:name w:val="번호 매기기 기호"/>
     <w:qFormat/>
     <w:rPr/>
   </w:style>
-  <w:style w:type="paragraph" w:styleId="Style5">
+  <w:style w:type="paragraph" w:styleId="Style6">
     <w:name w:val="제목"/>
     <w:basedOn w:val="Normal"/>
     <w:next w:val="BodyText"/>
@@ -7169,7 +8489,7 @@
       <w:spacing w:before="240" w:after="120"/>
     </w:pPr>
     <w:rPr>
-      <w:rFonts w:ascii="Liberation Sans" w:hAnsi="Liberation Sans" w:eastAsia="Noto Sans CJK KR" w:cs="Lohit Devanagari"/>
+      <w:rFonts w:ascii="Liberation Sans" w:hAnsi="Liberation Sans" w:eastAsia="나눔고딕" w:cs="Arial"/>
       <w:sz w:val="28"/>
       <w:szCs w:val="28"/>
     </w:rPr>
@@ -7206,7 +8526,7 @@
       <w:szCs w:val="24"/>
     </w:rPr>
   </w:style>
-  <w:style w:type="paragraph" w:styleId="Style6" w:customStyle="1">
+  <w:style w:type="paragraph" w:styleId="Style7">
     <w:name w:val="색인"/>
     <w:basedOn w:val="Normal"/>
     <w:qFormat/>
@@ -7214,10 +8534,11 @@
       <w:suppressLineNumbers/>
     </w:pPr>
     <w:rPr>
-      <w:rFonts w:cs="Lohit Devanagari"/>
+      <w:rFonts w:cs="Arial"/>
+      <w:sz w:val="24"/>
     </w:rPr>
   </w:style>
-  <w:style w:type="paragraph" w:styleId="user1">
+  <w:style w:type="paragraph" w:styleId="user">
     <w:name w:val="제목 (user)"/>
     <w:basedOn w:val="Normal"/>
     <w:next w:val="BodyText"/>
@@ -7227,12 +8548,12 @@
       <w:spacing w:before="240" w:after="120"/>
     </w:pPr>
     <w:rPr>
-      <w:rFonts w:ascii="Liberation Sans" w:hAnsi="Liberation Sans" w:eastAsia="나눔고딕" w:cs="Arial"/>
+      <w:rFonts w:ascii="Liberation Sans" w:hAnsi="Liberation Sans" w:eastAsia="Noto Sans CJK KR" w:cs="Lohit Devanagari"/>
       <w:sz w:val="28"/>
       <w:szCs w:val="28"/>
     </w:rPr>
   </w:style>
-  <w:style w:type="paragraph" w:styleId="user2">
+  <w:style w:type="paragraph" w:styleId="user1" w:customStyle="1">
     <w:name w:val="색인 (user)"/>
     <w:basedOn w:val="Normal"/>
     <w:qFormat/>
@@ -7240,8 +8561,7 @@
       <w:suppressLineNumbers/>
     </w:pPr>
     <w:rPr>
-      <w:rFonts w:cs="Arial"/>
-      <w:sz w:val="24"/>
+      <w:rFonts w:cs="Lohit Devanagari"/>
     </w:rPr>
   </w:style>
   <w:style w:type="paragraph" w:styleId="Title">
@@ -7923,8 +9243,8 @@
       <w:szCs w:val="24"/>
     </w:rPr>
   </w:style>
-  <w:style w:type="paragraph" w:styleId="Style7" w:customStyle="1">
-    <w:name w:val="표 내용"/>
+  <w:style w:type="paragraph" w:styleId="user2" w:customStyle="1">
+    <w:name w:val="표 내용 (user)"/>
     <w:basedOn w:val="Normal"/>
     <w:qFormat/>
     <w:pPr>
@@ -7932,11 +9252,34 @@
     </w:pPr>
     <w:rPr/>
   </w:style>
-  <w:style w:type="paragraph" w:styleId="Style8" w:customStyle="1">
-    <w:name w:val="표제목"/>
-    <w:basedOn w:val="Style7"/>
+  <w:style w:type="paragraph" w:styleId="user3" w:customStyle="1">
+    <w:name w:val="표제목 (user)"/>
+    <w:basedOn w:val="user2"/>
     <w:qFormat/>
     <w:pPr>
+      <w:jc w:val="center"/>
+    </w:pPr>
+    <w:rPr>
+      <w:b/>
+      <w:bCs/>
+    </w:rPr>
+  </w:style>
+  <w:style w:type="paragraph" w:styleId="Style8">
+    <w:name w:val="표 내용"/>
+    <w:basedOn w:val="Normal"/>
+    <w:qFormat/>
+    <w:pPr>
+      <w:widowControl w:val="false"/>
+      <w:suppressLineNumbers/>
+    </w:pPr>
+    <w:rPr/>
+  </w:style>
+  <w:style w:type="paragraph" w:styleId="Style9">
+    <w:name w:val="표제목"/>
+    <w:basedOn w:val="Style8"/>
+    <w:qFormat/>
+    <w:pPr>
+      <w:suppressLineNumbers/>
       <w:jc w:val="center"/>
     </w:pPr>
     <w:rPr>

</xml_diff>

<commit_message>
Update CD 750 and 843 for new RD assets
New RailDriver assets for CD 750 and 843 is added.
</commit_message>
<xml_diff>
--- a/raildriver-Other-Remapped.docx
+++ b/raildriver-Other-Remapped.docx
@@ -128,7 +128,16 @@
                 <w:sz w:val="16"/>
                 <w:szCs w:val="16"/>
               </w:rPr>
-              <w:t>Reverser</w:t>
+              <w:t xml:space="preserve">Reverser </w:t>
+            </w:r>
+            <w:r>
+              <w:rPr>
+                <w:rFonts w:eastAsia="arial" w:ascii="arial" w:hAnsi="arial"/>
+                <w:color w:val="000000"/>
+                <w:sz w:val="16"/>
+                <w:szCs w:val="16"/>
+              </w:rPr>
+              <w:t>Handle</w:t>
             </w:r>
           </w:p>
         </w:tc>
@@ -233,20 +242,37 @@
             <w:pPr>
               <w:pStyle w:val="Normal"/>
               <w:widowControl w:val="false"/>
-              <w:spacing w:lineRule="auto" w:line="180"/>
-              <w:jc w:val="center"/>
-              <w:rPr>
-                <w:color w:val="000000"/>
-                <w:sz w:val="16"/>
-                <w:szCs w:val="16"/>
-              </w:rPr>
-            </w:pPr>
-            <w:r>
-              <w:rPr>
-                <w:color w:val="000000"/>
-                <w:sz w:val="16"/>
-                <w:szCs w:val="16"/>
-              </w:rPr>
+              <w:jc w:val="center"/>
+              <w:rPr>
+                <w:sz w:val="16"/>
+                <w:szCs w:val="16"/>
+              </w:rPr>
+            </w:pPr>
+            <w:r>
+              <w:rPr>
+                <w:color w:val="000000"/>
+                <w:sz w:val="16"/>
+                <w:szCs w:val="16"/>
+              </w:rPr>
+              <w:t>BS2 Key</w:t>
+            </w:r>
+          </w:p>
+          <w:p>
+            <w:pPr>
+              <w:pStyle w:val="Normal"/>
+              <w:widowControl w:val="false"/>
+              <w:jc w:val="center"/>
+              <w:rPr>
+                <w:sz w:val="16"/>
+                <w:szCs w:val="16"/>
+              </w:rPr>
+            </w:pPr>
+            <w:r>
+              <w:rPr>
+                <w:sz w:val="16"/>
+                <w:szCs w:val="16"/>
+              </w:rPr>
+              <w:t>On</w:t>
             </w:r>
           </w:p>
         </w:tc>
@@ -277,6 +303,7 @@
                 <w:sz w:val="16"/>
                 <w:szCs w:val="16"/>
               </w:rPr>
+              <w:t>Signal Light F Up</w:t>
             </w:r>
           </w:p>
         </w:tc>
@@ -307,27 +334,23 @@
                 <w:sz w:val="16"/>
                 <w:szCs w:val="16"/>
               </w:rPr>
-              <w:t>BS2 Key</w:t>
-            </w:r>
-          </w:p>
-          <w:p>
-            <w:pPr>
-              <w:pStyle w:val="Normal"/>
-              <w:widowControl w:val="false"/>
-              <w:jc w:val="center"/>
-              <w:rPr>
-                <w:color w:val="000000"/>
-                <w:sz w:val="16"/>
-                <w:szCs w:val="16"/>
-              </w:rPr>
-            </w:pPr>
-            <w:r>
-              <w:rPr>
-                <w:color w:val="000000"/>
-                <w:sz w:val="16"/>
-                <w:szCs w:val="16"/>
-              </w:rPr>
-              <w:t>On</w:t>
+              <w:t xml:space="preserve">Signal Light </w:t>
+            </w:r>
+            <w:r>
+              <w:rPr>
+                <w:color w:val="000000"/>
+                <w:sz w:val="16"/>
+                <w:szCs w:val="16"/>
+              </w:rPr>
+              <w:t>B</w:t>
+            </w:r>
+            <w:r>
+              <w:rPr>
+                <w:color w:val="000000"/>
+                <w:sz w:val="16"/>
+                <w:szCs w:val="16"/>
+              </w:rPr>
+              <w:t xml:space="preserve"> Up</w:t>
             </w:r>
           </w:p>
         </w:tc>
@@ -360,7 +383,7 @@
                 <w:sz w:val="16"/>
                 <w:szCs w:val="16"/>
               </w:rPr>
-              <w:t>Left Light White</w:t>
+              <w:t>Brake Charge</w:t>
             </w:r>
           </w:p>
         </w:tc>
@@ -378,22 +401,21 @@
             <w:pPr>
               <w:pStyle w:val="Normal"/>
               <w:widowControl w:val="false"/>
-              <w:jc w:val="center"/>
-              <w:rPr>
-                <w:rFonts w:ascii="arial" w:hAnsi="arial" w:eastAsia="arial"/>
-                <w:color w:val="000000"/>
-                <w:sz w:val="16"/>
-                <w:szCs w:val="16"/>
-              </w:rPr>
-            </w:pPr>
-            <w:r>
-              <w:rPr>
-                <w:rFonts w:eastAsia="arial" w:ascii="arial" w:hAnsi="arial"/>
-                <w:color w:val="000000"/>
-                <w:sz w:val="16"/>
-                <w:szCs w:val="16"/>
-              </w:rPr>
-              <w:t>Right Light White</w:t>
+              <w:spacing w:lineRule="auto" w:line="180"/>
+              <w:jc w:val="center"/>
+              <w:rPr>
+                <w:sz w:val="16"/>
+                <w:szCs w:val="16"/>
+              </w:rPr>
+            </w:pPr>
+            <w:r>
+              <w:rPr>
+                <w:rFonts w:eastAsia="arial" w:ascii="arial" w:hAnsi="arial"/>
+                <w:color w:val="000000"/>
+                <w:sz w:val="16"/>
+                <w:szCs w:val="16"/>
+              </w:rPr>
+              <w:t>Inst. Light On</w:t>
             </w:r>
           </w:p>
         </w:tc>
@@ -423,7 +445,7 @@
                 <w:sz w:val="16"/>
                 <w:szCs w:val="16"/>
               </w:rPr>
-              <w:t>Inst. Light On</w:t>
+              <w:t>Inst. Light Dens. Up</w:t>
             </w:r>
           </w:p>
         </w:tc>
@@ -506,6 +528,7 @@
                 <w:sz w:val="16"/>
                 <w:szCs w:val="16"/>
               </w:rPr>
+              <w:t>Reading Lamp On</w:t>
             </w:r>
           </w:p>
         </w:tc>
@@ -688,13 +711,14 @@
               <w:spacing w:lineRule="auto" w:line="180" w:before="0" w:after="60"/>
               <w:jc w:val="center"/>
               <w:rPr>
-                <w:color w:val="000000"/>
-                <w:sz w:val="16"/>
-                <w:szCs w:val="16"/>
-              </w:rPr>
-            </w:pPr>
-            <w:r>
-              <w:rPr>
+                <w:b/>
+                <w:bCs/>
+              </w:rPr>
+            </w:pPr>
+            <w:r>
+              <w:rPr>
+                <w:b/>
+                <w:bCs/>
                 <w:color w:val="000000"/>
                 <w:sz w:val="16"/>
                 <w:szCs w:val="16"/>
@@ -818,6 +842,7 @@
                 <w:sz w:val="16"/>
                 <w:szCs w:val="16"/>
               </w:rPr>
+              <w:t>Engine Stop II</w:t>
             </w:r>
           </w:p>
         </w:tc>
@@ -835,20 +860,39 @@
             <w:pPr>
               <w:pStyle w:val="Normal"/>
               <w:widowControl w:val="false"/>
-              <w:spacing w:lineRule="auto" w:line="180"/>
-              <w:jc w:val="center"/>
-              <w:rPr>
-                <w:color w:val="000000"/>
-                <w:sz w:val="16"/>
-                <w:szCs w:val="16"/>
-              </w:rPr>
-            </w:pPr>
-            <w:r>
-              <w:rPr>
-                <w:color w:val="000000"/>
-                <w:sz w:val="16"/>
-                <w:szCs w:val="16"/>
-              </w:rPr>
+              <w:jc w:val="center"/>
+              <w:rPr>
+                <w:sz w:val="16"/>
+                <w:szCs w:val="16"/>
+              </w:rPr>
+            </w:pPr>
+            <w:r>
+              <w:rPr>
+                <w:rFonts w:eastAsia="arial" w:ascii="arial" w:hAnsi="arial"/>
+                <w:color w:val="000000"/>
+                <w:sz w:val="16"/>
+                <w:szCs w:val="16"/>
+              </w:rPr>
+              <w:t>BS2 Key</w:t>
+            </w:r>
+          </w:p>
+          <w:p>
+            <w:pPr>
+              <w:pStyle w:val="Normal"/>
+              <w:widowControl w:val="false"/>
+              <w:jc w:val="center"/>
+              <w:rPr>
+                <w:sz w:val="16"/>
+                <w:szCs w:val="16"/>
+              </w:rPr>
+            </w:pPr>
+            <w:r>
+              <w:rPr>
+                <w:rFonts w:eastAsia="arial" w:ascii="arial" w:hAnsi="arial"/>
+                <w:sz w:val="16"/>
+                <w:szCs w:val="16"/>
+              </w:rPr>
+              <w:t>Off</w:t>
             </w:r>
           </w:p>
         </w:tc>
@@ -879,6 +923,7 @@
                 <w:sz w:val="16"/>
                 <w:szCs w:val="16"/>
               </w:rPr>
+              <w:t>Signal Light F Dw</w:t>
             </w:r>
           </w:p>
         </w:tc>
@@ -898,6 +943,56 @@
               <w:widowControl w:val="false"/>
               <w:jc w:val="center"/>
               <w:rPr>
+                <w:color w:val="000000"/>
+                <w:sz w:val="16"/>
+                <w:szCs w:val="16"/>
+              </w:rPr>
+            </w:pPr>
+            <w:r>
+              <w:rPr>
+                <w:rFonts w:eastAsia="arial" w:ascii="arial" w:hAnsi="arial"/>
+                <w:color w:val="000000"/>
+                <w:sz w:val="16"/>
+                <w:szCs w:val="16"/>
+              </w:rPr>
+              <w:t xml:space="preserve">Signal Light </w:t>
+            </w:r>
+            <w:r>
+              <w:rPr>
+                <w:rFonts w:eastAsia="arial" w:ascii="arial" w:hAnsi="arial"/>
+                <w:color w:val="000000"/>
+                <w:sz w:val="16"/>
+                <w:szCs w:val="16"/>
+              </w:rPr>
+              <w:t>B</w:t>
+            </w:r>
+            <w:r>
+              <w:rPr>
+                <w:rFonts w:eastAsia="arial" w:ascii="arial" w:hAnsi="arial"/>
+                <w:color w:val="000000"/>
+                <w:sz w:val="16"/>
+                <w:szCs w:val="16"/>
+              </w:rPr>
+              <w:t xml:space="preserve"> Dw</w:t>
+            </w:r>
+          </w:p>
+        </w:tc>
+        <w:tc>
+          <w:tcPr>
+            <w:tcW w:w="1017" w:type="dxa"/>
+            <w:tcBorders>
+              <w:top w:val="single" w:sz="4" w:space="0" w:color="000000"/>
+              <w:left w:val="single" w:sz="4" w:space="0" w:color="000000"/>
+              <w:bottom w:val="single" w:sz="4" w:space="0" w:color="000000"/>
+            </w:tcBorders>
+            <w:vAlign w:val="bottom"/>
+          </w:tcPr>
+          <w:p>
+            <w:pPr>
+              <w:pStyle w:val="Normal"/>
+              <w:widowControl w:val="false"/>
+              <w:jc w:val="center"/>
+              <w:rPr>
                 <w:rFonts w:ascii="arial" w:hAnsi="arial" w:eastAsia="arial"/>
                 <w:color w:val="000000"/>
                 <w:sz w:val="16"/>
@@ -905,68 +1000,7 @@
               </w:rPr>
             </w:pPr>
             <w:r>
-              <w:rPr>
-                <w:rFonts w:eastAsia="arial" w:ascii="arial" w:hAnsi="arial"/>
-                <w:color w:val="000000"/>
-                <w:sz w:val="16"/>
-                <w:szCs w:val="16"/>
-              </w:rPr>
-              <w:t>BS2 Key</w:t>
-            </w:r>
-          </w:p>
-          <w:p>
-            <w:pPr>
-              <w:pStyle w:val="Normal"/>
-              <w:widowControl w:val="false"/>
-              <w:jc w:val="center"/>
-              <w:rPr>
-                <w:rFonts w:ascii="arial" w:hAnsi="arial" w:eastAsia="arial"/>
-                <w:color w:val="000000"/>
-                <w:sz w:val="16"/>
-                <w:szCs w:val="16"/>
-              </w:rPr>
-            </w:pPr>
-            <w:r>
-              <w:rPr>
-                <w:rFonts w:eastAsia="arial" w:ascii="arial" w:hAnsi="arial"/>
-                <w:color w:val="000000"/>
-                <w:sz w:val="16"/>
-                <w:szCs w:val="16"/>
-              </w:rPr>
-              <w:t>Off</w:t>
-            </w:r>
-          </w:p>
-        </w:tc>
-        <w:tc>
-          <w:tcPr>
-            <w:tcW w:w="1017" w:type="dxa"/>
-            <w:tcBorders>
-              <w:top w:val="single" w:sz="4" w:space="0" w:color="000000"/>
-              <w:left w:val="single" w:sz="4" w:space="0" w:color="000000"/>
-              <w:bottom w:val="single" w:sz="4" w:space="0" w:color="000000"/>
-            </w:tcBorders>
-            <w:vAlign w:val="bottom"/>
-          </w:tcPr>
-          <w:p>
-            <w:pPr>
-              <w:pStyle w:val="Normal"/>
-              <w:widowControl w:val="false"/>
-              <w:jc w:val="center"/>
-              <w:rPr>
-                <w:rFonts w:ascii="arial" w:hAnsi="arial" w:eastAsia="arial"/>
-                <w:color w:val="000000"/>
-                <w:sz w:val="16"/>
-                <w:szCs w:val="16"/>
-              </w:rPr>
-            </w:pPr>
-            <w:r>
-              <w:rPr>
-                <w:rFonts w:eastAsia="arial" w:ascii="arial" w:hAnsi="arial"/>
-                <w:color w:val="000000"/>
-                <w:sz w:val="16"/>
-                <w:szCs w:val="16"/>
-              </w:rPr>
-              <w:t>Left Light Red</w:t>
+              <w:rPr/>
             </w:r>
           </w:p>
         </w:tc>
@@ -984,22 +1018,21 @@
             <w:pPr>
               <w:pStyle w:val="Normal"/>
               <w:widowControl w:val="false"/>
-              <w:jc w:val="center"/>
-              <w:rPr>
-                <w:rFonts w:ascii="arial" w:hAnsi="arial" w:eastAsia="arial"/>
-                <w:color w:val="000000"/>
-                <w:sz w:val="16"/>
-                <w:szCs w:val="16"/>
-              </w:rPr>
-            </w:pPr>
-            <w:r>
-              <w:rPr>
-                <w:rFonts w:eastAsia="arial" w:ascii="arial" w:hAnsi="arial"/>
-                <w:color w:val="000000"/>
-                <w:sz w:val="16"/>
-                <w:szCs w:val="16"/>
-              </w:rPr>
-              <w:t>Right Light Red</w:t>
+              <w:spacing w:lineRule="auto" w:line="180"/>
+              <w:jc w:val="center"/>
+              <w:rPr>
+                <w:sz w:val="16"/>
+                <w:szCs w:val="16"/>
+              </w:rPr>
+            </w:pPr>
+            <w:r>
+              <w:rPr>
+                <w:rFonts w:eastAsia="arial" w:ascii="arial" w:hAnsi="arial"/>
+                <w:color w:val="000000"/>
+                <w:sz w:val="16"/>
+                <w:szCs w:val="16"/>
+              </w:rPr>
+              <w:t>Inst. Light Off</w:t>
             </w:r>
           </w:p>
         </w:tc>
@@ -1029,7 +1062,7 @@
                 <w:sz w:val="16"/>
                 <w:szCs w:val="16"/>
               </w:rPr>
-              <w:t>Inst. Light Off</w:t>
+              <w:t>Inst. Light Dens. Dw.</w:t>
             </w:r>
           </w:p>
         </w:tc>
@@ -1089,6 +1122,7 @@
                 <w:sz w:val="16"/>
                 <w:szCs w:val="16"/>
               </w:rPr>
+              <w:t>Reading Lamp Off</w:t>
             </w:r>
           </w:p>
         </w:tc>
@@ -1338,6 +1372,120 @@
               </w:rPr>
             </w:pPr>
             <w:r>
+              <w:rPr/>
+            </w:r>
+          </w:p>
+        </w:tc>
+        <w:tc>
+          <w:tcPr>
+            <w:tcW w:w="1014" w:type="dxa"/>
+            <w:tcBorders>
+              <w:top w:val="single" w:sz="4" w:space="0" w:color="000000"/>
+              <w:left w:val="single" w:sz="4" w:space="0" w:color="000000"/>
+              <w:bottom w:val="single" w:sz="4" w:space="0" w:color="000000"/>
+            </w:tcBorders>
+            <w:vAlign w:val="bottom"/>
+          </w:tcPr>
+          <w:p>
+            <w:pPr>
+              <w:pStyle w:val="Normal"/>
+              <w:widowControl w:val="false"/>
+              <w:spacing w:lineRule="auto" w:line="180"/>
+              <w:jc w:val="center"/>
+              <w:rPr>
+                <w:color w:val="000000"/>
+                <w:sz w:val="16"/>
+                <w:szCs w:val="16"/>
+              </w:rPr>
+            </w:pPr>
+            <w:r>
+              <w:rPr>
+                <w:rFonts w:eastAsia="arial" w:ascii="arial" w:hAnsi="arial"/>
+                <w:color w:val="000000"/>
+                <w:sz w:val="16"/>
+                <w:szCs w:val="16"/>
+              </w:rPr>
+              <w:t>Engine</w:t>
+            </w:r>
+          </w:p>
+          <w:p>
+            <w:pPr>
+              <w:pStyle w:val="Normal"/>
+              <w:widowControl w:val="false"/>
+              <w:spacing w:lineRule="auto" w:line="180"/>
+              <w:jc w:val="center"/>
+              <w:rPr>
+                <w:color w:val="000000"/>
+                <w:sz w:val="16"/>
+                <w:szCs w:val="16"/>
+              </w:rPr>
+            </w:pPr>
+            <w:r>
+              <w:rPr>
+                <w:rFonts w:eastAsia="arial" w:ascii="arial" w:hAnsi="arial"/>
+                <w:color w:val="000000"/>
+                <w:sz w:val="16"/>
+                <w:szCs w:val="16"/>
+              </w:rPr>
+              <w:t>Start</w:t>
+            </w:r>
+          </w:p>
+        </w:tc>
+        <w:tc>
+          <w:tcPr>
+            <w:tcW w:w="1016" w:type="dxa"/>
+            <w:tcBorders>
+              <w:top w:val="single" w:sz="4" w:space="0" w:color="000000"/>
+              <w:left w:val="single" w:sz="4" w:space="0" w:color="000000"/>
+              <w:bottom w:val="single" w:sz="4" w:space="0" w:color="000000"/>
+            </w:tcBorders>
+            <w:vAlign w:val="bottom"/>
+          </w:tcPr>
+          <w:p>
+            <w:pPr>
+              <w:pStyle w:val="Normal"/>
+              <w:widowControl w:val="false"/>
+              <w:spacing w:lineRule="auto" w:line="180"/>
+              <w:jc w:val="center"/>
+              <w:rPr>
+                <w:color w:val="000000"/>
+                <w:sz w:val="16"/>
+                <w:szCs w:val="16"/>
+              </w:rPr>
+            </w:pPr>
+            <w:r>
+              <w:rPr>
+                <w:color w:val="000000"/>
+                <w:sz w:val="16"/>
+                <w:szCs w:val="16"/>
+              </w:rPr>
+              <w:t>LS90 On</w:t>
+            </w:r>
+          </w:p>
+        </w:tc>
+        <w:tc>
+          <w:tcPr>
+            <w:tcW w:w="1020" w:type="dxa"/>
+            <w:tcBorders>
+              <w:top w:val="single" w:sz="4" w:space="0" w:color="000000"/>
+              <w:left w:val="single" w:sz="4" w:space="0" w:color="000000"/>
+              <w:bottom w:val="single" w:sz="4" w:space="0" w:color="000000"/>
+            </w:tcBorders>
+            <w:vAlign w:val="bottom"/>
+          </w:tcPr>
+          <w:p>
+            <w:pPr>
+              <w:pStyle w:val="Normal"/>
+              <w:widowControl w:val="false"/>
+              <w:spacing w:lineRule="auto" w:line="180"/>
+              <w:jc w:val="center"/>
+              <w:rPr>
+                <w:color w:val="000000"/>
+                <w:sz w:val="16"/>
+                <w:szCs w:val="16"/>
+              </w:rPr>
+            </w:pPr>
+            <w:r>
               <w:rPr>
                 <w:rFonts w:eastAsia="arial" w:ascii="arial" w:hAnsi="arial"/>
                 <w:color w:val="000000"/>
@@ -1350,61 +1498,6 @@
         </w:tc>
         <w:tc>
           <w:tcPr>
-            <w:tcW w:w="1014" w:type="dxa"/>
-            <w:tcBorders>
-              <w:top w:val="single" w:sz="4" w:space="0" w:color="000000"/>
-              <w:left w:val="single" w:sz="4" w:space="0" w:color="000000"/>
-              <w:bottom w:val="single" w:sz="4" w:space="0" w:color="000000"/>
-            </w:tcBorders>
-            <w:vAlign w:val="bottom"/>
-          </w:tcPr>
-          <w:p>
-            <w:pPr>
-              <w:pStyle w:val="Normal"/>
-              <w:widowControl w:val="false"/>
-              <w:spacing w:lineRule="auto" w:line="180"/>
-              <w:jc w:val="center"/>
-              <w:rPr>
-                <w:color w:val="000000"/>
-                <w:sz w:val="16"/>
-                <w:szCs w:val="16"/>
-              </w:rPr>
-            </w:pPr>
-            <w:r>
-              <w:rPr>
-                <w:rFonts w:eastAsia="arial" w:ascii="arial" w:hAnsi="arial"/>
-                <w:color w:val="000000"/>
-                <w:sz w:val="16"/>
-                <w:szCs w:val="16"/>
-              </w:rPr>
-              <w:t>Engine</w:t>
-            </w:r>
-          </w:p>
-          <w:p>
-            <w:pPr>
-              <w:pStyle w:val="Normal"/>
-              <w:widowControl w:val="false"/>
-              <w:spacing w:lineRule="auto" w:line="180"/>
-              <w:jc w:val="center"/>
-              <w:rPr>
-                <w:color w:val="000000"/>
-                <w:sz w:val="16"/>
-                <w:szCs w:val="16"/>
-              </w:rPr>
-            </w:pPr>
-            <w:r>
-              <w:rPr>
-                <w:rFonts w:eastAsia="arial" w:ascii="arial" w:hAnsi="arial"/>
-                <w:color w:val="000000"/>
-                <w:sz w:val="16"/>
-                <w:szCs w:val="16"/>
-              </w:rPr>
-              <w:t>Start</w:t>
-            </w:r>
-          </w:p>
-        </w:tc>
-        <w:tc>
-          <w:tcPr>
             <w:tcW w:w="1016" w:type="dxa"/>
             <w:tcBorders>
               <w:top w:val="single" w:sz="4" w:space="0" w:color="000000"/>
@@ -1427,11 +1520,129 @@
             </w:pPr>
             <w:r>
               <w:rPr>
-                <w:color w:val="000000"/>
-                <w:sz w:val="16"/>
-                <w:szCs w:val="16"/>
-              </w:rPr>
-              <w:t>LS90 On</w:t>
+                <w:rFonts w:eastAsia="arial" w:ascii="arial" w:hAnsi="arial"/>
+                <w:color w:val="000000"/>
+                <w:sz w:val="16"/>
+                <w:szCs w:val="16"/>
+              </w:rPr>
+              <w:t>Train Light On</w:t>
+            </w:r>
+          </w:p>
+        </w:tc>
+        <w:tc>
+          <w:tcPr>
+            <w:tcW w:w="1016" w:type="dxa"/>
+            <w:tcBorders>
+              <w:top w:val="single" w:sz="4" w:space="0" w:color="000000"/>
+              <w:left w:val="single" w:sz="4" w:space="0" w:color="000000"/>
+              <w:bottom w:val="single" w:sz="4" w:space="0" w:color="000000"/>
+            </w:tcBorders>
+            <w:vAlign w:val="bottom"/>
+          </w:tcPr>
+          <w:p>
+            <w:pPr>
+              <w:pStyle w:val="Normal"/>
+              <w:widowControl w:val="false"/>
+              <w:jc w:val="center"/>
+              <w:rPr>
+                <w:color w:val="000000"/>
+                <w:sz w:val="16"/>
+                <w:szCs w:val="16"/>
+              </w:rPr>
+            </w:pPr>
+            <w:r>
+              <w:rPr>
+                <w:color w:val="000000"/>
+                <w:sz w:val="16"/>
+                <w:szCs w:val="16"/>
+              </w:rPr>
+              <w:t>Brake</w:t>
+            </w:r>
+          </w:p>
+          <w:p>
+            <w:pPr>
+              <w:pStyle w:val="Normal"/>
+              <w:widowControl w:val="false"/>
+              <w:jc w:val="center"/>
+              <w:rPr>
+                <w:color w:val="000000"/>
+                <w:sz w:val="16"/>
+                <w:szCs w:val="16"/>
+              </w:rPr>
+            </w:pPr>
+            <w:r>
+              <w:rPr>
+                <w:color w:val="000000"/>
+                <w:sz w:val="16"/>
+                <w:szCs w:val="16"/>
+              </w:rPr>
+              <w:t>Cut-in</w:t>
+            </w:r>
+          </w:p>
+        </w:tc>
+        <w:tc>
+          <w:tcPr>
+            <w:tcW w:w="1017" w:type="dxa"/>
+            <w:tcBorders>
+              <w:top w:val="single" w:sz="4" w:space="0" w:color="000000"/>
+              <w:left w:val="single" w:sz="4" w:space="0" w:color="000000"/>
+              <w:bottom w:val="single" w:sz="4" w:space="0" w:color="000000"/>
+            </w:tcBorders>
+            <w:vAlign w:val="bottom"/>
+          </w:tcPr>
+          <w:p>
+            <w:pPr>
+              <w:pStyle w:val="Normal"/>
+              <w:widowControl w:val="false"/>
+              <w:jc w:val="center"/>
+              <w:rPr>
+                <w:rFonts w:ascii="arial" w:hAnsi="arial" w:eastAsia="arial"/>
+                <w:color w:val="000000"/>
+                <w:sz w:val="16"/>
+                <w:szCs w:val="16"/>
+              </w:rPr>
+            </w:pPr>
+            <w:r>
+              <w:rPr>
+                <w:rFonts w:eastAsia="arial" w:ascii="arial" w:hAnsi="arial"/>
+                <w:color w:val="000000"/>
+                <w:sz w:val="16"/>
+                <w:szCs w:val="16"/>
+              </w:rPr>
+              <w:t>Signal Light White</w:t>
+            </w:r>
+          </w:p>
+        </w:tc>
+        <w:tc>
+          <w:tcPr>
+            <w:tcW w:w="1016" w:type="dxa"/>
+            <w:tcBorders>
+              <w:top w:val="single" w:sz="4" w:space="0" w:color="000000"/>
+              <w:left w:val="single" w:sz="4" w:space="0" w:color="000000"/>
+              <w:bottom w:val="single" w:sz="4" w:space="0" w:color="000000"/>
+            </w:tcBorders>
+            <w:vAlign w:val="bottom"/>
+          </w:tcPr>
+          <w:p>
+            <w:pPr>
+              <w:pStyle w:val="Normal"/>
+              <w:widowControl w:val="false"/>
+              <w:jc w:val="center"/>
+              <w:rPr>
+                <w:rFonts w:ascii="arial" w:hAnsi="arial" w:eastAsia="arial"/>
+                <w:color w:val="000000"/>
+                <w:sz w:val="16"/>
+                <w:szCs w:val="16"/>
+              </w:rPr>
+            </w:pPr>
+            <w:r>
+              <w:rPr>
+                <w:rFonts w:eastAsia="arial" w:ascii="arial" w:hAnsi="arial"/>
+                <w:color w:val="000000"/>
+                <w:sz w:val="16"/>
+                <w:szCs w:val="16"/>
+              </w:rPr>
+              <w:t>Inst. Light On</w:t>
             </w:r>
           </w:p>
         </w:tc>
@@ -1463,28 +1674,7 @@
                 <w:sz w:val="16"/>
                 <w:szCs w:val="16"/>
               </w:rPr>
-              <w:t>Mode</w:t>
-            </w:r>
-          </w:p>
-          <w:p>
-            <w:pPr>
-              <w:pStyle w:val="Normal"/>
-              <w:widowControl w:val="false"/>
-              <w:spacing w:lineRule="auto" w:line="180"/>
-              <w:jc w:val="center"/>
-              <w:rPr>
-                <w:color w:val="000000"/>
-                <w:sz w:val="16"/>
-                <w:szCs w:val="16"/>
-              </w:rPr>
-            </w:pPr>
-            <w:r>
-              <w:rPr>
-                <w:color w:val="000000"/>
-                <w:sz w:val="16"/>
-                <w:szCs w:val="16"/>
-              </w:rPr>
-              <w:t>Electric</w:t>
+              <w:t>Engine Select R</w:t>
             </w:r>
           </w:p>
         </w:tc>
@@ -1502,252 +1692,74 @@
             <w:pPr>
               <w:pStyle w:val="Normal"/>
               <w:widowControl w:val="false"/>
-              <w:jc w:val="center"/>
-              <w:rPr>
-                <w:color w:val="000000"/>
-                <w:sz w:val="16"/>
-                <w:szCs w:val="16"/>
-              </w:rPr>
-            </w:pPr>
-            <w:r>
-              <w:rPr>
+              <w:spacing w:lineRule="auto" w:line="180"/>
+              <w:jc w:val="center"/>
+              <w:rPr>
+                <w:sz w:val="16"/>
+                <w:szCs w:val="16"/>
+              </w:rPr>
+            </w:pPr>
+            <w:r>
+              <w:rPr>
+                <w:rFonts w:eastAsia="arial" w:ascii="arial" w:hAnsi="arial"/>
+                <w:color w:val="000000"/>
+                <w:sz w:val="16"/>
+                <w:szCs w:val="16"/>
+              </w:rPr>
+              <w:t>Cab Light</w:t>
+            </w:r>
+          </w:p>
+          <w:p>
+            <w:pPr>
+              <w:pStyle w:val="Normal"/>
+              <w:widowControl w:val="false"/>
+              <w:spacing w:lineRule="auto" w:line="180"/>
+              <w:jc w:val="center"/>
+              <w:rPr>
+                <w:sz w:val="16"/>
+                <w:szCs w:val="16"/>
+              </w:rPr>
+            </w:pPr>
+            <w:r>
+              <w:rPr>
+                <w:rFonts w:eastAsia="arial" w:ascii="arial" w:hAnsi="arial"/>
+                <w:color w:val="000000"/>
+                <w:sz w:val="16"/>
+                <w:szCs w:val="16"/>
+              </w:rPr>
+              <w:t>Full</w:t>
+            </w:r>
+          </w:p>
+        </w:tc>
+        <w:tc>
+          <w:tcPr>
+            <w:tcW w:w="1016" w:type="dxa"/>
+            <w:tcBorders>
+              <w:top w:val="single" w:sz="4" w:space="0" w:color="000000"/>
+              <w:left w:val="single" w:sz="4" w:space="0" w:color="000000"/>
+              <w:bottom w:val="single" w:sz="4" w:space="0" w:color="000000"/>
+            </w:tcBorders>
+            <w:vAlign w:val="bottom"/>
+          </w:tcPr>
+          <w:p>
+            <w:pPr>
+              <w:pStyle w:val="Normal"/>
+              <w:widowControl w:val="false"/>
+              <w:spacing w:lineRule="auto" w:line="180"/>
+              <w:jc w:val="center"/>
+              <w:rPr>
+                <w:sz w:val="16"/>
+                <w:szCs w:val="16"/>
+              </w:rPr>
+            </w:pPr>
+            <w:r>
+              <w:rPr>
+                <w:rFonts w:eastAsia="arial" w:ascii="arial" w:hAnsi="arial"/>
                 <w:color w:val="000000"/>
                 <w:sz w:val="16"/>
                 <w:szCs w:val="16"/>
               </w:rPr>
               <w:t>Auto Speed On</w:t>
-            </w:r>
-          </w:p>
-        </w:tc>
-        <w:tc>
-          <w:tcPr>
-            <w:tcW w:w="1016" w:type="dxa"/>
-            <w:tcBorders>
-              <w:top w:val="single" w:sz="4" w:space="0" w:color="000000"/>
-              <w:left w:val="single" w:sz="4" w:space="0" w:color="000000"/>
-              <w:bottom w:val="single" w:sz="4" w:space="0" w:color="000000"/>
-            </w:tcBorders>
-            <w:vAlign w:val="bottom"/>
-          </w:tcPr>
-          <w:p>
-            <w:pPr>
-              <w:pStyle w:val="Normal"/>
-              <w:widowControl w:val="false"/>
-              <w:jc w:val="center"/>
-              <w:rPr>
-                <w:color w:val="000000"/>
-                <w:sz w:val="16"/>
-                <w:szCs w:val="16"/>
-              </w:rPr>
-            </w:pPr>
-            <w:r>
-              <w:rPr>
-                <w:color w:val="000000"/>
-                <w:sz w:val="16"/>
-                <w:szCs w:val="16"/>
-              </w:rPr>
-              <w:t>Brake</w:t>
-            </w:r>
-          </w:p>
-          <w:p>
-            <w:pPr>
-              <w:pStyle w:val="Normal"/>
-              <w:widowControl w:val="false"/>
-              <w:jc w:val="center"/>
-              <w:rPr>
-                <w:color w:val="000000"/>
-                <w:sz w:val="16"/>
-                <w:szCs w:val="16"/>
-              </w:rPr>
-            </w:pPr>
-            <w:r>
-              <w:rPr>
-                <w:color w:val="000000"/>
-                <w:sz w:val="16"/>
-                <w:szCs w:val="16"/>
-              </w:rPr>
-              <w:t>Cut-in</w:t>
-            </w:r>
-          </w:p>
-        </w:tc>
-        <w:tc>
-          <w:tcPr>
-            <w:tcW w:w="1017" w:type="dxa"/>
-            <w:tcBorders>
-              <w:top w:val="single" w:sz="4" w:space="0" w:color="000000"/>
-              <w:left w:val="single" w:sz="4" w:space="0" w:color="000000"/>
-              <w:bottom w:val="single" w:sz="4" w:space="0" w:color="000000"/>
-            </w:tcBorders>
-            <w:vAlign w:val="bottom"/>
-          </w:tcPr>
-          <w:p>
-            <w:pPr>
-              <w:pStyle w:val="Normal"/>
-              <w:widowControl w:val="false"/>
-              <w:jc w:val="center"/>
-              <w:rPr>
-                <w:rFonts w:ascii="arial" w:hAnsi="arial" w:eastAsia="arial"/>
-                <w:color w:val="000000"/>
-                <w:sz w:val="16"/>
-                <w:szCs w:val="16"/>
-              </w:rPr>
-            </w:pPr>
-            <w:r>
-              <w:rPr>
-                <w:rFonts w:eastAsia="arial" w:ascii="arial" w:hAnsi="arial"/>
-                <w:color w:val="000000"/>
-                <w:sz w:val="16"/>
-                <w:szCs w:val="16"/>
-              </w:rPr>
-              <w:t>Signal Light White</w:t>
-            </w:r>
-          </w:p>
-        </w:tc>
-        <w:tc>
-          <w:tcPr>
-            <w:tcW w:w="1016" w:type="dxa"/>
-            <w:tcBorders>
-              <w:top w:val="single" w:sz="4" w:space="0" w:color="000000"/>
-              <w:left w:val="single" w:sz="4" w:space="0" w:color="000000"/>
-              <w:bottom w:val="single" w:sz="4" w:space="0" w:color="000000"/>
-            </w:tcBorders>
-            <w:vAlign w:val="bottom"/>
-          </w:tcPr>
-          <w:p>
-            <w:pPr>
-              <w:pStyle w:val="Normal"/>
-              <w:widowControl w:val="false"/>
-              <w:jc w:val="center"/>
-              <w:rPr>
-                <w:rFonts w:ascii="arial" w:hAnsi="arial" w:eastAsia="arial"/>
-                <w:color w:val="000000"/>
-                <w:sz w:val="16"/>
-                <w:szCs w:val="16"/>
-              </w:rPr>
-            </w:pPr>
-            <w:r>
-              <w:rPr>
-                <w:rFonts w:eastAsia="arial" w:ascii="arial" w:hAnsi="arial"/>
-                <w:color w:val="000000"/>
-                <w:sz w:val="16"/>
-                <w:szCs w:val="16"/>
-              </w:rPr>
-              <w:t>Inst. Light On</w:t>
-            </w:r>
-          </w:p>
-        </w:tc>
-        <w:tc>
-          <w:tcPr>
-            <w:tcW w:w="1020" w:type="dxa"/>
-            <w:tcBorders>
-              <w:top w:val="single" w:sz="4" w:space="0" w:color="000000"/>
-              <w:left w:val="single" w:sz="4" w:space="0" w:color="000000"/>
-              <w:bottom w:val="single" w:sz="4" w:space="0" w:color="000000"/>
-            </w:tcBorders>
-            <w:vAlign w:val="bottom"/>
-          </w:tcPr>
-          <w:p>
-            <w:pPr>
-              <w:pStyle w:val="Normal"/>
-              <w:widowControl w:val="false"/>
-              <w:spacing w:lineRule="auto" w:line="180"/>
-              <w:jc w:val="center"/>
-              <w:rPr>
-                <w:sz w:val="16"/>
-                <w:szCs w:val="16"/>
-              </w:rPr>
-            </w:pPr>
-            <w:r>
-              <w:rPr>
-                <w:sz w:val="16"/>
-                <w:szCs w:val="16"/>
-              </w:rPr>
-              <w:t>Inst. Light Bright</w:t>
-            </w:r>
-          </w:p>
-        </w:tc>
-        <w:tc>
-          <w:tcPr>
-            <w:tcW w:w="1016" w:type="dxa"/>
-            <w:tcBorders>
-              <w:top w:val="single" w:sz="4" w:space="0" w:color="000000"/>
-              <w:left w:val="single" w:sz="4" w:space="0" w:color="000000"/>
-              <w:bottom w:val="single" w:sz="4" w:space="0" w:color="000000"/>
-            </w:tcBorders>
-            <w:vAlign w:val="bottom"/>
-          </w:tcPr>
-          <w:p>
-            <w:pPr>
-              <w:pStyle w:val="Normal"/>
-              <w:widowControl w:val="false"/>
-              <w:spacing w:lineRule="auto" w:line="180"/>
-              <w:jc w:val="center"/>
-              <w:rPr>
-                <w:sz w:val="16"/>
-                <w:szCs w:val="16"/>
-              </w:rPr>
-            </w:pPr>
-            <w:r>
-              <w:rPr>
-                <w:rFonts w:eastAsia="arial" w:ascii="arial" w:hAnsi="arial"/>
-                <w:color w:val="000000"/>
-                <w:sz w:val="16"/>
-                <w:szCs w:val="16"/>
-              </w:rPr>
-              <w:t>Cab Light</w:t>
-            </w:r>
-          </w:p>
-          <w:p>
-            <w:pPr>
-              <w:pStyle w:val="Normal"/>
-              <w:widowControl w:val="false"/>
-              <w:spacing w:lineRule="auto" w:line="180"/>
-              <w:jc w:val="center"/>
-              <w:rPr>
-                <w:sz w:val="16"/>
-                <w:szCs w:val="16"/>
-              </w:rPr>
-            </w:pPr>
-            <w:r>
-              <w:rPr>
-                <w:rFonts w:eastAsia="arial" w:ascii="arial" w:hAnsi="arial"/>
-                <w:color w:val="000000"/>
-                <w:sz w:val="16"/>
-                <w:szCs w:val="16"/>
-              </w:rPr>
-              <w:t>Full</w:t>
-            </w:r>
-          </w:p>
-        </w:tc>
-        <w:tc>
-          <w:tcPr>
-            <w:tcW w:w="1016" w:type="dxa"/>
-            <w:tcBorders>
-              <w:top w:val="single" w:sz="4" w:space="0" w:color="000000"/>
-              <w:left w:val="single" w:sz="4" w:space="0" w:color="000000"/>
-              <w:bottom w:val="single" w:sz="4" w:space="0" w:color="000000"/>
-            </w:tcBorders>
-            <w:vAlign w:val="bottom"/>
-          </w:tcPr>
-          <w:p>
-            <w:pPr>
-              <w:pStyle w:val="Normal"/>
-              <w:widowControl w:val="false"/>
-              <w:spacing w:lineRule="auto" w:line="180"/>
-              <w:jc w:val="center"/>
-              <w:rPr>
-                <w:sz w:val="16"/>
-                <w:szCs w:val="16"/>
-              </w:rPr>
-            </w:pPr>
-            <w:r>
-              <w:rPr>
-                <w:rFonts w:eastAsia="arial" w:ascii="arial" w:hAnsi="arial"/>
-                <w:color w:val="000000"/>
-                <w:sz w:val="16"/>
-                <w:szCs w:val="16"/>
-              </w:rPr>
-              <w:t>Desk Light On</w:t>
             </w:r>
           </w:p>
         </w:tc>
@@ -1930,6 +1942,39 @@
               <w:spacing w:lineRule="auto" w:line="180" w:before="0" w:after="60"/>
               <w:jc w:val="center"/>
               <w:rPr>
+                <w:b/>
+                <w:bCs/>
+              </w:rPr>
+            </w:pPr>
+            <w:r>
+              <w:rPr>
+                <w:b/>
+                <w:bCs/>
+                <w:color w:val="000000"/>
+                <w:sz w:val="16"/>
+                <w:szCs w:val="16"/>
+              </w:rPr>
+              <w:t>HUD</w:t>
+            </w:r>
+          </w:p>
+        </w:tc>
+        <w:tc>
+          <w:tcPr>
+            <w:tcW w:w="1019" w:type="dxa"/>
+            <w:tcBorders>
+              <w:top w:val="single" w:sz="4" w:space="0" w:color="000000"/>
+              <w:left w:val="single" w:sz="4" w:space="0" w:color="000000"/>
+              <w:bottom w:val="single" w:sz="4" w:space="0" w:color="000000"/>
+            </w:tcBorders>
+            <w:vAlign w:val="bottom"/>
+          </w:tcPr>
+          <w:p>
+            <w:pPr>
+              <w:pStyle w:val="Normal"/>
+              <w:widowControl w:val="false"/>
+              <w:spacing w:lineRule="auto" w:line="180"/>
+              <w:jc w:val="center"/>
+              <w:rPr>
                 <w:color w:val="000000"/>
                 <w:sz w:val="16"/>
                 <w:szCs w:val="16"/>
@@ -1947,7 +1992,94 @@
         </w:tc>
         <w:tc>
           <w:tcPr>
-            <w:tcW w:w="1019" w:type="dxa"/>
+            <w:tcW w:w="1014" w:type="dxa"/>
+            <w:tcBorders>
+              <w:top w:val="single" w:sz="4" w:space="0" w:color="000000"/>
+              <w:left w:val="single" w:sz="4" w:space="0" w:color="000000"/>
+              <w:bottom w:val="single" w:sz="4" w:space="0" w:color="000000"/>
+            </w:tcBorders>
+            <w:vAlign w:val="bottom"/>
+          </w:tcPr>
+          <w:p>
+            <w:pPr>
+              <w:pStyle w:val="Normal"/>
+              <w:widowControl w:val="false"/>
+              <w:spacing w:lineRule="auto" w:line="180"/>
+              <w:jc w:val="center"/>
+              <w:rPr>
+                <w:color w:val="000000"/>
+                <w:sz w:val="16"/>
+                <w:szCs w:val="16"/>
+              </w:rPr>
+            </w:pPr>
+            <w:r>
+              <w:rPr>
+                <w:rFonts w:eastAsia="arial" w:ascii="arial" w:hAnsi="arial"/>
+                <w:color w:val="000000"/>
+                <w:sz w:val="16"/>
+                <w:szCs w:val="16"/>
+              </w:rPr>
+              <w:t>Engine</w:t>
+            </w:r>
+          </w:p>
+          <w:p>
+            <w:pPr>
+              <w:pStyle w:val="Normal"/>
+              <w:widowControl w:val="false"/>
+              <w:spacing w:lineRule="auto" w:line="180"/>
+              <w:jc w:val="center"/>
+              <w:rPr>
+                <w:color w:val="000000"/>
+                <w:sz w:val="16"/>
+                <w:szCs w:val="16"/>
+              </w:rPr>
+            </w:pPr>
+            <w:r>
+              <w:rPr>
+                <w:rFonts w:eastAsia="arial" w:ascii="arial" w:hAnsi="arial"/>
+                <w:color w:val="000000"/>
+                <w:sz w:val="16"/>
+                <w:szCs w:val="16"/>
+              </w:rPr>
+              <w:t>Stop</w:t>
+            </w:r>
+          </w:p>
+        </w:tc>
+        <w:tc>
+          <w:tcPr>
+            <w:tcW w:w="1016" w:type="dxa"/>
+            <w:tcBorders>
+              <w:top w:val="single" w:sz="4" w:space="0" w:color="000000"/>
+              <w:left w:val="single" w:sz="4" w:space="0" w:color="000000"/>
+              <w:bottom w:val="single" w:sz="4" w:space="0" w:color="000000"/>
+            </w:tcBorders>
+            <w:vAlign w:val="bottom"/>
+          </w:tcPr>
+          <w:p>
+            <w:pPr>
+              <w:pStyle w:val="Normal"/>
+              <w:widowControl w:val="false"/>
+              <w:spacing w:lineRule="auto" w:line="180"/>
+              <w:jc w:val="center"/>
+              <w:rPr>
+                <w:color w:val="000000"/>
+                <w:sz w:val="16"/>
+                <w:szCs w:val="16"/>
+              </w:rPr>
+            </w:pPr>
+            <w:r>
+              <w:rPr>
+                <w:color w:val="000000"/>
+                <w:sz w:val="16"/>
+                <w:szCs w:val="16"/>
+              </w:rPr>
+              <w:t>LS90 Off</w:t>
+            </w:r>
+          </w:p>
+        </w:tc>
+        <w:tc>
+          <w:tcPr>
+            <w:tcW w:w="1020" w:type="dxa"/>
             <w:tcBorders>
               <w:top w:val="single" w:sz="4" w:space="0" w:color="000000"/>
               <w:left w:val="single" w:sz="4" w:space="0" w:color="000000"/>
@@ -1979,61 +2111,6 @@
         </w:tc>
         <w:tc>
           <w:tcPr>
-            <w:tcW w:w="1014" w:type="dxa"/>
-            <w:tcBorders>
-              <w:top w:val="single" w:sz="4" w:space="0" w:color="000000"/>
-              <w:left w:val="single" w:sz="4" w:space="0" w:color="000000"/>
-              <w:bottom w:val="single" w:sz="4" w:space="0" w:color="000000"/>
-            </w:tcBorders>
-            <w:vAlign w:val="bottom"/>
-          </w:tcPr>
-          <w:p>
-            <w:pPr>
-              <w:pStyle w:val="Normal"/>
-              <w:widowControl w:val="false"/>
-              <w:spacing w:lineRule="auto" w:line="180"/>
-              <w:jc w:val="center"/>
-              <w:rPr>
-                <w:color w:val="000000"/>
-                <w:sz w:val="16"/>
-                <w:szCs w:val="16"/>
-              </w:rPr>
-            </w:pPr>
-            <w:r>
-              <w:rPr>
-                <w:rFonts w:eastAsia="arial" w:ascii="arial" w:hAnsi="arial"/>
-                <w:color w:val="000000"/>
-                <w:sz w:val="16"/>
-                <w:szCs w:val="16"/>
-              </w:rPr>
-              <w:t>Engine</w:t>
-            </w:r>
-          </w:p>
-          <w:p>
-            <w:pPr>
-              <w:pStyle w:val="Normal"/>
-              <w:widowControl w:val="false"/>
-              <w:spacing w:lineRule="auto" w:line="180"/>
-              <w:jc w:val="center"/>
-              <w:rPr>
-                <w:color w:val="000000"/>
-                <w:sz w:val="16"/>
-                <w:szCs w:val="16"/>
-              </w:rPr>
-            </w:pPr>
-            <w:r>
-              <w:rPr>
-                <w:rFonts w:eastAsia="arial" w:ascii="arial" w:hAnsi="arial"/>
-                <w:color w:val="000000"/>
-                <w:sz w:val="16"/>
-                <w:szCs w:val="16"/>
-              </w:rPr>
-              <w:t>Stop</w:t>
-            </w:r>
-          </w:p>
-        </w:tc>
-        <w:tc>
-          <w:tcPr>
             <w:tcW w:w="1016" w:type="dxa"/>
             <w:tcBorders>
               <w:top w:val="single" w:sz="4" w:space="0" w:color="000000"/>
@@ -2056,11 +2133,130 @@
             </w:pPr>
             <w:r>
               <w:rPr>
-                <w:color w:val="000000"/>
-                <w:sz w:val="16"/>
-                <w:szCs w:val="16"/>
-              </w:rPr>
-              <w:t>LS90 Off</w:t>
+                <w:rFonts w:eastAsia="arial" w:ascii="arial" w:hAnsi="arial"/>
+                <w:color w:val="000000"/>
+                <w:sz w:val="16"/>
+                <w:szCs w:val="16"/>
+              </w:rPr>
+              <w:t>Train Light Off</w:t>
+            </w:r>
+          </w:p>
+        </w:tc>
+        <w:tc>
+          <w:tcPr>
+            <w:tcW w:w="1016" w:type="dxa"/>
+            <w:tcBorders>
+              <w:top w:val="single" w:sz="4" w:space="0" w:color="000000"/>
+              <w:left w:val="single" w:sz="4" w:space="0" w:color="000000"/>
+              <w:bottom w:val="single" w:sz="4" w:space="0" w:color="000000"/>
+            </w:tcBorders>
+            <w:vAlign w:val="bottom"/>
+          </w:tcPr>
+          <w:p>
+            <w:pPr>
+              <w:pStyle w:val="Normal"/>
+              <w:widowControl w:val="false"/>
+              <w:jc w:val="center"/>
+              <w:rPr>
+                <w:rFonts w:ascii="arial" w:hAnsi="arial" w:eastAsia="arial"/>
+                <w:color w:val="000000"/>
+                <w:sz w:val="16"/>
+                <w:szCs w:val="16"/>
+              </w:rPr>
+            </w:pPr>
+            <w:r>
+              <w:rPr>
+                <w:rFonts w:eastAsia="arial" w:ascii="arial" w:hAnsi="arial"/>
+                <w:color w:val="000000"/>
+                <w:sz w:val="16"/>
+                <w:szCs w:val="16"/>
+              </w:rPr>
+              <w:t>Brake</w:t>
+            </w:r>
+          </w:p>
+          <w:p>
+            <w:pPr>
+              <w:pStyle w:val="Normal"/>
+              <w:widowControl w:val="false"/>
+              <w:jc w:val="center"/>
+              <w:rPr>
+                <w:rFonts w:ascii="arial" w:hAnsi="arial" w:eastAsia="arial"/>
+                <w:color w:val="000000"/>
+                <w:sz w:val="16"/>
+                <w:szCs w:val="16"/>
+              </w:rPr>
+            </w:pPr>
+            <w:r>
+              <w:rPr>
+                <w:rFonts w:eastAsia="arial" w:ascii="arial" w:hAnsi="arial"/>
+                <w:color w:val="000000"/>
+                <w:sz w:val="16"/>
+                <w:szCs w:val="16"/>
+              </w:rPr>
+              <w:t>Cut-out</w:t>
+            </w:r>
+          </w:p>
+        </w:tc>
+        <w:tc>
+          <w:tcPr>
+            <w:tcW w:w="1017" w:type="dxa"/>
+            <w:tcBorders>
+              <w:top w:val="single" w:sz="4" w:space="0" w:color="000000"/>
+              <w:left w:val="single" w:sz="4" w:space="0" w:color="000000"/>
+              <w:bottom w:val="single" w:sz="4" w:space="0" w:color="000000"/>
+            </w:tcBorders>
+            <w:vAlign w:val="bottom"/>
+          </w:tcPr>
+          <w:p>
+            <w:pPr>
+              <w:pStyle w:val="Normal"/>
+              <w:widowControl w:val="false"/>
+              <w:jc w:val="center"/>
+              <w:rPr>
+                <w:rFonts w:ascii="arial" w:hAnsi="arial" w:eastAsia="arial"/>
+                <w:color w:val="000000"/>
+                <w:sz w:val="16"/>
+                <w:szCs w:val="16"/>
+              </w:rPr>
+            </w:pPr>
+            <w:r>
+              <w:rPr>
+                <w:rFonts w:eastAsia="arial" w:ascii="arial" w:hAnsi="arial"/>
+                <w:color w:val="000000"/>
+                <w:sz w:val="16"/>
+                <w:szCs w:val="16"/>
+              </w:rPr>
+              <w:t>Signal Light Red</w:t>
+            </w:r>
+          </w:p>
+        </w:tc>
+        <w:tc>
+          <w:tcPr>
+            <w:tcW w:w="1016" w:type="dxa"/>
+            <w:tcBorders>
+              <w:top w:val="single" w:sz="4" w:space="0" w:color="000000"/>
+              <w:left w:val="single" w:sz="4" w:space="0" w:color="000000"/>
+              <w:bottom w:val="single" w:sz="4" w:space="0" w:color="000000"/>
+            </w:tcBorders>
+            <w:vAlign w:val="bottom"/>
+          </w:tcPr>
+          <w:p>
+            <w:pPr>
+              <w:pStyle w:val="Normal"/>
+              <w:widowControl w:val="false"/>
+              <w:spacing w:lineRule="auto" w:line="180"/>
+              <w:jc w:val="center"/>
+              <w:rPr>
+                <w:sz w:val="16"/>
+                <w:szCs w:val="16"/>
+              </w:rPr>
+            </w:pPr>
+            <w:r>
+              <w:rPr>
+                <w:sz w:val="16"/>
+                <w:szCs w:val="16"/>
+              </w:rPr>
+              <w:t>Inst. Light Off</w:t>
             </w:r>
           </w:p>
         </w:tc>
@@ -2092,28 +2288,7 @@
                 <w:sz w:val="16"/>
                 <w:szCs w:val="16"/>
               </w:rPr>
-              <w:t>Mode</w:t>
-            </w:r>
-          </w:p>
-          <w:p>
-            <w:pPr>
-              <w:pStyle w:val="Normal"/>
-              <w:widowControl w:val="false"/>
-              <w:spacing w:lineRule="auto" w:line="180"/>
-              <w:jc w:val="center"/>
-              <w:rPr>
-                <w:color w:val="000000"/>
-                <w:sz w:val="16"/>
-                <w:szCs w:val="16"/>
-              </w:rPr>
-            </w:pPr>
-            <w:r>
-              <w:rPr>
-                <w:color w:val="000000"/>
-                <w:sz w:val="16"/>
-                <w:szCs w:val="16"/>
-              </w:rPr>
-              <w:t>Master</w:t>
+              <w:t>Engine Select L</w:t>
             </w:r>
           </w:p>
         </w:tc>
@@ -2131,230 +2306,51 @@
             <w:pPr>
               <w:pStyle w:val="Normal"/>
               <w:widowControl w:val="false"/>
-              <w:jc w:val="center"/>
-              <w:rPr>
-                <w:color w:val="000000"/>
-                <w:sz w:val="16"/>
-                <w:szCs w:val="16"/>
-              </w:rPr>
-            </w:pPr>
-            <w:r>
-              <w:rPr>
+              <w:spacing w:lineRule="auto" w:line="180"/>
+              <w:jc w:val="center"/>
+              <w:rPr>
+                <w:sz w:val="16"/>
+                <w:szCs w:val="16"/>
+              </w:rPr>
+            </w:pPr>
+            <w:r>
+              <w:rPr>
+                <w:sz w:val="16"/>
+                <w:szCs w:val="16"/>
+              </w:rPr>
+              <w:t>Cab Light Off</w:t>
+            </w:r>
+          </w:p>
+        </w:tc>
+        <w:tc>
+          <w:tcPr>
+            <w:tcW w:w="1016" w:type="dxa"/>
+            <w:tcBorders>
+              <w:top w:val="single" w:sz="4" w:space="0" w:color="000000"/>
+              <w:left w:val="single" w:sz="4" w:space="0" w:color="000000"/>
+              <w:bottom w:val="single" w:sz="4" w:space="0" w:color="000000"/>
+            </w:tcBorders>
+            <w:vAlign w:val="bottom"/>
+          </w:tcPr>
+          <w:p>
+            <w:pPr>
+              <w:pStyle w:val="Normal"/>
+              <w:widowControl w:val="false"/>
+              <w:spacing w:lineRule="auto" w:line="180"/>
+              <w:jc w:val="center"/>
+              <w:rPr>
+                <w:sz w:val="16"/>
+                <w:szCs w:val="16"/>
+              </w:rPr>
+            </w:pPr>
+            <w:r>
+              <w:rPr>
+                <w:rFonts w:eastAsia="arial" w:ascii="arial" w:hAnsi="arial"/>
                 <w:color w:val="000000"/>
                 <w:sz w:val="16"/>
                 <w:szCs w:val="16"/>
               </w:rPr>
               <w:t>Auto Speed Off</w:t>
-            </w:r>
-          </w:p>
-        </w:tc>
-        <w:tc>
-          <w:tcPr>
-            <w:tcW w:w="1016" w:type="dxa"/>
-            <w:tcBorders>
-              <w:top w:val="single" w:sz="4" w:space="0" w:color="000000"/>
-              <w:left w:val="single" w:sz="4" w:space="0" w:color="000000"/>
-              <w:bottom w:val="single" w:sz="4" w:space="0" w:color="000000"/>
-            </w:tcBorders>
-            <w:vAlign w:val="bottom"/>
-          </w:tcPr>
-          <w:p>
-            <w:pPr>
-              <w:pStyle w:val="Normal"/>
-              <w:widowControl w:val="false"/>
-              <w:jc w:val="center"/>
-              <w:rPr>
-                <w:rFonts w:ascii="arial" w:hAnsi="arial" w:eastAsia="arial"/>
-                <w:color w:val="000000"/>
-                <w:sz w:val="16"/>
-                <w:szCs w:val="16"/>
-              </w:rPr>
-            </w:pPr>
-            <w:r>
-              <w:rPr>
-                <w:rFonts w:eastAsia="arial" w:ascii="arial" w:hAnsi="arial"/>
-                <w:color w:val="000000"/>
-                <w:sz w:val="16"/>
-                <w:szCs w:val="16"/>
-              </w:rPr>
-              <w:t>Brake</w:t>
-            </w:r>
-          </w:p>
-          <w:p>
-            <w:pPr>
-              <w:pStyle w:val="Normal"/>
-              <w:widowControl w:val="false"/>
-              <w:jc w:val="center"/>
-              <w:rPr>
-                <w:rFonts w:ascii="arial" w:hAnsi="arial" w:eastAsia="arial"/>
-                <w:color w:val="000000"/>
-                <w:sz w:val="16"/>
-                <w:szCs w:val="16"/>
-              </w:rPr>
-            </w:pPr>
-            <w:r>
-              <w:rPr>
-                <w:rFonts w:eastAsia="arial" w:ascii="arial" w:hAnsi="arial"/>
-                <w:color w:val="000000"/>
-                <w:sz w:val="16"/>
-                <w:szCs w:val="16"/>
-              </w:rPr>
-              <w:t>Cut-out</w:t>
-            </w:r>
-          </w:p>
-        </w:tc>
-        <w:tc>
-          <w:tcPr>
-            <w:tcW w:w="1017" w:type="dxa"/>
-            <w:tcBorders>
-              <w:top w:val="single" w:sz="4" w:space="0" w:color="000000"/>
-              <w:left w:val="single" w:sz="4" w:space="0" w:color="000000"/>
-              <w:bottom w:val="single" w:sz="4" w:space="0" w:color="000000"/>
-            </w:tcBorders>
-            <w:vAlign w:val="bottom"/>
-          </w:tcPr>
-          <w:p>
-            <w:pPr>
-              <w:pStyle w:val="Normal"/>
-              <w:widowControl w:val="false"/>
-              <w:jc w:val="center"/>
-              <w:rPr>
-                <w:rFonts w:ascii="arial" w:hAnsi="arial" w:eastAsia="arial"/>
-                <w:color w:val="000000"/>
-                <w:sz w:val="16"/>
-                <w:szCs w:val="16"/>
-              </w:rPr>
-            </w:pPr>
-            <w:r>
-              <w:rPr>
-                <w:rFonts w:eastAsia="arial" w:ascii="arial" w:hAnsi="arial"/>
-                <w:color w:val="000000"/>
-                <w:sz w:val="16"/>
-                <w:szCs w:val="16"/>
-              </w:rPr>
-              <w:t>Signal Light Red</w:t>
-            </w:r>
-          </w:p>
-        </w:tc>
-        <w:tc>
-          <w:tcPr>
-            <w:tcW w:w="1016" w:type="dxa"/>
-            <w:tcBorders>
-              <w:top w:val="single" w:sz="4" w:space="0" w:color="000000"/>
-              <w:left w:val="single" w:sz="4" w:space="0" w:color="000000"/>
-              <w:bottom w:val="single" w:sz="4" w:space="0" w:color="000000"/>
-            </w:tcBorders>
-            <w:vAlign w:val="bottom"/>
-          </w:tcPr>
-          <w:p>
-            <w:pPr>
-              <w:pStyle w:val="Normal"/>
-              <w:widowControl w:val="false"/>
-              <w:spacing w:lineRule="auto" w:line="180"/>
-              <w:jc w:val="center"/>
-              <w:rPr>
-                <w:sz w:val="16"/>
-                <w:szCs w:val="16"/>
-              </w:rPr>
-            </w:pPr>
-            <w:r>
-              <w:rPr>
-                <w:sz w:val="16"/>
-                <w:szCs w:val="16"/>
-              </w:rPr>
-              <w:t>Inst. Light Off</w:t>
-            </w:r>
-          </w:p>
-        </w:tc>
-        <w:tc>
-          <w:tcPr>
-            <w:tcW w:w="1020" w:type="dxa"/>
-            <w:tcBorders>
-              <w:top w:val="single" w:sz="4" w:space="0" w:color="000000"/>
-              <w:left w:val="single" w:sz="4" w:space="0" w:color="000000"/>
-              <w:bottom w:val="single" w:sz="4" w:space="0" w:color="000000"/>
-            </w:tcBorders>
-            <w:vAlign w:val="bottom"/>
-          </w:tcPr>
-          <w:p>
-            <w:pPr>
-              <w:pStyle w:val="Normal"/>
-              <w:widowControl w:val="false"/>
-              <w:spacing w:lineRule="auto" w:line="180"/>
-              <w:jc w:val="center"/>
-              <w:rPr>
-                <w:sz w:val="16"/>
-                <w:szCs w:val="16"/>
-              </w:rPr>
-            </w:pPr>
-            <w:r>
-              <w:rPr>
-                <w:sz w:val="16"/>
-                <w:szCs w:val="16"/>
-              </w:rPr>
-              <w:t>Inst. Light Dim</w:t>
-            </w:r>
-          </w:p>
-        </w:tc>
-        <w:tc>
-          <w:tcPr>
-            <w:tcW w:w="1016" w:type="dxa"/>
-            <w:tcBorders>
-              <w:top w:val="single" w:sz="4" w:space="0" w:color="000000"/>
-              <w:left w:val="single" w:sz="4" w:space="0" w:color="000000"/>
-              <w:bottom w:val="single" w:sz="4" w:space="0" w:color="000000"/>
-            </w:tcBorders>
-            <w:vAlign w:val="bottom"/>
-          </w:tcPr>
-          <w:p>
-            <w:pPr>
-              <w:pStyle w:val="Normal"/>
-              <w:widowControl w:val="false"/>
-              <w:spacing w:lineRule="auto" w:line="180"/>
-              <w:jc w:val="center"/>
-              <w:rPr>
-                <w:sz w:val="16"/>
-                <w:szCs w:val="16"/>
-              </w:rPr>
-            </w:pPr>
-            <w:r>
-              <w:rPr>
-                <w:sz w:val="16"/>
-                <w:szCs w:val="16"/>
-              </w:rPr>
-              <w:t>Cab Light Off</w:t>
-            </w:r>
-          </w:p>
-        </w:tc>
-        <w:tc>
-          <w:tcPr>
-            <w:tcW w:w="1016" w:type="dxa"/>
-            <w:tcBorders>
-              <w:top w:val="single" w:sz="4" w:space="0" w:color="000000"/>
-              <w:left w:val="single" w:sz="4" w:space="0" w:color="000000"/>
-              <w:bottom w:val="single" w:sz="4" w:space="0" w:color="000000"/>
-            </w:tcBorders>
-            <w:vAlign w:val="bottom"/>
-          </w:tcPr>
-          <w:p>
-            <w:pPr>
-              <w:pStyle w:val="Normal"/>
-              <w:widowControl w:val="false"/>
-              <w:spacing w:lineRule="auto" w:line="180"/>
-              <w:jc w:val="center"/>
-              <w:rPr>
-                <w:sz w:val="16"/>
-                <w:szCs w:val="16"/>
-              </w:rPr>
-            </w:pPr>
-            <w:r>
-              <w:rPr>
-                <w:rFonts w:eastAsia="arial" w:ascii="arial" w:hAnsi="arial"/>
-                <w:color w:val="000000"/>
-                <w:sz w:val="16"/>
-                <w:szCs w:val="16"/>
-              </w:rPr>
-              <w:t>Desk Light Off</w:t>
             </w:r>
           </w:p>
         </w:tc>
@@ -11015,25 +11011,7 @@
           <w:sz w:val="16"/>
           <w:szCs w:val="16"/>
         </w:rPr>
-        <w:t xml:space="preserve">    </w:t>
-      </w:r>
-      <w:r>
-        <w:rPr>
-          <w:rFonts w:eastAsia="arial" w:ascii="arial" w:hAnsi="arial"/>
-          <w:color w:val="000000"/>
-          <w:sz w:val="16"/>
-          <w:szCs w:val="16"/>
-        </w:rPr>
-        <w:t>NS ICM3</w:t>
-      </w:r>
-      <w:r>
-        <w:rPr>
-          <w:rFonts w:eastAsia="arial" w:ascii="arial" w:hAnsi="arial"/>
-          <w:color w:val="000000"/>
-          <w:sz w:val="16"/>
-          <w:szCs w:val="16"/>
-        </w:rPr>
-        <w:t>-1</w:t>
+        <w:t xml:space="preserve">    NS ICM3-1</w:t>
       </w:r>
     </w:p>
     <w:tbl>
@@ -11260,25 +11238,7 @@
                 <w:sz w:val="16"/>
                 <w:szCs w:val="16"/>
               </w:rPr>
-              <w:t xml:space="preserve">Train </w:t>
-            </w:r>
-            <w:r>
-              <w:rPr>
-                <w:rFonts w:eastAsia="arial" w:ascii="arial" w:hAnsi="arial"/>
-                <w:color w:val="000000"/>
-                <w:sz w:val="16"/>
-                <w:szCs w:val="16"/>
-              </w:rPr>
-              <w:t>Supply</w:t>
-            </w:r>
-            <w:r>
-              <w:rPr>
-                <w:rFonts w:eastAsia="arial" w:ascii="arial" w:hAnsi="arial"/>
-                <w:color w:val="000000"/>
-                <w:sz w:val="16"/>
-                <w:szCs w:val="16"/>
-              </w:rPr>
-              <w:t xml:space="preserve"> On</w:t>
+              <w:t>Train Supply On</w:t>
             </w:r>
           </w:p>
         </w:tc>
@@ -11394,16 +11354,7 @@
                 <w:sz w:val="16"/>
                 <w:szCs w:val="16"/>
               </w:rPr>
-              <w:t xml:space="preserve">Gauge Light </w:t>
-            </w:r>
-            <w:r>
-              <w:rPr>
-                <w:rFonts w:eastAsia="arial" w:ascii="arial" w:hAnsi="arial"/>
-                <w:color w:val="000000"/>
-                <w:sz w:val="16"/>
-                <w:szCs w:val="16"/>
-              </w:rPr>
-              <w:t>On</w:t>
+              <w:t>Gauge Light On</w:t>
             </w:r>
           </w:p>
         </w:tc>
@@ -11632,25 +11583,7 @@
           <w:szCs w:val="16"/>
         </w:rPr>
         <w:tab/>
-        <w:t xml:space="preserve">           </w:t>
-      </w:r>
-      <w:r>
-        <w:rPr>
-          <w:rFonts w:eastAsia="arial" w:ascii="arial" w:hAnsi="arial"/>
-          <w:color w:val="000000"/>
-          <w:sz w:val="16"/>
-          <w:szCs w:val="16"/>
-        </w:rPr>
-        <w:t>NS ICM3</w:t>
-      </w:r>
-      <w:r>
-        <w:rPr>
-          <w:rFonts w:eastAsia="arial" w:ascii="arial" w:hAnsi="arial"/>
-          <w:color w:val="000000"/>
-          <w:sz w:val="16"/>
-          <w:szCs w:val="16"/>
-        </w:rPr>
-        <w:t>-2</w:t>
+        <w:t xml:space="preserve">           NS ICM3-2</w:t>
       </w:r>
     </w:p>
     <w:tbl>
@@ -11900,34 +11833,7 @@
                 <w:sz w:val="16"/>
                 <w:szCs w:val="16"/>
               </w:rPr>
-              <w:t xml:space="preserve">Train </w:t>
-            </w:r>
-            <w:r>
-              <w:rPr>
-                <w:rFonts w:eastAsia="arial" w:ascii="arial" w:hAnsi="arial"/>
-                <w:color w:val="000000"/>
-                <w:sz w:val="16"/>
-                <w:szCs w:val="16"/>
-              </w:rPr>
-              <w:t>Supply</w:t>
-            </w:r>
-            <w:r>
-              <w:rPr>
-                <w:rFonts w:eastAsia="arial" w:ascii="arial" w:hAnsi="arial"/>
-                <w:color w:val="000000"/>
-                <w:sz w:val="16"/>
-                <w:szCs w:val="16"/>
-              </w:rPr>
-              <w:t xml:space="preserve"> O</w:t>
-            </w:r>
-            <w:r>
-              <w:rPr>
-                <w:rFonts w:eastAsia="arial" w:ascii="arial" w:hAnsi="arial"/>
-                <w:color w:val="000000"/>
-                <w:sz w:val="16"/>
-                <w:szCs w:val="16"/>
-              </w:rPr>
-              <w:t>ff</w:t>
+              <w:t>Train Supply Off</w:t>
             </w:r>
           </w:p>
         </w:tc>
@@ -11958,7 +11864,7 @@
                 <w:sz w:val="16"/>
                 <w:szCs w:val="16"/>
               </w:rPr>
-              <w:t xml:space="preserve">Train </w:t>
+              <w:t>Train</w:t>
             </w:r>
           </w:p>
           <w:p>
@@ -12044,16 +11950,7 @@
                 <w:sz w:val="16"/>
                 <w:szCs w:val="16"/>
               </w:rPr>
-              <w:t xml:space="preserve">Gauge Light </w:t>
-            </w:r>
-            <w:r>
-              <w:rPr>
-                <w:rFonts w:eastAsia="arial" w:ascii="arial" w:hAnsi="arial"/>
-                <w:color w:val="000000"/>
-                <w:sz w:val="16"/>
-                <w:szCs w:val="16"/>
-              </w:rPr>
-              <w:t>Off</w:t>
+              <w:t>Gauge Light Off</w:t>
             </w:r>
           </w:p>
         </w:tc>
@@ -12307,25 +12204,7 @@
           <w:sz w:val="16"/>
           <w:szCs w:val="16"/>
         </w:rPr>
-        <w:t xml:space="preserve">    </w:t>
-      </w:r>
-      <w:r>
-        <w:rPr>
-          <w:rFonts w:eastAsia="arial" w:ascii="arial" w:hAnsi="arial"/>
-          <w:color w:val="000000"/>
-          <w:sz w:val="16"/>
-          <w:szCs w:val="16"/>
-        </w:rPr>
-        <w:t>NS SNG3</w:t>
-      </w:r>
-      <w:r>
-        <w:rPr>
-          <w:rFonts w:eastAsia="arial" w:ascii="arial" w:hAnsi="arial"/>
-          <w:color w:val="000000"/>
-          <w:sz w:val="16"/>
-          <w:szCs w:val="16"/>
-        </w:rPr>
-        <w:t>-1</w:t>
+        <w:t xml:space="preserve">    NS SNG3-1</w:t>
       </w:r>
     </w:p>
     <w:tbl>
@@ -12546,7 +12425,11 @@
               </w:rPr>
             </w:pPr>
             <w:r>
-              <w:rPr/>
+              <w:rPr>
+                <w:color w:val="000000"/>
+                <w:sz w:val="16"/>
+                <w:szCs w:val="16"/>
+              </w:rPr>
             </w:r>
           </w:p>
         </w:tc>
@@ -12662,16 +12545,7 @@
                 <w:sz w:val="16"/>
                 <w:szCs w:val="16"/>
               </w:rPr>
-              <w:t>R</w:t>
-            </w:r>
-            <w:r>
-              <w:rPr>
-                <w:rFonts w:eastAsia="arial" w:ascii="arial" w:hAnsi="arial"/>
-                <w:color w:val="000000"/>
-                <w:sz w:val="16"/>
-                <w:szCs w:val="16"/>
-              </w:rPr>
-              <w:t>eading Light</w:t>
+              <w:t>Reading Light</w:t>
             </w:r>
           </w:p>
         </w:tc>
@@ -12900,25 +12774,7 @@
           <w:szCs w:val="16"/>
         </w:rPr>
         <w:tab/>
-        <w:t xml:space="preserve">           </w:t>
-      </w:r>
-      <w:r>
-        <w:rPr>
-          <w:rFonts w:eastAsia="arial" w:ascii="arial" w:hAnsi="arial"/>
-          <w:color w:val="000000"/>
-          <w:sz w:val="16"/>
-          <w:szCs w:val="16"/>
-        </w:rPr>
-        <w:t>NS SNG3</w:t>
-      </w:r>
-      <w:r>
-        <w:rPr>
-          <w:rFonts w:eastAsia="arial" w:ascii="arial" w:hAnsi="arial"/>
-          <w:color w:val="000000"/>
-          <w:sz w:val="16"/>
-          <w:szCs w:val="16"/>
-        </w:rPr>
-        <w:t>-2</w:t>
+        <w:t xml:space="preserve">           NS SNG3-2</w:t>
       </w:r>
     </w:p>
     <w:tbl>
@@ -13162,7 +13018,11 @@
               </w:rPr>
             </w:pPr>
             <w:r>
-              <w:rPr/>
+              <w:rPr>
+                <w:color w:val="000000"/>
+                <w:sz w:val="16"/>
+                <w:szCs w:val="16"/>
+              </w:rPr>
             </w:r>
           </w:p>
         </w:tc>
@@ -13193,7 +13053,7 @@
                 <w:sz w:val="16"/>
                 <w:szCs w:val="16"/>
               </w:rPr>
-              <w:t xml:space="preserve">Train </w:t>
+              <w:t>Train</w:t>
             </w:r>
           </w:p>
           <w:p>
@@ -13272,7 +13132,11 @@
               </w:rPr>
             </w:pPr>
             <w:r>
-              <w:rPr/>
+              <w:rPr>
+                <w:color w:val="000000"/>
+                <w:sz w:val="16"/>
+                <w:szCs w:val="16"/>
+              </w:rPr>
             </w:r>
           </w:p>
         </w:tc>
@@ -13367,15 +13231,7 @@
                 <w:sz w:val="16"/>
                 <w:szCs w:val="16"/>
               </w:rPr>
-              <w:t>Parking Brake O</w:t>
-            </w:r>
-            <w:r>
-              <w:rPr>
-                <w:rFonts w:eastAsia="arial" w:ascii="arial" w:hAnsi="arial"/>
-                <w:sz w:val="16"/>
-                <w:szCs w:val="16"/>
-              </w:rPr>
-              <w:t>ff</w:t>
+              <w:t>Parking Brake Off</w:t>
             </w:r>
           </w:p>
         </w:tc>
@@ -14531,12 +14387,12 @@
       <w:rFonts w:ascii="Symbol" w:hAnsi="Symbol" w:cs="Symbol"/>
     </w:rPr>
   </w:style>
-  <w:style w:type="character" w:styleId="Style5" w:customStyle="1">
-    <w:name w:val="번호 매기기 기호"/>
+  <w:style w:type="character" w:styleId="user" w:customStyle="1">
+    <w:name w:val="번호 매기기 기호 (user)"/>
     <w:qFormat/>
     <w:rPr/>
   </w:style>
-  <w:style w:type="paragraph" w:styleId="Style6">
+  <w:style w:type="paragraph" w:styleId="Style5">
     <w:name w:val="제목"/>
     <w:basedOn w:val="Normal"/>
     <w:next w:val="BodyText"/>
@@ -14546,7 +14402,7 @@
       <w:spacing w:before="240" w:after="120"/>
     </w:pPr>
     <w:rPr>
-      <w:rFonts w:ascii="Liberation Sans" w:hAnsi="Liberation Sans" w:eastAsia="나눔고딕" w:cs="Arial"/>
+      <w:rFonts w:ascii="Liberation Sans" w:hAnsi="Liberation Sans" w:eastAsia="Noto Sans CJK KR" w:cs="Lohit Devanagari"/>
       <w:sz w:val="28"/>
       <w:szCs w:val="28"/>
     </w:rPr>
@@ -14583,7 +14439,7 @@
       <w:szCs w:val="24"/>
     </w:rPr>
   </w:style>
-  <w:style w:type="paragraph" w:styleId="Style7">
+  <w:style w:type="paragraph" w:styleId="Style6" w:customStyle="1">
     <w:name w:val="색인"/>
     <w:basedOn w:val="Normal"/>
     <w:qFormat/>
@@ -14591,11 +14447,10 @@
       <w:suppressLineNumbers/>
     </w:pPr>
     <w:rPr>
-      <w:rFonts w:cs="Arial"/>
-      <w:sz w:val="24"/>
+      <w:rFonts w:cs="Lohit Devanagari"/>
     </w:rPr>
   </w:style>
-  <w:style w:type="paragraph" w:styleId="user">
+  <w:style w:type="paragraph" w:styleId="user1">
     <w:name w:val="제목 (user)"/>
     <w:basedOn w:val="Normal"/>
     <w:next w:val="BodyText"/>
@@ -14605,12 +14460,12 @@
       <w:spacing w:before="240" w:after="120"/>
     </w:pPr>
     <w:rPr>
-      <w:rFonts w:ascii="Liberation Sans" w:hAnsi="Liberation Sans" w:eastAsia="Noto Sans CJK KR" w:cs="Lohit Devanagari"/>
+      <w:rFonts w:ascii="Liberation Sans" w:hAnsi="Liberation Sans" w:eastAsia="나눔고딕" w:cs="Arial"/>
       <w:sz w:val="28"/>
       <w:szCs w:val="28"/>
     </w:rPr>
   </w:style>
-  <w:style w:type="paragraph" w:styleId="user1" w:customStyle="1">
+  <w:style w:type="paragraph" w:styleId="user2">
     <w:name w:val="색인 (user)"/>
     <w:basedOn w:val="Normal"/>
     <w:qFormat/>
@@ -14618,7 +14473,8 @@
       <w:suppressLineNumbers/>
     </w:pPr>
     <w:rPr>
-      <w:rFonts w:cs="Lohit Devanagari"/>
+      <w:rFonts w:cs="Arial"/>
+      <w:sz w:val="24"/>
     </w:rPr>
   </w:style>
   <w:style w:type="paragraph" w:styleId="Title">
@@ -15300,8 +15156,8 @@
       <w:szCs w:val="24"/>
     </w:rPr>
   </w:style>
-  <w:style w:type="paragraph" w:styleId="user2" w:customStyle="1">
-    <w:name w:val="표 내용 (user)"/>
+  <w:style w:type="paragraph" w:styleId="Style7" w:customStyle="1">
+    <w:name w:val="표 내용"/>
     <w:basedOn w:val="Normal"/>
     <w:qFormat/>
     <w:pPr>
@@ -15309,9 +15165,9 @@
     </w:pPr>
     <w:rPr/>
   </w:style>
-  <w:style w:type="paragraph" w:styleId="user3" w:customStyle="1">
-    <w:name w:val="표제목 (user)"/>
-    <w:basedOn w:val="user2"/>
+  <w:style w:type="paragraph" w:styleId="Style8" w:customStyle="1">
+    <w:name w:val="표제목"/>
+    <w:basedOn w:val="Style7"/>
     <w:qFormat/>
     <w:pPr>
       <w:jc w:val="center"/>
@@ -15321,8 +15177,8 @@
       <w:bCs/>
     </w:rPr>
   </w:style>
-  <w:style w:type="paragraph" w:styleId="Style8">
-    <w:name w:val="표 내용"/>
+  <w:style w:type="paragraph" w:styleId="user3">
+    <w:name w:val="표 내용 (user)"/>
     <w:basedOn w:val="Normal"/>
     <w:qFormat/>
     <w:pPr>
@@ -15331,9 +15187,9 @@
     </w:pPr>
     <w:rPr/>
   </w:style>
-  <w:style w:type="paragraph" w:styleId="Style9">
-    <w:name w:val="표제목"/>
-    <w:basedOn w:val="Style8"/>
+  <w:style w:type="paragraph" w:styleId="user4">
+    <w:name w:val="표제목 (user)"/>
+    <w:basedOn w:val="user3"/>
     <w:qFormat/>
     <w:pPr>
       <w:suppressLineNumbers/>

</xml_diff>